<commit_message>
Update links to Find a private mediator on the Professional Mediators of Alaska website docx AKA2JBranding Issue #16 A2JatAKCourts/docassemble-AKA2JBrandingIssues#66
</commit_message>
<xml_diff>
--- a/docassemble/ChangingChildCustody/data/templates/changing_child_custody_action_plan.docx
+++ b/docassemble/ChangingChildCustody/data/templates/changing_child_custody_action_plan.docx
@@ -560,6 +560,24 @@
         <w:pStyle w:val="Body"/>
       </w:pPr>
     </w:p>
+    <w:p/>
+    <w:p/>
+    <w:p/>
+    <w:p/>
+    <w:p/>
+    <w:p/>
+    <w:p/>
+    <w:p/>
+    <w:p/>
+    <w:p/>
+    <w:p/>
+    <w:p/>
+    <w:p/>
+    <w:p/>
+    <w:p/>
+    <w:p/>
+    <w:p/>
+    <w:p/>
     <w:tbl>
       <w:tblPr>
         <w:tblStyle w:val="TableGrid"/>
@@ -598,31 +616,7 @@
               <w:pStyle w:val="Body"/>
             </w:pPr>
             <w:r>
-              <w:t xml:space="preserve">{%tr if </w:t>
-            </w:r>
-            <w:proofErr w:type="spellStart"/>
-            <w:r>
-              <w:t>parents_agree</w:t>
-            </w:r>
-            <w:proofErr w:type="spellEnd"/>
-            <w:r>
-              <w:t xml:space="preserve"> or final_order_date_within_15_days or (</w:t>
-            </w:r>
-            <w:proofErr w:type="spellStart"/>
-            <w:r>
-              <w:t>unknown_final_date.true_values</w:t>
-            </w:r>
-            <w:proofErr w:type="spellEnd"/>
-            <w:r>
-              <w:t>())|</w:t>
-            </w:r>
-            <w:proofErr w:type="spellStart"/>
-            <w:r>
-              <w:t>list|length</w:t>
-            </w:r>
-            <w:proofErr w:type="spellEnd"/>
-            <w:r>
-              <w:t xml:space="preserve"> &gt; 1 %}</w:t>
+              <w:t>{%tr if parents_agree or final_order_date_within_15_days or (unknown_final_date.true_values())|list|length &gt; 1 %}</w:t>
             </w:r>
           </w:p>
         </w:tc>
@@ -643,13 +637,8 @@
             <w:pPr>
               <w:pStyle w:val="Body"/>
             </w:pPr>
-            <w:proofErr w:type="spellStart"/>
-            <w:r>
-              <w:t>pick_a_step_step</w:t>
-            </w:r>
-            <w:proofErr w:type="spellEnd"/>
-            <w:r>
-              <w:t xml:space="preserve"> in aka2j_templates.yml</w:t>
+            <w:r>
+              <w:t>pick_a_step_step in aka2j_templates.yml</w:t>
             </w:r>
           </w:p>
         </w:tc>
@@ -676,17 +665,23 @@
             <w:r>
               <w:t xml:space="preserve">Step </w:t>
             </w:r>
-            <w:fldSimple w:instr=" SEQ stepList \* ARABIC ">
-              <w:r>
-                <w:t>1</w:t>
-              </w:r>
-            </w:fldSimple>
-            <w:r>
-              <w:t xml:space="preserve">: Decide the steps you </w:t>
-            </w:r>
-            <w:r>
-              <w:lastRenderedPageBreak/>
-              <w:t>want to take</w:t>
+            <w:r>
+              <w:fldChar w:fldCharType="begin"/>
+            </w:r>
+            <w:r>
+              <w:instrText xml:space="preserve"> SEQ stepList \* ARABIC </w:instrText>
+            </w:r>
+            <w:r>
+              <w:fldChar w:fldCharType="separate"/>
+            </w:r>
+            <w:r>
+              <w:t>1</w:t>
+            </w:r>
+            <w:r>
+              <w:fldChar w:fldCharType="end"/>
+            </w:r>
+            <w:r>
+              <w:t>: Decide the steps you want to take</w:t>
             </w:r>
           </w:p>
         </w:tc>
@@ -714,7 +709,6 @@
               <w:rPr>
                 <w:color w:val="FF0000"/>
               </w:rPr>
-              <w:lastRenderedPageBreak/>
               <w:t>{% if user_need == 'change custody order' %}</w:t>
             </w:r>
             <w:r>
@@ -724,14 +718,7 @@
               <w:rPr>
                 <w:color w:val="FF0000"/>
               </w:rPr>
-              <w:t xml:space="preserve">.{% elif user_need == 'change divorce order' and middle_of_case </w:t>
-            </w:r>
-            <w:r>
-              <w:rPr>
-                <w:color w:val="FF0000"/>
-              </w:rPr>
-              <w:lastRenderedPageBreak/>
-              <w:t>== 'yes' %}</w:t>
+              <w:t>.{% elif user_need == 'change divorce order' and middle_of_case == 'yes' %}</w:t>
             </w:r>
             <w:r>
               <w:t>You have more than one way to ask the judge to change an order in your divorce case</w:t>
@@ -789,7 +776,6 @@
               <w:pStyle w:val="Body"/>
             </w:pPr>
             <w:r>
-              <w:lastRenderedPageBreak/>
               <w:t>{%tr endif %}</w:t>
             </w:r>
           </w:p>
@@ -833,15 +819,8 @@
               <w:pStyle w:val="Body"/>
             </w:pPr>
             <w:r>
-              <w:t xml:space="preserve">{%tr if </w:t>
-            </w:r>
-            <w:proofErr w:type="spellStart"/>
-            <w:r>
-              <w:t>parents_agree</w:t>
-            </w:r>
-            <w:proofErr w:type="spellEnd"/>
-            <w:r>
-              <w:t xml:space="preserve"> %}</w:t>
+              <w:lastRenderedPageBreak/>
+              <w:t>{%tr if parents_agree %}</w:t>
             </w:r>
           </w:p>
         </w:tc>
@@ -862,21 +841,8 @@
             <w:pPr>
               <w:pStyle w:val="Body"/>
             </w:pPr>
-            <w:proofErr w:type="spellStart"/>
-            <w:r>
-              <w:t>parents_agree_step</w:t>
-            </w:r>
-            <w:proofErr w:type="spellEnd"/>
-            <w:r>
-              <w:t xml:space="preserve">  and </w:t>
-            </w:r>
-            <w:proofErr w:type="spellStart"/>
-            <w:r>
-              <w:t>tell_the_court_step</w:t>
-            </w:r>
-            <w:proofErr w:type="spellEnd"/>
-            <w:r>
-              <w:t xml:space="preserve"> in aka2j_templates.yml</w:t>
+            <w:r>
+              <w:t>parents_agree_step  and tell_the_court_step in aka2j_templates.yml</w:t>
             </w:r>
           </w:p>
         </w:tc>
@@ -956,15 +922,7 @@
               <w:pStyle w:val="Body"/>
             </w:pPr>
             <w:r>
-              <w:t xml:space="preserve">If you want to change an order in your {{ </w:t>
-            </w:r>
-            <w:proofErr w:type="spellStart"/>
-            <w:r>
-              <w:t>case_type</w:t>
-            </w:r>
-            <w:proofErr w:type="spellEnd"/>
-            <w:r>
-              <w:t xml:space="preserve"> }} case, you can talk with {{ other_party_in_case }}. See if you agree about the change or if you both want to try to reach an agreement in one of these ways:</w:t>
+              <w:t>If you want to change an order in your {{ case_type }} case, you can talk with {{ other_party_in_case }}. See if you agree about the change or if you both want to try to reach an agreement in one of these ways:</w:t>
             </w:r>
           </w:p>
           <w:p>
@@ -1086,7 +1044,6 @@
               <w:pStyle w:val="Body"/>
             </w:pPr>
             <w:r>
-              <w:lastRenderedPageBreak/>
               <w:t>Alaska courts offer mediation in cases in which parents need to create a parenting plan. The mediator helps parents resolve disputes about access and visitation concerns and create workable co-parenting plans. There is no fee for this service unless parents wish to mediate additional issues or require more time than allowed by program.</w:t>
             </w:r>
           </w:p>
@@ -1125,7 +1082,11 @@
               <w:pStyle w:val="Body"/>
             </w:pPr>
             <w:r>
-              <w:t>You can hire your own private mediator to help resolve any issue in your case. If there was abuse or domestic violence in your relationship, be sure to hire someone with training and experience working with domestic violence. Tell your mediator if you want to bring a support person with you.</w:t>
+              <w:t xml:space="preserve">You can hire your own private mediator to help resolve any issue in your case. If there was abuse or domestic violence in your relationship, be sure to hire someone with training and experience working with domestic violence. Tell your mediator if you want to bring </w:t>
+            </w:r>
+            <w:r>
+              <w:lastRenderedPageBreak/>
+              <w:t>a support person with you.</w:t>
             </w:r>
           </w:p>
           <w:p>
@@ -1284,11 +1245,7 @@
               <w:ind w:left="405"/>
             </w:pPr>
             <w:r>
-              <w:t xml:space="preserve">If you want to change child support because the parenting schedule or a parent’s income changes, you must tell the court in writing so the judge can decide if the child support amount should change. The parent who owes money under the child support </w:t>
-            </w:r>
-            <w:r>
-              <w:lastRenderedPageBreak/>
-              <w:t>order you want to change continues to owe that amount until the judge signs a new order.</w:t>
+              <w:t>If you want to change child support because the parenting schedule or a parent’s income changes, you must tell the court in writing so the judge can decide if the child support amount should change. The parent who owes money under the child support order you want to change continues to owe that amount until the judge signs a new order.</w:t>
             </w:r>
           </w:p>
           <w:p>
@@ -1339,6 +1296,7 @@
               <w:outlineLvl w:val="2"/>
             </w:pPr>
             <w:r>
+              <w:lastRenderedPageBreak/>
               <w:t>Links in this step</w:t>
             </w:r>
           </w:p>
@@ -1423,7 +1381,12 @@
                 <w:rFonts w:eastAsia="Calibri"/>
               </w:rPr>
               <w:br/>
-              <w:t>alaskamediators.org/directory</w:t>
+            </w:r>
+            <w:r>
+              <w:rPr>
+                <w:rFonts w:eastAsia="Calibri"/>
+              </w:rPr>
+              <w:t>pmoa.wildapricot.org/directory</w:t>
             </w:r>
           </w:p>
           <w:p>
@@ -1659,7 +1622,6 @@
               <w:pStyle w:val="Body"/>
             </w:pPr>
             <w:r>
-              <w:lastRenderedPageBreak/>
               <w:t xml:space="preserve">Choose 1 parenting plan order. Do </w:t>
             </w:r>
             <w:r>
@@ -1785,6 +1747,7 @@
               <w:outlineLvl w:val="2"/>
             </w:pPr>
             <w:r>
+              <w:lastRenderedPageBreak/>
               <w:t>If you are changing child support</w:t>
             </w:r>
           </w:p>
@@ -2125,39 +2088,24 @@
             <w:pPr>
               <w:pStyle w:val="Body"/>
             </w:pPr>
-            <w:proofErr w:type="spellStart"/>
-            <w:r>
-              <w:t>foreign_order_step</w:t>
-            </w:r>
-            <w:proofErr w:type="spellEnd"/>
-            <w:r>
-              <w:t xml:space="preserve"> in aka2j_mod_cust_div_templates.yml</w:t>
-            </w:r>
-          </w:p>
-          <w:p>
-            <w:pPr>
-              <w:pStyle w:val="Body"/>
-            </w:pPr>
-            <w:proofErr w:type="spellStart"/>
-            <w:r>
-              <w:t>ak_jurisdiction_step</w:t>
-            </w:r>
-            <w:proofErr w:type="spellEnd"/>
-            <w:r>
-              <w:t xml:space="preserve"> in aka2j_templates.yml</w:t>
-            </w:r>
-          </w:p>
-          <w:p>
-            <w:pPr>
-              <w:pStyle w:val="Body"/>
-            </w:pPr>
-            <w:proofErr w:type="spellStart"/>
-            <w:r>
-              <w:t>register_order_step</w:t>
-            </w:r>
-            <w:proofErr w:type="spellEnd"/>
-            <w:r>
-              <w:t xml:space="preserve"> in aka2j_mod_cust_div_templates.yml</w:t>
+            <w:r>
+              <w:t>foreign_order_step in aka2j_mod_cust_div_templates.yml</w:t>
+            </w:r>
+          </w:p>
+          <w:p>
+            <w:pPr>
+              <w:pStyle w:val="Body"/>
+            </w:pPr>
+            <w:r>
+              <w:t>ak_jurisdiction_step in aka2j_templates.yml</w:t>
+            </w:r>
+          </w:p>
+          <w:p>
+            <w:pPr>
+              <w:pStyle w:val="Body"/>
+            </w:pPr>
+            <w:r>
+              <w:t>register_order_step in aka2j_mod_cust_div_templates.yml</w:t>
             </w:r>
           </w:p>
         </w:tc>
@@ -2215,7 +2163,11 @@
               <w:fldChar w:fldCharType="end"/>
             </w:r>
             <w:r>
-              <w:t>: Ask the court to change your custody and Parenting Plan or child support order from another state</w:t>
+              <w:t xml:space="preserve">: Ask the court to change </w:t>
+            </w:r>
+            <w:r>
+              <w:lastRenderedPageBreak/>
+              <w:t>your custody and Parenting Plan or child support order from another state</w:t>
             </w:r>
           </w:p>
         </w:tc>
@@ -2237,7 +2189,12 @@
               <w:pStyle w:val="Body"/>
             </w:pPr>
             <w:r>
-              <w:t>If do not have to change your parenting plan or custody order and you only need to change your child support order, contact the Alaska Child Support Enforcement Division. They may be able to help you change your order without going to court.</w:t>
+              <w:lastRenderedPageBreak/>
+              <w:t xml:space="preserve">If do not have to change your parenting plan or custody order and you only need to change your child support order, contact the Alaska Child Support Enforcement Division. They may be able to help you change </w:t>
+            </w:r>
+            <w:r>
+              <w:lastRenderedPageBreak/>
+              <w:t>your order without going to court.</w:t>
             </w:r>
           </w:p>
           <w:p>
@@ -2445,6 +2402,7 @@
               <w:rPr>
                 <w:shd w:val="clear" w:color="auto" w:fill="FFFFFF"/>
               </w:rPr>
+              <w:lastRenderedPageBreak/>
               <w:t xml:space="preserve">Step </w:t>
             </w:r>
             <w:bookmarkStart w:id="0" w:name="AKjurisdiction"/>
@@ -2542,11 +2500,7 @@
               <w:ind w:left="508"/>
             </w:pPr>
             <w:r>
-              <w:t xml:space="preserve">Jurisdiction can be very complicated. For example, if a baby is less than 6 months old and has moved between states, there </w:t>
-            </w:r>
-            <w:r>
-              <w:lastRenderedPageBreak/>
-              <w:t xml:space="preserve">may not be a “home state.” This is one example of an exception when the Alaska court may be able to decide issues about a child that hasn’t lived here for 6 months. </w:t>
+              <w:t xml:space="preserve">Jurisdiction can be very complicated. For example, if a baby is less than 6 months old and has moved between states, there may not be a “home state.” This is one example of an exception when the Alaska court may be able to decide issues about a child that hasn’t lived here for 6 months. </w:t>
             </w:r>
             <w:hyperlink r:id="rId30">
               <w:r>
@@ -2614,46 +2568,52 @@
               <w:rPr>
                 <w:shd w:val="clear" w:color="auto" w:fill="FFFFFF"/>
               </w:rPr>
+              <w:t xml:space="preserve">Step </w:t>
+            </w:r>
+            <w:bookmarkStart w:id="1" w:name="Register"/>
+            <w:r>
+              <w:rPr>
+                <w:shd w:val="clear" w:color="auto" w:fill="FFFFFF"/>
+              </w:rPr>
+              <w:fldChar w:fldCharType="begin"/>
+            </w:r>
+            <w:r>
+              <w:rPr>
+                <w:shd w:val="clear" w:color="auto" w:fill="FFFFFF"/>
+              </w:rPr>
+              <w:instrText xml:space="preserve"> SEQ stepList \* ARABIC </w:instrText>
+            </w:r>
+            <w:r>
+              <w:rPr>
+                <w:shd w:val="clear" w:color="auto" w:fill="FFFFFF"/>
+              </w:rPr>
+              <w:fldChar w:fldCharType="separate"/>
+            </w:r>
+            <w:r>
+              <w:rPr>
+                <w:shd w:val="clear" w:color="auto" w:fill="FFFFFF"/>
+              </w:rPr>
+              <w:t>6</w:t>
+            </w:r>
+            <w:r>
+              <w:rPr>
+                <w:shd w:val="clear" w:color="auto" w:fill="FFFFFF"/>
+              </w:rPr>
+              <w:fldChar w:fldCharType="end"/>
+            </w:r>
+            <w:bookmarkEnd w:id="1"/>
+            <w:r>
+              <w:rPr>
+                <w:shd w:val="clear" w:color="auto" w:fill="FFFFFF"/>
+              </w:rPr>
+              <w:t xml:space="preserve">: Register </w:t>
+            </w:r>
+            <w:r>
+              <w:rPr>
+                <w:shd w:val="clear" w:color="auto" w:fill="FFFFFF"/>
+              </w:rPr>
               <w:lastRenderedPageBreak/>
-              <w:t xml:space="preserve">Step </w:t>
-            </w:r>
-            <w:bookmarkStart w:id="1" w:name="Register"/>
-            <w:r>
-              <w:rPr>
-                <w:shd w:val="clear" w:color="auto" w:fill="FFFFFF"/>
-              </w:rPr>
-              <w:fldChar w:fldCharType="begin"/>
-            </w:r>
-            <w:r>
-              <w:rPr>
-                <w:shd w:val="clear" w:color="auto" w:fill="FFFFFF"/>
-              </w:rPr>
-              <w:instrText xml:space="preserve"> SEQ stepList \* ARABIC </w:instrText>
-            </w:r>
-            <w:r>
-              <w:rPr>
-                <w:shd w:val="clear" w:color="auto" w:fill="FFFFFF"/>
-              </w:rPr>
-              <w:fldChar w:fldCharType="separate"/>
-            </w:r>
-            <w:r>
-              <w:rPr>
-                <w:shd w:val="clear" w:color="auto" w:fill="FFFFFF"/>
-              </w:rPr>
-              <w:t>6</w:t>
-            </w:r>
-            <w:r>
-              <w:rPr>
-                <w:shd w:val="clear" w:color="auto" w:fill="FFFFFF"/>
-              </w:rPr>
-              <w:fldChar w:fldCharType="end"/>
-            </w:r>
-            <w:bookmarkEnd w:id="1"/>
-            <w:r>
-              <w:rPr>
-                <w:shd w:val="clear" w:color="auto" w:fill="FFFFFF"/>
-              </w:rPr>
-              <w:t>: Register the out-of-state order</w:t>
+              <w:t>the out-of-state order</w:t>
             </w:r>
           </w:p>
         </w:tc>
@@ -2677,6 +2637,7 @@
               <w:outlineLvl w:val="2"/>
             </w:pPr>
             <w:r>
+              <w:lastRenderedPageBreak/>
               <w:t>Submit the following packet to the Alaska court</w:t>
             </w:r>
           </w:p>
@@ -2691,6 +2652,7 @@
               <w:ind w:left="516"/>
             </w:pPr>
             <w:r>
+              <w:lastRenderedPageBreak/>
               <w:t xml:space="preserve">1 </w:t>
             </w:r>
             <w:r>
@@ -3042,11 +3004,7 @@
             </w:r>
             <w:r>
               <w:br/>
-              <w:t xml:space="preserve">(Only fill in the Petitioner's and Respondent's names in the </w:t>
-            </w:r>
-            <w:r>
-              <w:lastRenderedPageBreak/>
-              <w:t>caption at the top left and leave the rest blank)</w:t>
+              <w:t>(Only fill in the Petitioner's and Respondent's names in the caption at the top left and leave the rest blank)</w:t>
             </w:r>
           </w:p>
           <w:p>
@@ -3176,6 +3134,7 @@
               <w:br/>
             </w:r>
             <w:r>
+              <w:lastRenderedPageBreak/>
               <w:t>public.courts.alaska.gov/web/forms/docs/dr-343.pdf</w:t>
             </w:r>
           </w:p>
@@ -3454,11 +3413,7 @@
               <w:ind w:left="1320"/>
             </w:pPr>
             <w:r>
-              <w:t xml:space="preserve">Figure out how much it will cost to mail the forms by this </w:t>
-            </w:r>
-            <w:r>
-              <w:lastRenderedPageBreak/>
-              <w:t xml:space="preserve">method, and </w:t>
+              <w:t xml:space="preserve">Figure out how much it will cost to mail the forms by this method, and </w:t>
             </w:r>
           </w:p>
           <w:p>
@@ -3566,7 +3521,11 @@
               <w:ind w:left="1320"/>
             </w:pPr>
             <w:r>
-              <w:t>the filled-out mailing forms for certified mail, restricted delivery, return receipt requested from the Post Office for each of the people listed in the certificate of distribution on the Notice of Registration Order.</w:t>
+              <w:t xml:space="preserve">the filled-out mailing forms for certified mail, restricted delivery, return receipt requested from the Post Office for each of the people listed in the certificate of distribution </w:t>
+            </w:r>
+            <w:r>
+              <w:lastRenderedPageBreak/>
+              <w:t>on the Notice of Registration Order.</w:t>
             </w:r>
             <w:r>
               <w:br/>
@@ -3818,133 +3777,117 @@
                 <w:color w:val="FFC000"/>
                 <w:shd w:val="clear" w:color="auto" w:fill="FFFFFF"/>
               </w:rPr>
-              <w:t xml:space="preserve">user_need == </w:t>
+              <w:t>user_need == '</w:t>
             </w:r>
             <w:r>
               <w:rPr>
                 <w:color w:val="FFC000"/>
+              </w:rPr>
+              <w:t xml:space="preserve">change custody order' </w:t>
+            </w:r>
+            <w:r>
+              <w:rPr>
+                <w:color w:val="92D050"/>
+              </w:rPr>
+              <w:t>and</w:t>
+            </w:r>
+            <w:r>
+              <w:rPr>
+                <w:color w:val="FFC000"/>
+              </w:rPr>
+              <w:t xml:space="preserve"> </w:t>
+            </w:r>
+            <w:r>
+              <w:rPr>
+                <w:color w:val="92D050"/>
+              </w:rPr>
+              <w:t xml:space="preserve">(why_change in('review', 'schedule') </w:t>
+            </w:r>
+            <w:r>
+              <w:rPr>
+                <w:color w:val="00B050"/>
+              </w:rPr>
+              <w:t>or</w:t>
+            </w:r>
+            <w:r>
+              <w:rPr>
+                <w:color w:val="92D050"/>
+              </w:rPr>
+              <w:t xml:space="preserve"> </w:t>
+            </w:r>
+            <w:r>
+              <w:rPr>
+                <w:color w:val="00B050"/>
+              </w:rPr>
+              <w:t>(</w:t>
+            </w:r>
+            <w:r>
+              <w:t>middle_of_case == 'yes' and type_of_interim_order == 'motion' and not interim_order_date_within_10_days</w:t>
+            </w:r>
+            <w:r>
+              <w:rPr>
+                <w:color w:val="00B050"/>
+              </w:rPr>
+              <w:t>)</w:t>
+            </w:r>
+            <w:r>
+              <w:rPr>
+                <w:color w:val="92D050"/>
+              </w:rPr>
+              <w:t>)</w:t>
+            </w:r>
+            <w:r>
+              <w:rPr>
+                <w:color w:val="FF0000"/>
+              </w:rPr>
+              <w:t>) or (</w:t>
+            </w:r>
+            <w:r>
+              <w:rPr>
+                <w:color w:val="FFC000"/>
+                <w:shd w:val="clear" w:color="auto" w:fill="FFFFFF"/>
+              </w:rPr>
+              <w:t>user_need == '</w:t>
+            </w:r>
+            <w:r>
+              <w:rPr>
+                <w:color w:val="FFC000"/>
+              </w:rPr>
+              <w:t xml:space="preserve">change divorce order' and </w:t>
+            </w:r>
+            <w:r>
+              <w:rPr>
+                <w:color w:val="FFC000"/>
+                <w:shd w:val="clear" w:color="auto" w:fill="FFFFFF"/>
+              </w:rPr>
+              <w:t>type_of_final_order['cust</w:t>
+            </w:r>
+            <w:r>
+              <w:rPr>
+                <w:color w:val="FFC000"/>
                 <w:shd w:val="clear" w:color="auto" w:fill="FFFFFF"/>
               </w:rPr>
               <w:lastRenderedPageBreak/>
-              <w:t>'</w:t>
+              <w:t>ody order'] and</w:t>
             </w:r>
             <w:r>
               <w:rPr>
                 <w:color w:val="FFC000"/>
               </w:rPr>
-              <w:t xml:space="preserve">change custody order' </w:t>
-            </w:r>
-            <w:r>
-              <w:rPr>
-                <w:color w:val="92D050"/>
-              </w:rPr>
-              <w:t>and</w:t>
+              <w:t xml:space="preserve"> why_change in('review', 'schedule')</w:t>
+            </w:r>
+            <w:r>
+              <w:rPr>
+                <w:color w:val="FF0000"/>
+              </w:rPr>
+              <w:t>) or (</w:t>
             </w:r>
             <w:r>
               <w:rPr>
                 <w:color w:val="FFC000"/>
-              </w:rPr>
-              <w:t xml:space="preserve"> </w:t>
-            </w:r>
-            <w:r>
-              <w:rPr>
-                <w:color w:val="92D050"/>
-              </w:rPr>
-              <w:t xml:space="preserve">(why_change in('review', 'schedule') </w:t>
-            </w:r>
-            <w:r>
-              <w:rPr>
-                <w:color w:val="00B050"/>
-              </w:rPr>
-              <w:t>or</w:t>
-            </w:r>
-            <w:r>
-              <w:rPr>
-                <w:color w:val="92D050"/>
-              </w:rPr>
-              <w:t xml:space="preserve"> </w:t>
-            </w:r>
-            <w:r>
-              <w:rPr>
-                <w:color w:val="00B050"/>
-              </w:rPr>
-              <w:t>(</w:t>
-            </w:r>
-            <w:r>
-              <w:t>middle_of_case == 'yes' and type_of_interim_order == 'motion' and not interim_order_date_within_10_days</w:t>
-            </w:r>
-            <w:r>
-              <w:rPr>
-                <w:color w:val="00B050"/>
-              </w:rPr>
-              <w:t>)</w:t>
-            </w:r>
-            <w:r>
-              <w:rPr>
-                <w:color w:val="92D050"/>
-              </w:rPr>
-              <w:t>)</w:t>
-            </w:r>
-            <w:r>
-              <w:rPr>
-                <w:color w:val="FF0000"/>
-              </w:rPr>
-              <w:t>) or (</w:t>
-            </w:r>
-            <w:r>
-              <w:rPr>
-                <w:color w:val="FFC000"/>
-                <w:shd w:val="clear" w:color="auto" w:fill="FFFFFF"/>
-              </w:rPr>
-              <w:t>user_need == '</w:t>
-            </w:r>
-            <w:r>
-              <w:rPr>
-                <w:color w:val="FFC000"/>
-              </w:rPr>
-              <w:t xml:space="preserve">change divorce order' and </w:t>
-            </w:r>
-            <w:r>
-              <w:rPr>
-                <w:color w:val="FFC000"/>
-                <w:shd w:val="clear" w:color="auto" w:fill="FFFFFF"/>
-              </w:rPr>
-              <w:t>type_of_final_order['custody order'] and</w:t>
-            </w:r>
-            <w:r>
-              <w:rPr>
-                <w:color w:val="FFC000"/>
-              </w:rPr>
-              <w:t xml:space="preserve"> why_change in('review', 'schedule')</w:t>
-            </w:r>
-            <w:r>
-              <w:rPr>
-                <w:color w:val="FF0000"/>
-              </w:rPr>
-              <w:t>) or (</w:t>
-            </w:r>
-            <w:r>
-              <w:rPr>
-                <w:color w:val="FFC000"/>
-                <w:shd w:val="clear" w:color="auto" w:fill="FFFFFF"/>
-              </w:rPr>
-              <w:t xml:space="preserve">user_need in('respond to motion in custody', 'respond to motion in divorce') and type_of_response == 'modify' and </w:t>
-            </w:r>
-            <w:proofErr w:type="spellStart"/>
-            <w:r>
-              <w:rPr>
-                <w:color w:val="FFC000"/>
-                <w:shd w:val="clear" w:color="auto" w:fill="FFFFFF"/>
-              </w:rPr>
-              <w:t>type_of_modification.any_true</w:t>
-            </w:r>
-            <w:proofErr w:type="spellEnd"/>
-            <w:r>
-              <w:rPr>
-                <w:color w:val="FFC000"/>
-                <w:shd w:val="clear" w:color="auto" w:fill="FFFFFF"/>
-              </w:rPr>
-              <w:t>('custody', 'child support')</w:t>
+                <w:shd w:val="clear" w:color="auto" w:fill="FFFFFF"/>
+              </w:rPr>
+              <w:t>user_need in('respond to motion in custody', 'respond to motion in divorce') and type_of_response == 'modify' and type_of_modification.any_true('custody', 'child support')</w:t>
             </w:r>
             <w:r>
               <w:rPr>
@@ -3985,14 +3928,9 @@
             <w:pPr>
               <w:pStyle w:val="Body"/>
             </w:pPr>
-            <w:proofErr w:type="spellStart"/>
             <w:r>
               <w:lastRenderedPageBreak/>
-              <w:t>modify_step</w:t>
-            </w:r>
-            <w:proofErr w:type="spellEnd"/>
-            <w:r>
-              <w:t xml:space="preserve"> in aka2j_mod_cust_div_templates.yml</w:t>
+              <w:t>modify_step in aka2j_mod_cust_div_templates.yml</w:t>
             </w:r>
           </w:p>
           <w:p>
@@ -4095,107 +4033,58 @@
               <w:rPr>
                 <w:color w:val="C00000"/>
               </w:rPr>
-              <w:t xml:space="preserve">% elif </w:t>
+              <w:t>% elif user_need == 'change divorce order' %}</w:t>
+            </w:r>
+            <w:r>
+              <w:rPr>
+                <w:shd w:val="clear" w:color="auto" w:fill="FFFFFF"/>
+              </w:rPr>
+              <w:t>a Motion to Modify your Parenting Plan</w:t>
             </w:r>
             <w:r>
               <w:rPr>
                 <w:color w:val="C00000"/>
+                <w:shd w:val="clear" w:color="auto" w:fill="FFFFFF"/>
+              </w:rPr>
+              <w:t>{</w:t>
+            </w:r>
+            <w:r>
+              <w:rPr>
+                <w:color w:val="C00000"/>
+              </w:rPr>
+              <w:t xml:space="preserve">% elif user_need in('respond to </w:t>
+            </w:r>
+            <w:r>
+              <w:rPr>
+                <w:color w:val="C00000"/>
               </w:rPr>
               <w:lastRenderedPageBreak/>
-              <w:t>user_need == 'change divorce order' %}</w:t>
-            </w:r>
-            <w:r>
-              <w:rPr>
-                <w:shd w:val="clear" w:color="auto" w:fill="FFFFFF"/>
-              </w:rPr>
-              <w:t>a Motion to Modify your Parenting Plan</w:t>
-            </w:r>
-            <w:r>
-              <w:rPr>
-                <w:color w:val="C00000"/>
+              <w:t>motion in custody', 'respond to motion in divorce') %}</w:t>
+            </w:r>
+            <w:r>
+              <w:rPr>
+                <w:color w:val="FF0000"/>
+              </w:rPr>
+              <w:t>{% if type_of_response == 'modify' and type_of_modification['custody'] %}</w:t>
+            </w:r>
+            <w:r>
+              <w:rPr>
+                <w:shd w:val="clear" w:color="auto" w:fill="FFFFFF"/>
+              </w:rPr>
+              <w:t>motions to modify custody or a Parenting Plan order</w:t>
+            </w:r>
+            <w:r>
+              <w:rPr>
+                <w:color w:val="FF0000"/>
                 <w:shd w:val="clear" w:color="auto" w:fill="FFFFFF"/>
               </w:rPr>
               <w:t>{</w:t>
             </w:r>
             <w:r>
               <w:rPr>
-                <w:color w:val="C00000"/>
-              </w:rPr>
-              <w:t>% elif user_need in('respond to motion in custody', 'respond to motion in divorce') %}</w:t>
-            </w:r>
-            <w:r>
-              <w:rPr>
                 <w:color w:val="FF0000"/>
               </w:rPr>
-              <w:t xml:space="preserve">{% if type_of_response == 'modify' and </w:t>
-            </w:r>
-            <w:proofErr w:type="spellStart"/>
-            <w:r>
-              <w:rPr>
-                <w:color w:val="FF0000"/>
-              </w:rPr>
-              <w:t>type_of_modification</w:t>
-            </w:r>
-            <w:proofErr w:type="spellEnd"/>
-            <w:r>
-              <w:rPr>
-                <w:color w:val="FF0000"/>
-              </w:rPr>
-              <w:t>['custody'] %}</w:t>
-            </w:r>
-            <w:r>
-              <w:rPr>
-                <w:shd w:val="clear" w:color="auto" w:fill="FFFFFF"/>
-              </w:rPr>
-              <w:t>motions to modify custody or a Parenting Plan order</w:t>
-            </w:r>
-            <w:r>
-              <w:rPr>
-                <w:color w:val="FF0000"/>
-                <w:shd w:val="clear" w:color="auto" w:fill="FFFFFF"/>
-              </w:rPr>
-              <w:t>{</w:t>
-            </w:r>
-            <w:r>
-              <w:rPr>
-                <w:color w:val="FF0000"/>
-              </w:rPr>
-              <w:t xml:space="preserve">% elif type_of_response == 'modify' and </w:t>
-            </w:r>
-            <w:proofErr w:type="spellStart"/>
-            <w:r>
-              <w:rPr>
-                <w:color w:val="FF0000"/>
-              </w:rPr>
-              <w:t>type_of_modification</w:t>
-            </w:r>
-            <w:proofErr w:type="spellEnd"/>
-            <w:r>
-              <w:rPr>
-                <w:color w:val="FF0000"/>
-              </w:rPr>
-              <w:t xml:space="preserve">['child </w:t>
-            </w:r>
-            <w:r>
-              <w:rPr>
-                <w:color w:val="FF0000"/>
-              </w:rPr>
-              <w:lastRenderedPageBreak/>
-              <w:t xml:space="preserve">support'] and not </w:t>
-            </w:r>
-            <w:proofErr w:type="spellStart"/>
-            <w:r>
-              <w:rPr>
-                <w:color w:val="FF0000"/>
-              </w:rPr>
-              <w:t>type_of_modification</w:t>
-            </w:r>
-            <w:proofErr w:type="spellEnd"/>
-            <w:r>
-              <w:rPr>
-                <w:color w:val="FF0000"/>
-              </w:rPr>
-              <w:t>['custody'] %}</w:t>
+              <w:t>% elif type_of_response == 'modify' and type_of_modification['child support'] and not type_of_modification['custody'] %}</w:t>
             </w:r>
             <w:r>
               <w:rPr>
@@ -4280,33 +4169,15 @@
               <w:rPr>
                 <w:color w:val="C00000"/>
               </w:rPr>
-              <w:t xml:space="preserve">{% endif %}{% if user_need == 'change foreign custody order' or (user_need == 'change divorce order' and middle_of_case == 'no' and type_of_final_order['custody order'] and why_change in('review', 'schedule')) or (user_need in('respond to motion in custody', 'respond to motion in divorce') and type_of_response == 'modify' and </w:t>
-            </w:r>
-            <w:proofErr w:type="spellStart"/>
-            <w:r>
-              <w:rPr>
-                <w:color w:val="C00000"/>
-              </w:rPr>
-              <w:t>type_of_modification</w:t>
-            </w:r>
-            <w:proofErr w:type="spellEnd"/>
-            <w:r>
-              <w:rPr>
-                <w:color w:val="C00000"/>
-              </w:rPr>
-              <w:t>['custody']) %}</w:t>
-            </w:r>
-          </w:p>
-          <w:p>
-            <w:pPr>
-              <w:pStyle w:val="Body"/>
-            </w:pPr>
-            <w:r>
-              <w:t xml:space="preserve">The courts want children to have a regular schedule without a lot of </w:t>
-            </w:r>
-            <w:r>
-              <w:lastRenderedPageBreak/>
-              <w:t>changes. The courts will generally only change a parenting plan if there is a "substantial change in circumstances." A "substantial change in circumstances" means something has happened so that the old custody or parenting plan is no longer in the children's best interest.</w:t>
+              <w:t>{% endif %}{% if user_need == 'change foreign custody order' or (user_need == 'change divorce order' and middle_of_case == 'no' and type_of_final_order['custody order'] and why_change in('review', 'schedule')) or (user_need in('respond to motion in custody', 'respond to motion in divorce') and type_of_response == 'modify' and type_of_modification['custody']) %}</w:t>
+            </w:r>
+          </w:p>
+          <w:p>
+            <w:pPr>
+              <w:pStyle w:val="Body"/>
+            </w:pPr>
+            <w:r>
+              <w:t>The courts want children to have a regular schedule without a lot of changes. The courts will generally only change a parenting plan if there is a "substantial change in circumstances." A "substantial change in circumstances" means something has happened so that the old custody or parenting plan is no longer in the children's best interest.</w:t>
             </w:r>
           </w:p>
           <w:p>
@@ -4334,7 +4205,11 @@
               <w:suppressOverlap w:val="0"/>
             </w:pPr>
             <w:r>
-              <w:t>Under the current parenting plan order, your children spend one week with you and the next week with the other parent. You are going to move out of state so the current schedule is impossible.</w:t>
+              <w:t xml:space="preserve">Under the current parenting plan order, your children spend </w:t>
+            </w:r>
+            <w:r>
+              <w:lastRenderedPageBreak/>
+              <w:t>one week with you and the next week with the other parent. You are going to move out of state so the current schedule is impossible.</w:t>
             </w:r>
           </w:p>
           <w:p>
@@ -4379,23 +4254,7 @@
               <w:t>{% endif %}</w:t>
             </w:r>
             <w:r>
-              <w:t xml:space="preserve">{% if  user_need == 'respond to motion in divorce' and type_of_response == 'modify' and </w:t>
-            </w:r>
-            <w:proofErr w:type="spellStart"/>
-            <w:r>
-              <w:t>type_of_modification</w:t>
-            </w:r>
-            <w:proofErr w:type="spellEnd"/>
-            <w:r>
-              <w:t xml:space="preserve">['child support']  and not </w:t>
-            </w:r>
-            <w:proofErr w:type="spellStart"/>
-            <w:r>
-              <w:t>type_of_modification</w:t>
-            </w:r>
-            <w:proofErr w:type="spellEnd"/>
-            <w:r>
-              <w:t>['custody'] %}</w:t>
+              <w:t>{% if  user_need == 'respond to motion in divorce' and type_of_response == 'modify' and type_of_modification['child support']  and not type_of_modification['custody'] %}</w:t>
             </w:r>
           </w:p>
           <w:p>
@@ -4464,11 +4323,7 @@
               <w:ind w:left="510"/>
             </w:pPr>
             <w:r>
-              <w:t xml:space="preserve">A 15% change in the amount of child support ordered. So that when you calculate support based on the parents' current </w:t>
-            </w:r>
-            <w:r>
-              <w:lastRenderedPageBreak/>
-              <w:t>income, the amount is 15% more or less than the current support order.</w:t>
+              <w:t>A 15% change in the amount of child support ordered. So that when you calculate support based on the parents' current income, the amount is 15% more or less than the current support order.</w:t>
             </w:r>
           </w:p>
           <w:p>
@@ -4509,7 +4364,14 @@
               <w:rPr>
                 <w:color w:val="92D050"/>
               </w:rPr>
-              <w:t>{% if user_need == 'change foreign custody order' or (user_need in('change AK order', 'change custody order',' change divorce order') and middle_of_case == 'no') %}</w:t>
+              <w:t xml:space="preserve">{% if user_need == 'change foreign custody order' or (user_need in('change AK order', 'change custody order',' change divorce order') and </w:t>
+            </w:r>
+            <w:r>
+              <w:rPr>
+                <w:color w:val="92D050"/>
+              </w:rPr>
+              <w:lastRenderedPageBreak/>
+              <w:t>middle_of_case == 'no') %}</w:t>
             </w:r>
           </w:p>
           <w:p>
@@ -4545,15 +4407,7 @@
               <w:fldChar w:fldCharType="end"/>
             </w:r>
             <w:r>
-              <w:t xml:space="preserve">: {{ </w:t>
-            </w:r>
-            <w:proofErr w:type="spellStart"/>
-            <w:r>
-              <w:t>file_step_heading</w:t>
-            </w:r>
-            <w:proofErr w:type="spellEnd"/>
-            <w:r>
-              <w:t xml:space="preserve"> }}.</w:t>
+              <w:t>: {{ file_step_heading }}.</w:t>
             </w:r>
             <w:r>
               <w:rPr>
@@ -4599,35 +4453,7 @@
               <w:rPr>
                 <w:color w:val="FF0000"/>
               </w:rPr>
-              <w:t xml:space="preserve">{% if user_need == 'respond to motion in divorce' and type_of_response == 'modify' and </w:t>
-            </w:r>
-            <w:proofErr w:type="spellStart"/>
-            <w:r>
-              <w:rPr>
-                <w:color w:val="FF0000"/>
-              </w:rPr>
-              <w:t>type_of_modification</w:t>
-            </w:r>
-            <w:proofErr w:type="spellEnd"/>
-            <w:r>
-              <w:rPr>
-                <w:color w:val="FF0000"/>
-              </w:rPr>
-              <w:t xml:space="preserve">['child support']  and not </w:t>
-            </w:r>
-            <w:proofErr w:type="spellStart"/>
-            <w:r>
-              <w:rPr>
-                <w:color w:val="FF0000"/>
-              </w:rPr>
-              <w:t>type_of_modification</w:t>
-            </w:r>
-            <w:proofErr w:type="spellEnd"/>
-            <w:r>
-              <w:rPr>
-                <w:color w:val="FF0000"/>
-              </w:rPr>
-              <w:t>['custody'] %}</w:t>
+              <w:t>{% if user_need == 'respond to motion in divorce' and type_of_response == 'modify' and type_of_modification['child support']  and not type_of_modification['custody'] %}</w:t>
             </w:r>
             <w:hyperlink r:id="rId48">
               <w:r>
@@ -4664,13 +4490,8 @@
             </w:hyperlink>
             <w:r>
               <w:br/>
-              <w:t>courts.alaska.gov/shc/family/</w:t>
-            </w:r>
-            <w:proofErr w:type="spellStart"/>
-            <w:r>
-              <w:t>shclaws.htm#cases</w:t>
-            </w:r>
-            <w:proofErr w:type="spellEnd"/>
+              <w:t>courts.alaska.gov/shc/family/shclaws.htm#cases</w:t>
+            </w:r>
           </w:p>
         </w:tc>
       </w:tr>
@@ -4805,7 +4626,6 @@
               <w:rPr>
                 <w:color w:val="00B050"/>
               </w:rPr>
-              <w:lastRenderedPageBreak/>
               <w:t>(</w:t>
             </w:r>
             <w:r>
@@ -4855,40 +4675,24 @@
             <w:pPr>
               <w:pStyle w:val="Body"/>
             </w:pPr>
-            <w:proofErr w:type="spellStart"/>
-            <w:r>
-              <w:lastRenderedPageBreak/>
-              <w:t>fill_modify_step</w:t>
-            </w:r>
-            <w:proofErr w:type="spellEnd"/>
-            <w:r>
-              <w:t xml:space="preserve"> in aka2j_mod_cust_div_templates.yml</w:t>
-            </w:r>
-          </w:p>
-          <w:p>
-            <w:pPr>
-              <w:pStyle w:val="Body"/>
-            </w:pPr>
-            <w:proofErr w:type="spellStart"/>
-            <w:r>
-              <w:t>calculate_child_support_step</w:t>
-            </w:r>
-            <w:proofErr w:type="spellEnd"/>
-            <w:r>
-              <w:t xml:space="preserve"> in aka2j_templates.yml</w:t>
-            </w:r>
-          </w:p>
-          <w:p>
-            <w:pPr>
-              <w:pStyle w:val="Body"/>
-            </w:pPr>
-            <w:proofErr w:type="spellStart"/>
-            <w:r>
-              <w:t>dont_wait_modify_custody_divorce_step</w:t>
-            </w:r>
-            <w:proofErr w:type="spellEnd"/>
-            <w:r>
-              <w:t xml:space="preserve"> in aka2j_mod_cust_div_templates.yml</w:t>
+            <w:r>
+              <w:t>fill_modify_step in aka2j_mod_cust_div_templates.yml</w:t>
+            </w:r>
+          </w:p>
+          <w:p>
+            <w:pPr>
+              <w:pStyle w:val="Body"/>
+            </w:pPr>
+            <w:r>
+              <w:t>calculate_child_support_step in aka2j_templates.yml</w:t>
+            </w:r>
+          </w:p>
+          <w:p>
+            <w:pPr>
+              <w:pStyle w:val="Body"/>
+            </w:pPr>
+            <w:r>
+              <w:t>dont_wait_modify_custody_divorce_step in aka2j_mod_cust_div_templates.yml</w:t>
             </w:r>
           </w:p>
         </w:tc>
@@ -4970,21 +4774,13 @@
               </w:rPr>
               <w:t xml:space="preserve">% if user_need in('change child </w:t>
             </w:r>
-            <w:proofErr w:type="spellStart"/>
             <w:r>
               <w:rPr>
                 <w:color w:val="FFC000"/>
                 <w:shd w:val="clear" w:color="auto" w:fill="FFFFFF"/>
               </w:rPr>
-              <w:t>support','change</w:t>
-            </w:r>
-            <w:proofErr w:type="spellEnd"/>
-            <w:r>
-              <w:rPr>
-                <w:color w:val="FFC000"/>
-                <w:shd w:val="clear" w:color="auto" w:fill="FFFFFF"/>
-              </w:rPr>
-              <w:t xml:space="preserve"> custody order') %}</w:t>
+              <w:lastRenderedPageBreak/>
+              <w:t>support','change custody order') %}</w:t>
             </w:r>
             <w:r>
               <w:rPr>
@@ -5076,6 +4872,7 @@
               <w:outlineLvl w:val="2"/>
             </w:pPr>
             <w:r>
+              <w:lastRenderedPageBreak/>
               <w:t>Use</w:t>
             </w:r>
           </w:p>
@@ -5112,6 +4909,9 @@
             </w:hyperlink>
             <w:r>
               <w:br/>
+            </w:r>
+            <w:r>
+              <w:lastRenderedPageBreak/>
               <w:t>3 of the forms in this packet are affidavits:</w:t>
             </w:r>
           </w:p>
@@ -5336,15 +5136,7 @@
             </w:hyperlink>
             <w:r>
               <w:br/>
-              <w:t>youtube.com/</w:t>
-            </w:r>
-            <w:proofErr w:type="spellStart"/>
-            <w:r>
-              <w:t>watch?v</w:t>
-            </w:r>
-            <w:proofErr w:type="spellEnd"/>
-            <w:r>
-              <w:t>=2irmxT0_0EA</w:t>
+              <w:t>youtube.com/watch?v=2irmxT0_0EA</w:t>
             </w:r>
           </w:p>
         </w:tc>
@@ -5372,6 +5164,7 @@
               <w:rPr>
                 <w:shd w:val="clear" w:color="auto" w:fill="FFFFFF"/>
               </w:rPr>
+              <w:lastRenderedPageBreak/>
               <w:t xml:space="preserve">Step </w:t>
             </w:r>
             <w:r>
@@ -5447,11 +5240,7 @@
               <w:ind w:left="405"/>
             </w:pPr>
             <w:r>
-              <w:t xml:space="preserve">Calculate the percent of overnights your children spend with you and with the other parent. To get this percent, divide 365 (the </w:t>
-            </w:r>
-            <w:r>
-              <w:lastRenderedPageBreak/>
-              <w:t>number of overnights in a year), by the number of overnights the child spends with each parent.</w:t>
+              <w:t>Calculate the percent of overnights your children spend with you and with the other parent. To get this percent, divide 365 (the number of overnights in a year), by the number of overnights the child spends with each parent.</w:t>
             </w:r>
           </w:p>
           <w:p>
@@ -5489,7 +5278,11 @@
               <w:suppressOverlap w:val="0"/>
             </w:pPr>
             <w:r>
-              <w:t>156 divided by 365 nights in a year is .43, or 43% of overnights with the other parent.</w:t>
+              <w:t xml:space="preserve">156 divided by 365 nights in a year is .43, or 43% of </w:t>
+            </w:r>
+            <w:r>
+              <w:lastRenderedPageBreak/>
+              <w:t>overnights with the other parent.</w:t>
             </w:r>
           </w:p>
           <w:p>
@@ -5733,7 +5526,6 @@
                 <w:b/>
                 <w:bCs/>
               </w:rPr>
-              <w:lastRenderedPageBreak/>
               <w:t>Shared Custody Support Calculation, DR-306</w:t>
             </w:r>
             <w:r>
@@ -5872,11 +5664,21 @@
               <w:lastRenderedPageBreak/>
               <w:t xml:space="preserve">Step </w:t>
             </w:r>
-            <w:fldSimple w:instr=" SEQ stepList \* ARABIC ">
-              <w:r>
-                <w:t>10</w:t>
-              </w:r>
-            </w:fldSimple>
+            <w:r>
+              <w:fldChar w:fldCharType="begin"/>
+            </w:r>
+            <w:r>
+              <w:instrText xml:space="preserve"> SEQ stepList \* ARABIC </w:instrText>
+            </w:r>
+            <w:r>
+              <w:fldChar w:fldCharType="separate"/>
+            </w:r>
+            <w:r>
+              <w:t>10</w:t>
+            </w:r>
+            <w:r>
+              <w:fldChar w:fldCharType="end"/>
+            </w:r>
             <w:r>
               <w:t xml:space="preserve">: </w:t>
             </w:r>
@@ -5884,7 +5686,14 @@
               <w:rPr>
                 <w:shd w:val="clear" w:color="auto" w:fill="FFFFFF"/>
               </w:rPr>
-              <w:t>Do not wait to file your Motion to Modify</w:t>
+              <w:t xml:space="preserve">Do not wait to file your </w:t>
+            </w:r>
+            <w:r>
+              <w:rPr>
+                <w:shd w:val="clear" w:color="auto" w:fill="FFFFFF"/>
+              </w:rPr>
+              <w:lastRenderedPageBreak/>
+              <w:t>Motion to Modify</w:t>
             </w:r>
           </w:p>
         </w:tc>
@@ -5906,6 +5715,7 @@
               <w:pStyle w:val="Body"/>
             </w:pPr>
             <w:r>
+              <w:lastRenderedPageBreak/>
               <w:t xml:space="preserve">If you and the other parent agree to change the schedule, or have already permanently changed your schedule, file your </w:t>
             </w:r>
             <w:r>
@@ -5924,6 +5734,7 @@
               <w:pStyle w:val="Body"/>
             </w:pPr>
             <w:r>
+              <w:lastRenderedPageBreak/>
               <w:t>Until you file your motion with the court, the parent who owes child support still owes the amount in your current order.</w:t>
             </w:r>
           </w:p>
@@ -6129,7 +5940,11 @@
               <w:pStyle w:val="Body"/>
             </w:pPr>
             <w:r>
-              <w:t>{%tr if interim_order_date_within_10_days or final_order_date_within_10_days or unknown_final_date['reconsider'] %}</w:t>
+              <w:t>{%tr if interim_order_date_within_10_days or final_order_date_within_10_days or unknown_final_date['rec</w:t>
+            </w:r>
+            <w:r>
+              <w:lastRenderedPageBreak/>
+              <w:t>onsider'] %}</w:t>
             </w:r>
           </w:p>
         </w:tc>
@@ -6150,21 +5965,9 @@
             <w:pPr>
               <w:pStyle w:val="Body"/>
             </w:pPr>
-            <w:proofErr w:type="spellStart"/>
-            <w:r>
-              <w:t>learn_reconsider_step</w:t>
-            </w:r>
-            <w:proofErr w:type="spellEnd"/>
-            <w:r>
-              <w:t xml:space="preserve"> and </w:t>
-            </w:r>
-            <w:proofErr w:type="spellStart"/>
-            <w:r>
-              <w:t>fill_reconsider_step</w:t>
-            </w:r>
-            <w:proofErr w:type="spellEnd"/>
-            <w:r>
-              <w:t xml:space="preserve"> in aka2j_mod_cust_div_templates.yml</w:t>
+            <w:r>
+              <w:lastRenderedPageBreak/>
+              <w:t>learn_reconsider_step and fill_reconsider_step in aka2j_mod_cust_div_templates.yml</w:t>
             </w:r>
           </w:p>
         </w:tc>
@@ -6191,11 +5994,21 @@
             <w:r>
               <w:t xml:space="preserve">Step </w:t>
             </w:r>
-            <w:fldSimple w:instr=" SEQ stepList \* ARABIC ">
-              <w:r>
-                <w:t>11</w:t>
-              </w:r>
-            </w:fldSimple>
+            <w:r>
+              <w:fldChar w:fldCharType="begin"/>
+            </w:r>
+            <w:r>
+              <w:instrText xml:space="preserve"> SEQ stepList \* ARABIC </w:instrText>
+            </w:r>
+            <w:r>
+              <w:fldChar w:fldCharType="separate"/>
+            </w:r>
+            <w:r>
+              <w:t>11</w:t>
+            </w:r>
+            <w:r>
+              <w:fldChar w:fldCharType="end"/>
+            </w:r>
             <w:r>
               <w:t>: Learn about Motions to Reconsider</w:t>
             </w:r>
@@ -6236,15 +6049,7 @@
               <w:pStyle w:val="Body"/>
             </w:pPr>
             <w:r>
-              <w:t xml:space="preserve">You have only 10 days after the date the court sent your {{ </w:t>
-            </w:r>
-            <w:proofErr w:type="spellStart"/>
-            <w:r>
-              <w:t>case_type</w:t>
-            </w:r>
-            <w:proofErr w:type="spellEnd"/>
-            <w:r>
-              <w:t xml:space="preserve"> }} order to you.</w:t>
+              <w:t>You have only 10 days after the date the court sent your {{ case_type }} order to you.</w:t>
             </w:r>
           </w:p>
           <w:p>
@@ -6260,71 +6065,31 @@
               <w:pStyle w:val="Body"/>
             </w:pPr>
             <w:r>
-              <w:t xml:space="preserve">{% for </w:t>
-            </w:r>
-            <w:proofErr w:type="spellStart"/>
-            <w:r>
-              <w:t>image_data</w:t>
-            </w:r>
-            <w:proofErr w:type="spellEnd"/>
-            <w:r>
-              <w:t xml:space="preserve"> in </w:t>
-            </w:r>
-            <w:proofErr w:type="spellStart"/>
-            <w:r>
-              <w:t>distribution_certificate_list</w:t>
-            </w:r>
-            <w:proofErr w:type="spellEnd"/>
-            <w:r>
-              <w:t xml:space="preserve"> %}</w:t>
-            </w:r>
-          </w:p>
-          <w:p>
-            <w:pPr>
-              <w:pStyle w:val="Body"/>
-            </w:pPr>
-            <w:r>
-              <w:t xml:space="preserve">{{ </w:t>
-            </w:r>
-            <w:proofErr w:type="spellStart"/>
-            <w:r>
-              <w:t>image_data</w:t>
-            </w:r>
-            <w:proofErr w:type="spellEnd"/>
-            <w:r>
-              <w:t>['text'] }}</w:t>
-            </w:r>
-          </w:p>
-          <w:p>
-            <w:pPr>
-              <w:pStyle w:val="Body"/>
-            </w:pPr>
-            <w:r>
-              <w:t xml:space="preserve">{{ </w:t>
-            </w:r>
-            <w:proofErr w:type="spellStart"/>
-            <w:r>
-              <w:t>image_data</w:t>
-            </w:r>
-            <w:proofErr w:type="spellEnd"/>
-            <w:r>
-              <w:t>['image'].show(width='5in%') }}</w:t>
-            </w:r>
-          </w:p>
-          <w:p>
-            <w:pPr>
-              <w:pStyle w:val="Body"/>
-            </w:pPr>
-            <w:r>
-              <w:t xml:space="preserve">{% </w:t>
-            </w:r>
-            <w:proofErr w:type="spellStart"/>
-            <w:r>
-              <w:t>endfor</w:t>
-            </w:r>
-            <w:proofErr w:type="spellEnd"/>
-            <w:r>
-              <w:t xml:space="preserve"> %}If the </w:t>
+              <w:t>{% for image_data in distribution_certificate_list %}</w:t>
+            </w:r>
+          </w:p>
+          <w:p>
+            <w:pPr>
+              <w:pStyle w:val="Body"/>
+            </w:pPr>
+            <w:r>
+              <w:t>{{ image_data['text'] }}</w:t>
+            </w:r>
+          </w:p>
+          <w:p>
+            <w:pPr>
+              <w:pStyle w:val="Body"/>
+            </w:pPr>
+            <w:r>
+              <w:t>{{ image_data['image'].show(width='5in%') }}</w:t>
+            </w:r>
+          </w:p>
+          <w:p>
+            <w:pPr>
+              <w:pStyle w:val="Body"/>
+            </w:pPr>
+            <w:r>
+              <w:t xml:space="preserve">{% endfor %}If the </w:t>
             </w:r>
             <w:r>
               <w:rPr>
@@ -6394,7 +6159,6 @@
               <w:suppressOverlap w:val="0"/>
             </w:pPr>
             <w:r>
-              <w:lastRenderedPageBreak/>
               <w:t xml:space="preserve">If the judge </w:t>
             </w:r>
             <w:r>
@@ -6446,7 +6210,14 @@
               <w:rPr>
                 <w:shd w:val="clear" w:color="auto" w:fill="FFFFFF"/>
               </w:rPr>
-              <w:t xml:space="preserve">he parents agree that mom makes $25,000 every year. They file the forms to tell the judge they agree. The judge calculated child support using $35,000 for mom’s income. </w:t>
+              <w:t xml:space="preserve">he parents agree that mom makes $25,000 every year. They file the forms to tell the judge they agree. The judge calculated </w:t>
+            </w:r>
+            <w:r>
+              <w:rPr>
+                <w:shd w:val="clear" w:color="auto" w:fill="FFFFFF"/>
+              </w:rPr>
+              <w:lastRenderedPageBreak/>
+              <w:t xml:space="preserve">child support using $35,000 for mom’s income. </w:t>
             </w:r>
           </w:p>
           <w:p>
@@ -6565,11 +6336,7 @@
               <w:suppressOverlap w:val="0"/>
             </w:pPr>
             <w:r>
-              <w:t xml:space="preserve"> If the judge calculated child support on April 14 and did not subtract the cost of the parent's health insurance, the Motion to Reconsider would explain the cost of the parent's health </w:t>
-            </w:r>
-            <w:r>
-              <w:lastRenderedPageBreak/>
-              <w:t>insurance and state that Civil Rule 90.3 changed on April 15, 2018</w:t>
+              <w:t xml:space="preserve"> If the judge calculated child support on April 14 and did not subtract the cost of the parent's health insurance, the Motion to Reconsider would explain the cost of the parent's health insurance and state that Civil Rule 90.3 changed on April 15, 2018</w:t>
             </w:r>
             <w:r>
               <w:rPr>
@@ -6691,7 +6458,11 @@
               <w:fldChar w:fldCharType="end"/>
             </w:r>
             <w:r>
-              <w:t>: Fill out the Motion to Reconsider forms</w:t>
+              <w:t xml:space="preserve">: Fill out </w:t>
+            </w:r>
+            <w:r>
+              <w:lastRenderedPageBreak/>
+              <w:t>the Motion to Reconsider forms</w:t>
             </w:r>
           </w:p>
         </w:tc>
@@ -6715,6 +6486,7 @@
               <w:outlineLvl w:val="2"/>
             </w:pPr>
             <w:r>
+              <w:lastRenderedPageBreak/>
               <w:t>Use</w:t>
             </w:r>
           </w:p>
@@ -6736,6 +6508,7 @@
               <w:rPr>
                 <w:b/>
               </w:rPr>
+              <w:lastRenderedPageBreak/>
               <w:t>Motion and Affidavit to Reconsider, SHC-1545</w:t>
             </w:r>
             <w:r>
@@ -7106,9 +6879,6 @@
             </w:r>
             <w:r>
               <w:br/>
-            </w:r>
-            <w:r>
-              <w:lastRenderedPageBreak/>
               <w:t xml:space="preserve">as a </w:t>
             </w:r>
             <w:hyperlink r:id="rId78" w:tgtFrame="_blank">
@@ -7238,33 +7008,14 @@
             <w:pPr>
               <w:pStyle w:val="Body"/>
             </w:pPr>
-            <w:proofErr w:type="spellStart"/>
-            <w:r>
-              <w:t>standing_order_step</w:t>
-            </w:r>
-            <w:proofErr w:type="spellEnd"/>
-            <w:r>
-              <w:t xml:space="preserve"> and </w:t>
-            </w:r>
-            <w:r>
-              <w:rPr>
-                <w:shd w:val="clear" w:color="auto" w:fill="FFFFFF"/>
-              </w:rPr>
-              <w:t xml:space="preserve"> </w:t>
-            </w:r>
-            <w:proofErr w:type="spellStart"/>
-            <w:r>
-              <w:rPr>
-                <w:shd w:val="clear" w:color="auto" w:fill="FFFFFF"/>
-              </w:rPr>
-              <w:t>motion_forms_step</w:t>
-            </w:r>
-            <w:proofErr w:type="spellEnd"/>
-            <w:r>
-              <w:rPr>
-                <w:shd w:val="clear" w:color="auto" w:fill="FFFFFF"/>
-              </w:rPr>
-              <w:t xml:space="preserve">  in aka2j_mod_cust_div_templates.yml</w:t>
+            <w:r>
+              <w:t xml:space="preserve">standing_order_step and </w:t>
+            </w:r>
+            <w:r>
+              <w:rPr>
+                <w:shd w:val="clear" w:color="auto" w:fill="FFFFFF"/>
+              </w:rPr>
+              <w:t xml:space="preserve"> motion_forms_step  in aka2j_mod_cust_div_templates.yml</w:t>
             </w:r>
           </w:p>
         </w:tc>
@@ -7292,6 +7043,7 @@
               <w:rPr>
                 <w:shd w:val="clear" w:color="auto" w:fill="FFFFFF"/>
               </w:rPr>
+              <w:lastRenderedPageBreak/>
               <w:t xml:space="preserve">Step </w:t>
             </w:r>
             <w:r>
@@ -7619,14 +7371,7 @@
               <w:rPr>
                 <w:shd w:val="clear" w:color="auto" w:fill="FFFFFF"/>
               </w:rPr>
-              <w:t>: {% if type_of_interim_</w:t>
-            </w:r>
-            <w:r>
-              <w:rPr>
-                <w:shd w:val="clear" w:color="auto" w:fill="FFFFFF"/>
-              </w:rPr>
-              <w:lastRenderedPageBreak/>
-              <w:t>order == 'standing order' %}Fill out your motion forms{% else %}Ask the judge to change an interim order{% endif %}</w:t>
+              <w:t>: {% if type_of_interim_order == 'standing order' %}Fill out your motion forms{% else %}Ask the judge to change an interim order{% endif %}</w:t>
             </w:r>
           </w:p>
         </w:tc>
@@ -7651,7 +7396,6 @@
               <w:rPr>
                 <w:color w:val="FF0000"/>
               </w:rPr>
-              <w:lastRenderedPageBreak/>
               <w:t>{% if type_of_interim_order == 'motion' %}</w:t>
             </w:r>
             <w:r>
@@ -7663,7 +7407,6 @@
               <w:pStyle w:val="Body"/>
             </w:pPr>
             <w:r>
-              <w:lastRenderedPageBreak/>
               <w:t>Tell the judge what has changed and why you need a new order.</w:t>
             </w:r>
             <w:r>
@@ -7850,6 +7593,13 @@
                 <w:color w:val="000000"/>
               </w:rPr>
               <w:br/>
+            </w:r>
+            <w:r>
+              <w:rPr>
+                <w:rFonts w:eastAsia="Calibri"/>
+                <w:color w:val="000000"/>
+              </w:rPr>
+              <w:lastRenderedPageBreak/>
               <w:t>courts.alaska.gov/shc/family/docs/shc-1301n.pdf</w:t>
             </w:r>
           </w:p>
@@ -8020,13 +7770,8 @@
             <w:pPr>
               <w:pStyle w:val="Body"/>
             </w:pPr>
-            <w:proofErr w:type="spellStart"/>
-            <w:r>
-              <w:t>appeal_step</w:t>
-            </w:r>
-            <w:proofErr w:type="spellEnd"/>
-            <w:r>
-              <w:t xml:space="preserve"> in aka2j_mod_cust_div_templates.yml</w:t>
+            <w:r>
+              <w:t>appeal_step in aka2j_mod_cust_div_templates.yml</w:t>
             </w:r>
           </w:p>
         </w:tc>
@@ -8148,11 +7893,7 @@
               <w:t>30 days</w:t>
             </w:r>
             <w:r>
-              <w:t xml:space="preserve"> from the day the </w:t>
-            </w:r>
-            <w:r>
-              <w:lastRenderedPageBreak/>
-              <w:t>court sent the order to you.{% endif %}</w:t>
+              <w:t xml:space="preserve"> from the day the court sent the order to you.{% endif %}</w:t>
             </w:r>
           </w:p>
           <w:p>
@@ -8243,6 +7984,7 @@
               <w:ind w:left="405"/>
             </w:pPr>
             <w:r>
+              <w:lastRenderedPageBreak/>
               <w:t xml:space="preserve">appeal briefs filed in the appeal to the Supreme Court. </w:t>
             </w:r>
           </w:p>
@@ -8552,7 +8294,6 @@
               <w:pStyle w:val="Body"/>
             </w:pPr>
             <w:r>
-              <w:lastRenderedPageBreak/>
               <w:t>{%tr if user_need == "change custody order" and why_change == 'problem' and not final_order_date_within_10_days and (not defined('unknown_final_date') or unknown_final_date['set aside']) %}</w:t>
             </w:r>
           </w:p>
@@ -8574,21 +8315,8 @@
             <w:pPr>
               <w:pStyle w:val="Body"/>
             </w:pPr>
-            <w:proofErr w:type="spellStart"/>
-            <w:r>
-              <w:t>learn_set_aside_step</w:t>
-            </w:r>
-            <w:proofErr w:type="spellEnd"/>
-            <w:r>
-              <w:t xml:space="preserve"> and </w:t>
-            </w:r>
-            <w:proofErr w:type="spellStart"/>
-            <w:r>
-              <w:t>fill_set_aside_step</w:t>
-            </w:r>
-            <w:proofErr w:type="spellEnd"/>
-            <w:r>
-              <w:t xml:space="preserve"> in aka2j_mod_cust_div_templates.yml</w:t>
+            <w:r>
+              <w:t>learn_set_aside_step and fill_set_aside_step in aka2j_mod_cust_div_templates.yml</w:t>
             </w:r>
           </w:p>
         </w:tc>
@@ -8655,7 +8383,11 @@
               <w:t>:</w:t>
             </w:r>
             <w:r>
-              <w:t xml:space="preserve"> Learn about the Motion to Set Aside Judgment or Order</w:t>
+              <w:t xml:space="preserve"> Learn </w:t>
+            </w:r>
+            <w:r>
+              <w:lastRenderedPageBreak/>
+              <w:t>about the Motion to Set Aside Judgment or Order</w:t>
             </w:r>
           </w:p>
         </w:tc>
@@ -8679,6 +8411,7 @@
             <w:bookmarkStart w:id="3" w:name="_Hlk136616288"/>
             <w:bookmarkStart w:id="4" w:name="_Hlk136615055"/>
             <w:r>
+              <w:lastRenderedPageBreak/>
               <w:t xml:space="preserve">A </w:t>
             </w:r>
             <w:r>
@@ -8702,6 +8435,7 @@
               <w:ind w:left="403"/>
             </w:pPr>
             <w:r>
+              <w:lastRenderedPageBreak/>
               <w:t>f</w:t>
             </w:r>
             <w:r>
@@ -8885,7 +8619,6 @@
             </w:pPr>
             <w:bookmarkStart w:id="7" w:name="_Hlk193899290"/>
             <w:r>
-              <w:lastRenderedPageBreak/>
               <w:t xml:space="preserve">For problems 1, 2, and 3, you must file your </w:t>
             </w:r>
             <w:r>
@@ -8965,71 +8698,32 @@
               <w:pStyle w:val="Body"/>
             </w:pPr>
             <w:r>
-              <w:t xml:space="preserve">{% for </w:t>
-            </w:r>
-            <w:proofErr w:type="spellStart"/>
-            <w:r>
-              <w:t>image_data</w:t>
-            </w:r>
-            <w:proofErr w:type="spellEnd"/>
-            <w:r>
-              <w:t xml:space="preserve"> in </w:t>
-            </w:r>
-            <w:proofErr w:type="spellStart"/>
-            <w:r>
-              <w:t>distribution_certificate_list</w:t>
-            </w:r>
-            <w:proofErr w:type="spellEnd"/>
-            <w:r>
-              <w:t xml:space="preserve"> %}</w:t>
-            </w:r>
-          </w:p>
-          <w:p>
-            <w:pPr>
-              <w:pStyle w:val="Body"/>
-            </w:pPr>
-            <w:r>
-              <w:t xml:space="preserve">{{ </w:t>
-            </w:r>
-            <w:proofErr w:type="spellStart"/>
-            <w:r>
-              <w:t>image_data</w:t>
-            </w:r>
-            <w:proofErr w:type="spellEnd"/>
-            <w:r>
-              <w:t>['text'] }}</w:t>
-            </w:r>
-          </w:p>
-          <w:p>
-            <w:pPr>
-              <w:pStyle w:val="Body"/>
-            </w:pPr>
-            <w:r>
-              <w:t xml:space="preserve">{{ </w:t>
-            </w:r>
-            <w:proofErr w:type="spellStart"/>
-            <w:r>
-              <w:t>image_data</w:t>
-            </w:r>
-            <w:proofErr w:type="spellEnd"/>
-            <w:r>
-              <w:t>['image'].show(width='5in%') }}</w:t>
-            </w:r>
-          </w:p>
-          <w:p>
-            <w:pPr>
-              <w:pStyle w:val="Body"/>
-            </w:pPr>
-            <w:r>
-              <w:t xml:space="preserve">{% </w:t>
-            </w:r>
-            <w:proofErr w:type="spellStart"/>
-            <w:r>
-              <w:t>endfor</w:t>
-            </w:r>
-            <w:proofErr w:type="spellEnd"/>
-            <w:r>
-              <w:t xml:space="preserve"> %}</w:t>
+              <w:t>{% for image_data in distribution_certificate_list %}</w:t>
+            </w:r>
+          </w:p>
+          <w:p>
+            <w:pPr>
+              <w:pStyle w:val="Body"/>
+            </w:pPr>
+            <w:r>
+              <w:t>{{ image_data['text'] }}</w:t>
+            </w:r>
+          </w:p>
+          <w:p>
+            <w:pPr>
+              <w:pStyle w:val="Body"/>
+            </w:pPr>
+            <w:r>
+              <w:lastRenderedPageBreak/>
+              <w:t>{{ image_data['image'].show(width='5in%') }}</w:t>
+            </w:r>
+          </w:p>
+          <w:p>
+            <w:pPr>
+              <w:pStyle w:val="Body"/>
+            </w:pPr>
+            <w:r>
+              <w:t>{% endfor %}</w:t>
             </w:r>
             <w:bookmarkEnd w:id="7"/>
           </w:p>
@@ -9266,7 +8960,6 @@
                 <w:rFonts w:eastAsia="Times New Roman"/>
                 <w:color w:val="000000"/>
               </w:rPr>
-              <w:lastRenderedPageBreak/>
               <w:t>Y</w:t>
             </w:r>
             <w:r>
@@ -9405,7 +9098,11 @@
               <w:t xml:space="preserve">The judge </w:t>
             </w:r>
             <w:r>
-              <w:t xml:space="preserve">decides if you filed your motion within </w:t>
+              <w:t xml:space="preserve">decides if you filed your motion </w:t>
+            </w:r>
+            <w:r>
+              <w:lastRenderedPageBreak/>
+              <w:t xml:space="preserve">within </w:t>
             </w:r>
             <w:r>
               <w:t xml:space="preserve">a reasonable time. The judge may </w:t>
@@ -9609,7 +9306,6 @@
               <w:rPr>
                 <w:bCs/>
               </w:rPr>
-              <w:lastRenderedPageBreak/>
               <w:t>Parents</w:t>
             </w:r>
             <w:r>
@@ -9752,7 +9448,11 @@
               <w:t>:</w:t>
             </w:r>
             <w:r>
-              <w:t xml:space="preserve"> Fill out forms if you want to file a Motion to Set Aside</w:t>
+              <w:t xml:space="preserve"> Fill out forms if you want to file a </w:t>
+            </w:r>
+            <w:r>
+              <w:lastRenderedPageBreak/>
+              <w:t>Motion to Set Aside</w:t>
             </w:r>
           </w:p>
         </w:tc>
@@ -9774,6 +9474,7 @@
               <w:pStyle w:val="Body"/>
             </w:pPr>
             <w:r>
+              <w:lastRenderedPageBreak/>
               <w:t xml:space="preserve">If you decide </w:t>
             </w:r>
             <w:r>
@@ -9819,7 +9520,14 @@
               <w:rPr>
                 <w:b/>
               </w:rPr>
-              <w:t>Motion and Affidavit to Set Aside the Judgment or Order, SHC-1548</w:t>
+              <w:t xml:space="preserve">Motion and Affidavit to Set Aside the Judgment or Order, </w:t>
+            </w:r>
+            <w:r>
+              <w:rPr>
+                <w:b/>
+              </w:rPr>
+              <w:lastRenderedPageBreak/>
+              <w:t>SHC-1548</w:t>
             </w:r>
             <w:r>
               <w:t xml:space="preserve"> </w:t>
@@ -10167,9 +9875,6 @@
             </w:r>
             <w:r>
               <w:br/>
-            </w:r>
-            <w:r>
-              <w:lastRenderedPageBreak/>
               <w:t>public.courts.alaska.gov/web/forms/docs/tf-835.pdf</w:t>
             </w:r>
           </w:p>
@@ -10323,15 +10028,10 @@
             </w:hyperlink>
             <w:r>
               <w:br/>
-              <w:t>youtube.com/</w:t>
-            </w:r>
-            <w:proofErr w:type="spellStart"/>
-            <w:r>
-              <w:t>watch?v</w:t>
-            </w:r>
-            <w:proofErr w:type="spellEnd"/>
-            <w:r>
-              <w:t>=2irmxT0_0EA</w:t>
+            </w:r>
+            <w:r>
+              <w:lastRenderedPageBreak/>
+              <w:t>youtube.com/watch?v=2irmxT0_0EA</w:t>
             </w:r>
           </w:p>
         </w:tc>
@@ -10429,13 +10129,8 @@
             <w:pPr>
               <w:pStyle w:val="Body"/>
             </w:pPr>
-            <w:proofErr w:type="spellStart"/>
-            <w:r>
-              <w:t>expect_reconsider_step</w:t>
-            </w:r>
-            <w:proofErr w:type="spellEnd"/>
-            <w:r>
-              <w:t xml:space="preserve"> in aka2j_mod_cust_div_templates.yml</w:t>
+            <w:r>
+              <w:t>expect_reconsider_step in aka2j_mod_cust_div_templates.yml</w:t>
             </w:r>
           </w:p>
         </w:tc>
@@ -10616,15 +10311,7 @@
               <w:ind w:left="420"/>
             </w:pPr>
             <w:r>
-              <w:t xml:space="preserve">If the </w:t>
-            </w:r>
-            <w:proofErr w:type="spellStart"/>
-            <w:r>
-              <w:t>judget</w:t>
-            </w:r>
-            <w:proofErr w:type="spellEnd"/>
-            <w:r>
-              <w:t xml:space="preserve"> grants the </w:t>
+              <w:t xml:space="preserve">If the judget grants the </w:t>
             </w:r>
             <w:r>
               <w:rPr>
@@ -10642,7 +10329,6 @@
               <w:outlineLvl w:val="2"/>
             </w:pPr>
             <w:r>
-              <w:lastRenderedPageBreak/>
               <w:t>If the judge asks for a response</w:t>
             </w:r>
           </w:p>
@@ -10733,7 +10419,6 @@
               <w:rPr>
                 <w:shd w:val="clear" w:color="auto" w:fill="FFFFFF"/>
               </w:rPr>
-              <w:lastRenderedPageBreak/>
               <w:t>{%tr endif %}</w:t>
             </w:r>
           </w:p>
@@ -10783,35 +10468,8 @@
               <w:rPr>
                 <w:shd w:val="clear" w:color="auto" w:fill="FFFFFF"/>
               </w:rPr>
-              <w:t xml:space="preserve">{%tr if </w:t>
-            </w:r>
-            <w:proofErr w:type="spellStart"/>
-            <w:r>
-              <w:rPr>
-                <w:shd w:val="clear" w:color="auto" w:fill="FFFFFF"/>
-              </w:rPr>
-              <w:t>respond_to_modify</w:t>
-            </w:r>
-            <w:proofErr w:type="spellEnd"/>
-            <w:r>
-              <w:rPr>
-                <w:shd w:val="clear" w:color="auto" w:fill="FFFFFF"/>
-              </w:rPr>
-              <w:t xml:space="preserve"> == 'agree' or </w:t>
-            </w:r>
-            <w:proofErr w:type="spellStart"/>
-            <w:r>
-              <w:rPr>
-                <w:shd w:val="clear" w:color="auto" w:fill="FFFFFF"/>
-              </w:rPr>
-              <w:t>respond_to_set_aside</w:t>
-            </w:r>
-            <w:proofErr w:type="spellEnd"/>
-            <w:r>
-              <w:rPr>
-                <w:shd w:val="clear" w:color="auto" w:fill="FFFFFF"/>
-              </w:rPr>
-              <w:t xml:space="preserve"> == 'agree'%}</w:t>
+              <w:lastRenderedPageBreak/>
+              <w:t>{%tr if respond_to_modify == 'agree' or respond_to_set_aside == 'agree'%}</w:t>
             </w:r>
           </w:p>
         </w:tc>
@@ -10832,13 +10490,8 @@
             <w:pPr>
               <w:pStyle w:val="Body"/>
             </w:pPr>
-            <w:proofErr w:type="spellStart"/>
-            <w:r>
-              <w:t>let_court_party_know_you_agree_step</w:t>
-            </w:r>
-            <w:proofErr w:type="spellEnd"/>
-            <w:r>
-              <w:t xml:space="preserve"> in aka2j_motion_response_templates.yml</w:t>
+            <w:r>
+              <w:t>let_court_party_know_you_agree_step in aka2j_motion_response_templates.yml</w:t>
             </w:r>
           </w:p>
         </w:tc>
@@ -10912,57 +10565,33 @@
                 <w:color w:val="FFC000"/>
                 <w:shd w:val="clear" w:color="auto" w:fill="FFFFFF"/>
               </w:rPr>
-              <w:t xml:space="preserve">{% if </w:t>
-            </w:r>
-            <w:proofErr w:type="spellStart"/>
+              <w:t>{% if respond_to_modify == 'agree' %}</w:t>
+            </w:r>
+            <w:r>
+              <w:rPr>
+                <w:shd w:val="clear" w:color="auto" w:fill="FFFFFF"/>
+              </w:rPr>
+              <w:t>proposed changes</w:t>
+            </w:r>
             <w:r>
               <w:rPr>
                 <w:color w:val="FFC000"/>
                 <w:shd w:val="clear" w:color="auto" w:fill="FFFFFF"/>
               </w:rPr>
-              <w:t>respond_to_modify</w:t>
-            </w:r>
-            <w:proofErr w:type="spellEnd"/>
+              <w:t>{% else %}</w:t>
+            </w:r>
+            <w:r>
+              <w:rPr>
+                <w:shd w:val="clear" w:color="auto" w:fill="FFFFFF"/>
+              </w:rPr>
+              <w:t>Motion to Set Aside Judgment or Order</w:t>
+            </w:r>
             <w:r>
               <w:rPr>
                 <w:color w:val="FFC000"/>
                 <w:shd w:val="clear" w:color="auto" w:fill="FFFFFF"/>
               </w:rPr>
-              <w:t xml:space="preserve"> == 'agree' %}</w:t>
-            </w:r>
-            <w:r>
-              <w:rPr>
-                <w:shd w:val="clear" w:color="auto" w:fill="FFFFFF"/>
-              </w:rPr>
-              <w:t>proposed changes</w:t>
-            </w:r>
-            <w:r>
-              <w:rPr>
-                <w:color w:val="FFC000"/>
-                <w:shd w:val="clear" w:color="auto" w:fill="FFFFFF"/>
-              </w:rPr>
-              <w:t>{% else %}</w:t>
-            </w:r>
-            <w:r>
-              <w:rPr>
-                <w:shd w:val="clear" w:color="auto" w:fill="FFFFFF"/>
-              </w:rPr>
-              <w:t>Motion to Set Aside Judgment or Order</w:t>
-            </w:r>
-            <w:r>
-              <w:rPr>
-                <w:color w:val="FFC000"/>
-                <w:shd w:val="clear" w:color="auto" w:fill="FFFFFF"/>
-              </w:rPr>
-              <w:t xml:space="preserve">{% endif </w:t>
-            </w:r>
-            <w:r>
-              <w:rPr>
-                <w:color w:val="FFC000"/>
-                <w:shd w:val="clear" w:color="auto" w:fill="FFFFFF"/>
-              </w:rPr>
-              <w:lastRenderedPageBreak/>
-              <w:t>%}</w:t>
+              <w:t>{% endif %}</w:t>
             </w:r>
           </w:p>
         </w:tc>
@@ -10986,7 +10615,6 @@
               <w:outlineLvl w:val="2"/>
             </w:pPr>
             <w:r>
-              <w:lastRenderedPageBreak/>
               <w:t>Options</w:t>
             </w:r>
           </w:p>
@@ -10995,31 +10623,7 @@
               <w:pStyle w:val="Body"/>
             </w:pPr>
             <w:r>
-              <w:t xml:space="preserve">{% if type_of_response == 'modify' and </w:t>
-            </w:r>
-            <w:proofErr w:type="spellStart"/>
-            <w:r>
-              <w:t>type_of_modification.any_true</w:t>
-            </w:r>
-            <w:proofErr w:type="spellEnd"/>
-            <w:r>
-              <w:t xml:space="preserve">('child support', 'custody') and </w:t>
-            </w:r>
-            <w:proofErr w:type="spellStart"/>
-            <w:r>
-              <w:t>type_of_modification.all_false</w:t>
-            </w:r>
-            <w:proofErr w:type="spellEnd"/>
-            <w:r>
-              <w:t xml:space="preserve">('spousal </w:t>
-            </w:r>
-            <w:proofErr w:type="spellStart"/>
-            <w:r>
-              <w:t>support','property</w:t>
-            </w:r>
-            <w:proofErr w:type="spellEnd"/>
-            <w:r>
-              <w:t xml:space="preserve"> or debt', 'other') %}</w:t>
+              <w:t>{% if type_of_response == 'modify' and type_of_modification.any_true('child support', 'custody') and type_of_modification.all_false('spousal support','property or debt', 'other') %}</w:t>
             </w:r>
             <w:r>
               <w:rPr>
@@ -11050,15 +10654,7 @@
               <w:t xml:space="preserve"> </w:t>
             </w:r>
             <w:r>
-              <w:t xml:space="preserve">elif type_of_response == 'modify' and </w:t>
-            </w:r>
-            <w:proofErr w:type="spellStart"/>
-            <w:r>
-              <w:t>type_of_modification.any_true</w:t>
-            </w:r>
-            <w:proofErr w:type="spellEnd"/>
-            <w:r>
-              <w:t>('spousal support', 'property or debt') %}</w:t>
+              <w:t>elif type_of_response == 'modify' and type_of_modification.any_true('spousal support', 'property or debt') %}</w:t>
             </w:r>
             <w:r>
               <w:rPr>
@@ -11080,23 +10676,7 @@
               <w:t>, and you agree, you have options:</w:t>
             </w:r>
             <w:r>
-              <w:t xml:space="preserve">{% elif type_of_response == 'modify' and </w:t>
-            </w:r>
-            <w:proofErr w:type="spellStart"/>
-            <w:r>
-              <w:t>type_of_modification.any_true</w:t>
-            </w:r>
-            <w:proofErr w:type="spellEnd"/>
-            <w:r>
-              <w:t xml:space="preserve">('child support', 'custody') and </w:t>
-            </w:r>
-            <w:proofErr w:type="spellStart"/>
-            <w:r>
-              <w:t>type_of_modification.any_true</w:t>
-            </w:r>
-            <w:proofErr w:type="spellEnd"/>
-            <w:r>
-              <w:t>('spousal support', 'property or debt') %}</w:t>
+              <w:t>{% elif type_of_response == 'modify' and type_of_modification.any_true('child support', 'custody') and type_of_modification.any_true('spousal support', 'property or debt') %}</w:t>
             </w:r>
             <w:r>
               <w:rPr>
@@ -11131,27 +10711,7 @@
               <w:t>, and you agree, you have options</w:t>
             </w:r>
             <w:r>
-              <w:t xml:space="preserve">:{% </w:t>
-            </w:r>
-            <w:proofErr w:type="spellStart"/>
-            <w:r>
-              <w:t>elif</w:t>
-            </w:r>
-            <w:proofErr w:type="spellEnd"/>
-            <w:r>
-              <w:t xml:space="preserve"> middle_of_case == 'no' and type_of_response == 'set aside' and </w:t>
-            </w:r>
-            <w:proofErr w:type="spellStart"/>
-            <w:r>
-              <w:t>respond_to_set_aside</w:t>
-            </w:r>
-            <w:proofErr w:type="spellEnd"/>
-            <w:r>
-              <w:t xml:space="preserve">  </w:t>
-            </w:r>
-            <w:r>
-              <w:lastRenderedPageBreak/>
-              <w:t xml:space="preserve">== 'agree' %}A </w:t>
+              <w:t xml:space="preserve">:{% elif middle_of_case == 'no' and type_of_response == 'set aside' and respond_to_set_aside  == 'agree' %}A </w:t>
             </w:r>
             <w:r>
               <w:rPr>
@@ -11340,7 +10900,11 @@
               <w:pStyle w:val="Body"/>
             </w:pPr>
             <w:r>
-              <w:t>For both options, you must file all documents with the court within 10 days from the day the motion was hand delivered to you, or 13 days from the day it was mailed to you. You can see this date on the postmark of the envelope.</w:t>
+              <w:t xml:space="preserve">For both options, you must file all documents with the court within 10 </w:t>
+            </w:r>
+            <w:r>
+              <w:lastRenderedPageBreak/>
+              <w:t>days from the day the motion was hand delivered to you, or 13 days from the day it was mailed to you. You can see this date on the postmark of the envelope.</w:t>
             </w:r>
           </w:p>
         </w:tc>
@@ -11441,13 +11005,8 @@
             <w:pPr>
               <w:pStyle w:val="Body"/>
             </w:pPr>
-            <w:proofErr w:type="spellStart"/>
-            <w:r>
-              <w:t>respond_in_writing_step</w:t>
-            </w:r>
-            <w:proofErr w:type="spellEnd"/>
-            <w:r>
-              <w:t xml:space="preserve"> in aka2j_motion_response_templates.yml</w:t>
+            <w:r>
+              <w:t>respond_in_writing_step in aka2j_motion_response_templates.yml</w:t>
             </w:r>
           </w:p>
         </w:tc>
@@ -11525,109 +11084,35 @@
               <w:rPr>
                 <w:color w:val="C00000"/>
               </w:rPr>
-              <w:t xml:space="preserve">{% if (type_of_response == 'modify' and </w:t>
-            </w:r>
-            <w:proofErr w:type="spellStart"/>
+              <w:t>{% if (type_of_response == 'modify' and respond_to_modify == 'agree') or (middle_of_case == 'no' and type_of_response == 'set aside' and respond_to_set_aside == 'agree') %}</w:t>
+            </w:r>
+            <w:r>
+              <w:t xml:space="preserve"> agree</w:t>
+            </w:r>
             <w:r>
               <w:rPr>
                 <w:color w:val="C00000"/>
               </w:rPr>
-              <w:t>respond_to_modify</w:t>
-            </w:r>
-            <w:proofErr w:type="spellEnd"/>
+              <w:t>{% elif type_of_respons</w:t>
+            </w:r>
             <w:r>
               <w:rPr>
                 <w:color w:val="C00000"/>
               </w:rPr>
-              <w:t xml:space="preserve"> == 'agree') or </w:t>
+              <w:lastRenderedPageBreak/>
+              <w:t>e == 'modify' and respond_to_modify in('some', 'none') %}</w:t>
+            </w:r>
+            <w:r>
+              <w:t>do not agree with the proposed changes</w:t>
             </w:r>
             <w:r>
               <w:rPr>
                 <w:color w:val="C00000"/>
               </w:rPr>
-              <w:lastRenderedPageBreak/>
-              <w:t xml:space="preserve">(middle_of_case == 'no' and type_of_response == 'set aside' and </w:t>
-            </w:r>
-            <w:proofErr w:type="spellStart"/>
-            <w:r>
-              <w:rPr>
-                <w:color w:val="C00000"/>
-              </w:rPr>
-              <w:t>respond_to_set_aside</w:t>
-            </w:r>
-            <w:proofErr w:type="spellEnd"/>
-            <w:r>
-              <w:rPr>
-                <w:color w:val="C00000"/>
-              </w:rPr>
-              <w:t xml:space="preserve"> == 'agree') %}</w:t>
-            </w:r>
-            <w:r>
-              <w:t xml:space="preserve"> agree</w:t>
-            </w:r>
-            <w:r>
-              <w:rPr>
-                <w:color w:val="C00000"/>
-              </w:rPr>
-              <w:t xml:space="preserve">{% elif type_of_response == 'modify' and </w:t>
-            </w:r>
-            <w:proofErr w:type="spellStart"/>
-            <w:r>
-              <w:rPr>
-                <w:color w:val="C00000"/>
-              </w:rPr>
-              <w:t>respond_to_modify</w:t>
-            </w:r>
-            <w:proofErr w:type="spellEnd"/>
-            <w:r>
-              <w:rPr>
-                <w:color w:val="C00000"/>
-              </w:rPr>
-              <w:t xml:space="preserve"> in('some', 'none') %}</w:t>
-            </w:r>
-            <w:r>
-              <w:t>do not agree with the proposed changes</w:t>
-            </w:r>
-            <w:r>
-              <w:rPr>
-                <w:color w:val="C00000"/>
-              </w:rPr>
-              <w:t xml:space="preserve">{% </w:t>
-            </w:r>
-            <w:proofErr w:type="spellStart"/>
-            <w:r>
-              <w:rPr>
-                <w:color w:val="C00000"/>
-              </w:rPr>
-              <w:t>elif</w:t>
-            </w:r>
-            <w:proofErr w:type="spellEnd"/>
-            <w:r>
-              <w:rPr>
-                <w:color w:val="C00000"/>
-              </w:rPr>
-              <w:t xml:space="preserve"> middle_of_case == 'no' and type_of_response == 'set aside' and </w:t>
-            </w:r>
-            <w:proofErr w:type="spellStart"/>
-            <w:r>
-              <w:rPr>
-                <w:color w:val="C00000"/>
-              </w:rPr>
-              <w:t>respond_to_set_aside</w:t>
-            </w:r>
-            <w:proofErr w:type="spellEnd"/>
-            <w:r>
-              <w:rPr>
-                <w:color w:val="C00000"/>
-              </w:rPr>
-              <w:t xml:space="preserve"> in('some', 'none')%}</w:t>
-            </w:r>
-            <w:r>
-              <w:t xml:space="preserve">do not agree with the </w:t>
-            </w:r>
-            <w:r>
-              <w:lastRenderedPageBreak/>
-              <w:t>Motion to Set Aside Judgment or Order</w:t>
+              <w:t>{% elif middle_of_case == 'no' and type_of_response == 'set aside' and respond_to_set_aside in('some', 'none')%}</w:t>
+            </w:r>
+            <w:r>
+              <w:t>do not agree with the Motion to Set Aside Judgment or Order</w:t>
             </w:r>
             <w:r>
               <w:rPr>
@@ -11659,189 +11144,119 @@
                 <w:color w:val="C00000"/>
               </w:rPr>
               <w:lastRenderedPageBreak/>
-              <w:t xml:space="preserve">{% if (type_of_response == 'modify' and </w:t>
-            </w:r>
-            <w:proofErr w:type="spellStart"/>
+              <w:t>{% if (type_of_response == 'modify' and respond_to_modify == 'agree') or (middle_of_case == 'no' and type_of_response == 'set aside' and respond_to_set_aside == 'agree') %}</w:t>
+            </w:r>
+            <w:r>
+              <w:t>If you agree with everything {{ other_party_in_case }} wrote in their motion, you can state that in your response.</w:t>
+            </w:r>
             <w:r>
               <w:rPr>
                 <w:color w:val="C00000"/>
               </w:rPr>
-              <w:t>respond_to_modify</w:t>
-            </w:r>
-            <w:proofErr w:type="spellEnd"/>
+              <w:t>{% elif type_of_response == 'modify' and respond_to_modify in('some', 'none') %}</w:t>
+            </w:r>
+            <w:r>
+              <w:t>If you think there has not been a change in circumstances, or you do not agree with everything {{ other_party_in_case }} put in their motion, you can respond in writing.</w:t>
+            </w:r>
             <w:r>
               <w:rPr>
                 <w:color w:val="C00000"/>
               </w:rPr>
-              <w:t xml:space="preserve"> == 'agree') or (middle_of_case == 'no' and type_of_response == 'set aside' and </w:t>
-            </w:r>
-            <w:proofErr w:type="spellStart"/>
+              <w:t>{% elif middle_of_case == 'no' and type_of_response == 'set aside' and respond_to_set_aside in('some', 'none') %}</w:t>
+            </w:r>
+            <w:r>
+              <w:t xml:space="preserve">A </w:t>
+            </w:r>
+            <w:r>
+              <w:rPr>
+                <w:b/>
+              </w:rPr>
+              <w:t>Motion to Set Aside Judgment or Order</w:t>
+            </w:r>
+            <w:r>
+              <w:t xml:space="preserve"> asks the trial court to set aside or "undo" a judgment or final order in a case. If granted, the case will move ahead as if the judgment had not been made.</w:t>
+            </w:r>
+          </w:p>
+          <w:p>
+            <w:pPr>
+              <w:pStyle w:val="Body"/>
+            </w:pPr>
+            <w:r>
+              <w:t>If you do not agree with what {{ other_party_in_case }} asked the court to set aside, you can respond in writing.</w:t>
+            </w:r>
             <w:r>
               <w:rPr>
                 <w:color w:val="C00000"/>
               </w:rPr>
-              <w:t>respond_to_set_aside</w:t>
-            </w:r>
-            <w:proofErr w:type="spellEnd"/>
-            <w:r>
-              <w:rPr>
-                <w:color w:val="C00000"/>
-              </w:rPr>
-              <w:t xml:space="preserve"> == 'agree') %}</w:t>
-            </w:r>
-            <w:r>
-              <w:t>If you agree with everything {{ other_party_in_case }} wrote in their motion, you can state that in your response.</w:t>
-            </w:r>
-            <w:r>
-              <w:rPr>
-                <w:color w:val="C00000"/>
-              </w:rPr>
-              <w:t xml:space="preserve">{% elif type_of_response == 'modify' and </w:t>
-            </w:r>
-            <w:proofErr w:type="spellStart"/>
-            <w:r>
-              <w:rPr>
-                <w:color w:val="C00000"/>
-              </w:rPr>
-              <w:t>respond_to_modify</w:t>
-            </w:r>
-            <w:proofErr w:type="spellEnd"/>
-            <w:r>
-              <w:rPr>
-                <w:color w:val="C00000"/>
-              </w:rPr>
-              <w:t xml:space="preserve"> in('some', 'none') %}</w:t>
-            </w:r>
-            <w:r>
-              <w:t>If you think there has not been a change in circumstances, or you do not agree with everything {{ other_party_in_case }} put in their motion, you can respond in writing.</w:t>
-            </w:r>
-            <w:r>
-              <w:rPr>
-                <w:color w:val="C00000"/>
-              </w:rPr>
-              <w:t xml:space="preserve">{% </w:t>
-            </w:r>
-            <w:proofErr w:type="spellStart"/>
-            <w:r>
-              <w:rPr>
-                <w:color w:val="C00000"/>
-              </w:rPr>
-              <w:t>elif</w:t>
-            </w:r>
-            <w:proofErr w:type="spellEnd"/>
-            <w:r>
-              <w:rPr>
-                <w:color w:val="C00000"/>
-              </w:rPr>
-              <w:t xml:space="preserve"> middle_of_case == 'no' and type_of_response == 'set aside' and </w:t>
-            </w:r>
-            <w:proofErr w:type="spellStart"/>
-            <w:r>
-              <w:rPr>
-                <w:color w:val="C00000"/>
-              </w:rPr>
-              <w:t>respond_to_set_aside</w:t>
-            </w:r>
-            <w:proofErr w:type="spellEnd"/>
-            <w:r>
-              <w:rPr>
-                <w:color w:val="C00000"/>
-              </w:rPr>
-              <w:t xml:space="preserve"> in('some', 'none') %}</w:t>
-            </w:r>
-            <w:r>
-              <w:t xml:space="preserve">A </w:t>
-            </w:r>
-            <w:r>
-              <w:rPr>
-                <w:b/>
-              </w:rPr>
-              <w:t>Motion to Set Aside Judgment or Order</w:t>
-            </w:r>
-            <w:r>
-              <w:t xml:space="preserve"> asks the trial court to set aside or "undo" a judgment or final order in a case. If granted, the case will move ahead as if the judgment had not been made.</w:t>
-            </w:r>
-          </w:p>
-          <w:p>
-            <w:pPr>
-              <w:pStyle w:val="Body"/>
-            </w:pPr>
-            <w:r>
-              <w:t xml:space="preserve">If you do not agree with what {{ other_party_in_case }} asked the court </w:t>
+              <w:t>{% endif %}</w:t>
+            </w:r>
+          </w:p>
+          <w:p>
+            <w:pPr>
+              <w:pStyle w:val="Body"/>
+            </w:pPr>
+            <w:r>
+              <w:t>In your response, explain why you disagree.</w:t>
+            </w:r>
+          </w:p>
+          <w:p>
+            <w:pPr>
+              <w:pStyle w:val="Body"/>
+            </w:pPr>
+            <w:r>
+              <w:t>If the {{ other_party_in_case }} served you:</w:t>
+            </w:r>
+          </w:p>
+          <w:p>
+            <w:pPr>
+              <w:pStyle w:val="Body"/>
+            </w:pPr>
+            <w:r>
+              <w:t xml:space="preserve">by hand-delivery, email, or TrueFile, you have 10 days to respond to the court in writing.  </w:t>
+            </w:r>
+          </w:p>
+          <w:p>
+            <w:pPr>
+              <w:pStyle w:val="Body"/>
+            </w:pPr>
+            <w:r>
+              <w:t>by mail, you have 13 days.</w:t>
+            </w:r>
+          </w:p>
+          <w:p>
+            <w:pPr>
+              <w:pStyle w:val="Body"/>
+            </w:pPr>
+            <w:r>
+              <w:t xml:space="preserve">Counting: </w:t>
+            </w:r>
+          </w:p>
+          <w:p>
+            <w:pPr>
+              <w:pStyle w:val="Body"/>
+            </w:pPr>
+            <w:r>
+              <w:t>Day 1 is the day after you delivered, emailed, or mailed it.  You can see the date something was mailed on the postmark of the envelope.</w:t>
+            </w:r>
+          </w:p>
+          <w:p>
+            <w:pPr>
+              <w:pStyle w:val="Body"/>
+            </w:pPr>
+            <w:r>
+              <w:t xml:space="preserve">Count weekends and holidays.  </w:t>
+            </w:r>
+          </w:p>
+          <w:p>
+            <w:pPr>
+              <w:pStyle w:val="Body"/>
+            </w:pPr>
+            <w:r>
+              <w:t xml:space="preserve">If the due date is a weekend or holiday your response  is due the next </w:t>
             </w:r>
             <w:r>
               <w:lastRenderedPageBreak/>
-              <w:t>to set aside, you can respond in writing.</w:t>
-            </w:r>
-            <w:r>
-              <w:rPr>
-                <w:color w:val="C00000"/>
-              </w:rPr>
-              <w:t>{% endif %}</w:t>
-            </w:r>
-          </w:p>
-          <w:p>
-            <w:pPr>
-              <w:pStyle w:val="Body"/>
-            </w:pPr>
-            <w:r>
-              <w:t>In your response, explain why you disagree.</w:t>
-            </w:r>
-          </w:p>
-          <w:p>
-            <w:pPr>
-              <w:pStyle w:val="Body"/>
-            </w:pPr>
-            <w:r>
-              <w:t>If the {{ other_party_in_case }} served you:</w:t>
-            </w:r>
-          </w:p>
-          <w:p>
-            <w:pPr>
-              <w:pStyle w:val="Body"/>
-            </w:pPr>
-            <w:r>
-              <w:t xml:space="preserve">by hand-delivery, email, or TrueFile, you have 10 days to respond to the court in writing.  </w:t>
-            </w:r>
-          </w:p>
-          <w:p>
-            <w:pPr>
-              <w:pStyle w:val="Body"/>
-            </w:pPr>
-            <w:r>
-              <w:t>by mail, you have 13 days.</w:t>
-            </w:r>
-          </w:p>
-          <w:p>
-            <w:pPr>
-              <w:pStyle w:val="Body"/>
-            </w:pPr>
-            <w:r>
-              <w:t xml:space="preserve">Counting: </w:t>
-            </w:r>
-          </w:p>
-          <w:p>
-            <w:pPr>
-              <w:pStyle w:val="Body"/>
-            </w:pPr>
-            <w:r>
-              <w:t>Day 1 is the day after you delivered, emailed, or mailed it.  You can see the date something was mailed on the postmark of the envelope.</w:t>
-            </w:r>
-          </w:p>
-          <w:p>
-            <w:pPr>
-              <w:pStyle w:val="Body"/>
-            </w:pPr>
-            <w:r>
-              <w:t xml:space="preserve">Count weekends and holidays.  </w:t>
-            </w:r>
-          </w:p>
-          <w:p>
-            <w:pPr>
-              <w:pStyle w:val="Body"/>
-            </w:pPr>
-            <w:r>
-              <w:t xml:space="preserve">If the due date is a weekend or holiday your response  is due the next day the court is open.  For example, if it is due on a Saturday, and the court is open Monday, your response is due Monday.  </w:t>
+              <w:t xml:space="preserve">day the court is open.  For example, if it is due on a Saturday, and the court is open Monday, your response is due Monday.  </w:t>
             </w:r>
           </w:p>
           <w:p>
@@ -11862,21 +11277,7 @@
               <w:rPr>
                 <w:color w:val="00B050"/>
               </w:rPr>
-              <w:t xml:space="preserve">{% if type_of_response == 'modify' and </w:t>
-            </w:r>
-            <w:proofErr w:type="spellStart"/>
-            <w:r>
-              <w:rPr>
-                <w:color w:val="00B050"/>
-              </w:rPr>
-              <w:t>type_of_modification.any_true</w:t>
-            </w:r>
-            <w:proofErr w:type="spellEnd"/>
-            <w:r>
-              <w:rPr>
-                <w:color w:val="00B050"/>
-              </w:rPr>
-              <w:t>('custody', 'child support') %}</w:t>
+              <w:t>{% if type_of_response == 'modify' and type_of_modification.any_true('custody', 'child support') %}</w:t>
             </w:r>
             <w:r>
               <w:rPr>
@@ -12219,7 +11620,6 @@
               <w:rPr>
                 <w:color w:val="000000"/>
               </w:rPr>
-              <w:lastRenderedPageBreak/>
               <w:t>public.courts.alaska.gov/web/forms/docs/dr-308.pdf</w:t>
             </w:r>
             <w:r>
@@ -12301,15 +11701,7 @@
             </w:hyperlink>
             <w:r>
               <w:br/>
-              <w:t>youtube.com/</w:t>
-            </w:r>
-            <w:proofErr w:type="spellStart"/>
-            <w:r>
-              <w:t>watch?v</w:t>
-            </w:r>
-            <w:proofErr w:type="spellEnd"/>
-            <w:r>
-              <w:t>=E7cYJyRciBg</w:t>
+              <w:t>youtube.com/watch?v=E7cYJyRciBg</w:t>
             </w:r>
           </w:p>
         </w:tc>
@@ -12389,7 +11781,14 @@
               <w:rPr>
                 <w:shd w:val="clear" w:color="auto" w:fill="FFFFFF"/>
               </w:rPr>
-              <w:t xml:space="preserve">{%tr if user_need == 'change foreign custody order' </w:t>
+              <w:t xml:space="preserve">{%tr if user_need == 'change foreign custody </w:t>
+            </w:r>
+            <w:r>
+              <w:rPr>
+                <w:shd w:val="clear" w:color="auto" w:fill="FFFFFF"/>
+              </w:rPr>
+              <w:lastRenderedPageBreak/>
+              <w:t xml:space="preserve">order' </w:t>
             </w:r>
             <w:r>
               <w:rPr>
@@ -12415,16 +11814,8 @@
               <w:rPr>
                 <w:shd w:val="clear" w:color="auto" w:fill="FFFFFF"/>
               </w:rPr>
-              <w:t xml:space="preserve">user_need in('change custody order', 'change divorce order') and not </w:t>
-            </w:r>
-            <w:proofErr w:type="spellStart"/>
-            <w:r>
-              <w:rPr>
-                <w:shd w:val="clear" w:color="auto" w:fill="FFFFFF"/>
-              </w:rPr>
-              <w:t>unknown_final_date.all_true</w:t>
-            </w:r>
-            <w:proofErr w:type="spellEnd"/>
+              <w:t>user_need in('change custody order', 'change divorce order') and not unknown_final_date.all_true</w:t>
+            </w:r>
             <w:r>
               <w:rPr>
                 <w:color w:val="00B0F0"/>
@@ -12511,13 +11902,9 @@
             <w:pPr>
               <w:pStyle w:val="Body"/>
             </w:pPr>
-            <w:proofErr w:type="spellStart"/>
-            <w:r>
-              <w:t>respond_to_reconsider_step</w:t>
-            </w:r>
-            <w:proofErr w:type="spellEnd"/>
-            <w:r>
-              <w:t xml:space="preserve"> in aka2j_motion_response_templates.yml</w:t>
+            <w:r>
+              <w:lastRenderedPageBreak/>
+              <w:t>respond_to_reconsider_step in aka2j_motion_response_templates.yml</w:t>
             </w:r>
           </w:p>
         </w:tc>
@@ -12565,11 +11952,7 @@
             </w:r>
             <w:bookmarkEnd w:id="10"/>
             <w:r>
-              <w:t xml:space="preserve">: {% if type_of_response == 'reconsider' %}If the judge asks you to respond to the Motion to </w:t>
-            </w:r>
-            <w:r>
-              <w:lastRenderedPageBreak/>
-              <w:t>Reconsider, fill out the Certificate of Service{% else %}Fill out the Certificate of Service{% endif %}</w:t>
+              <w:t>: {% if type_of_response == 'reconsider' %}If the judge asks you to respond to the Motion to Reconsider, fill out the Certificate of Service{% else %}Fill out the Certificate of Service{% endif %}</w:t>
             </w:r>
           </w:p>
         </w:tc>
@@ -12593,7 +11976,6 @@
               <w:ind w:left="43"/>
             </w:pPr>
             <w:r>
-              <w:lastRenderedPageBreak/>
               <w:t>You must give {{ other_party_in_case }} 1 copy of everything you file with the court. This is called “service.”</w:t>
             </w:r>
           </w:p>
@@ -12671,7 +12053,6 @@
               <w:ind w:left="765"/>
             </w:pPr>
             <w:r>
-              <w:lastRenderedPageBreak/>
               <w:t>If you use the court’s</w:t>
             </w:r>
             <w:hyperlink r:id="rId118">
@@ -12687,21 +12068,7 @@
                 <w:rPr>
                   <w:rStyle w:val="Hyperlink"/>
                 </w:rPr>
-                <w:t xml:space="preserve">TrueFiling </w:t>
-              </w:r>
-              <w:proofErr w:type="spellStart"/>
-              <w:r>
-                <w:rPr>
-                  <w:rStyle w:val="Hyperlink"/>
-                </w:rPr>
-                <w:t>eFiling</w:t>
-              </w:r>
-              <w:proofErr w:type="spellEnd"/>
-              <w:r>
-                <w:rPr>
-                  <w:rStyle w:val="Hyperlink"/>
-                </w:rPr>
-                <w:t xml:space="preserve"> system</w:t>
+                <w:t>TrueFiling eFiling system</w:t>
               </w:r>
             </w:hyperlink>
             <w:r>
@@ -12779,6 +12146,7 @@
               </w:numPr>
             </w:pPr>
             <w:r>
+              <w:lastRenderedPageBreak/>
               <w:t>If you do not fill out the Certificate of Service:</w:t>
             </w:r>
             <w:r>
@@ -12856,59 +12224,19 @@
               <w:pStyle w:val="Body"/>
             </w:pPr>
             <w:r>
-              <w:t xml:space="preserve">{% for </w:t>
-            </w:r>
-            <w:proofErr w:type="spellStart"/>
-            <w:r>
-              <w:t>image_data</w:t>
-            </w:r>
-            <w:proofErr w:type="spellEnd"/>
-            <w:r>
-              <w:t xml:space="preserve"> in </w:t>
-            </w:r>
-            <w:proofErr w:type="spellStart"/>
-            <w:r>
-              <w:t>images_list</w:t>
-            </w:r>
-            <w:proofErr w:type="spellEnd"/>
-            <w:r>
-              <w:t xml:space="preserve"> %}</w:t>
+              <w:t>{% for image_data in images_list %}</w:t>
             </w:r>
             <w:r>
               <w:br/>
-              <w:t xml:space="preserve">{{  </w:t>
-            </w:r>
-            <w:proofErr w:type="spellStart"/>
-            <w:r>
-              <w:t>image_data</w:t>
-            </w:r>
-            <w:proofErr w:type="spellEnd"/>
-            <w:r>
-              <w:t>['text'] }}</w:t>
+              <w:t>{{  image_data['text'] }}</w:t>
             </w:r>
             <w:r>
               <w:br/>
-              <w:t xml:space="preserve">{{ </w:t>
-            </w:r>
-            <w:proofErr w:type="spellStart"/>
-            <w:r>
-              <w:t>image_data</w:t>
-            </w:r>
-            <w:proofErr w:type="spellEnd"/>
-            <w:r>
-              <w:t>['image'].show(width='5in%') }}</w:t>
+              <w:t>{{ image_data['image'].show(width='5in%') }}</w:t>
             </w:r>
             <w:r>
               <w:br/>
-              <w:t xml:space="preserve">{% </w:t>
-            </w:r>
-            <w:proofErr w:type="spellStart"/>
-            <w:r>
-              <w:t>endfor</w:t>
-            </w:r>
-            <w:proofErr w:type="spellEnd"/>
-            <w:r>
-              <w:t xml:space="preserve"> %}</w:t>
+              <w:t>{% endfor %}</w:t>
             </w:r>
           </w:p>
           <w:p>
@@ -12929,32 +12257,13 @@
                 <w:rPr>
                   <w:rStyle w:val="Hyperlink"/>
                 </w:rPr>
-                <w:t xml:space="preserve">TrueFiling </w:t>
-              </w:r>
-              <w:proofErr w:type="spellStart"/>
-              <w:r>
-                <w:rPr>
-                  <w:rStyle w:val="Hyperlink"/>
-                </w:rPr>
-                <w:t>eFiling</w:t>
-              </w:r>
-              <w:proofErr w:type="spellEnd"/>
-              <w:r>
-                <w:rPr>
-                  <w:rStyle w:val="Hyperlink"/>
-                </w:rPr>
-                <w:t xml:space="preserve"> system</w:t>
+                <w:t>TrueFiling eFiling system</w:t>
               </w:r>
             </w:hyperlink>
             <w:r>
               <w:br/>
-              <w:t>courts.alaska.gov/</w:t>
-            </w:r>
-            <w:proofErr w:type="spellStart"/>
-            <w:r>
-              <w:t>efile</w:t>
-            </w:r>
-            <w:proofErr w:type="spellEnd"/>
+              <w:t>courts.alaska.gov/efile</w:t>
+            </w:r>
           </w:p>
         </w:tc>
       </w:tr>
@@ -13033,22 +12342,7 @@
               <w:rPr>
                 <w:shd w:val="clear" w:color="auto" w:fill="FFFFFF"/>
               </w:rPr>
-              <w:lastRenderedPageBreak/>
-              <w:t xml:space="preserve">{%tr if user_need == 'change foreign custody order' or (user_need in('change custody order', 'change divorce order') and not </w:t>
-            </w:r>
-            <w:proofErr w:type="spellStart"/>
-            <w:r>
-              <w:rPr>
-                <w:shd w:val="clear" w:color="auto" w:fill="FFFFFF"/>
-              </w:rPr>
-              <w:t>unknown_final_date.all_true</w:t>
-            </w:r>
-            <w:proofErr w:type="spellEnd"/>
-            <w:r>
-              <w:rPr>
-                <w:shd w:val="clear" w:color="auto" w:fill="FFFFFF"/>
-              </w:rPr>
-              <w:t>('appeal', exclusive = True))%}</w:t>
+              <w:t>{%tr if user_need == 'change foreign custody order' or (user_need in('change custody order', 'change divorce order') and not unknown_final_date.all_true('appeal', exclusive = True))%}</w:t>
             </w:r>
           </w:p>
         </w:tc>
@@ -13072,13 +12366,8 @@
                 <w:shd w:val="clear" w:color="auto" w:fill="FFFFFF"/>
               </w:rPr>
             </w:pPr>
-            <w:proofErr w:type="spellStart"/>
-            <w:r>
-              <w:t>file_motion_step</w:t>
-            </w:r>
-            <w:proofErr w:type="spellEnd"/>
-            <w:r>
-              <w:t xml:space="preserve"> aka2j_templates.yml</w:t>
+            <w:r>
+              <w:t>file_motion_step aka2j_templates.yml</w:t>
             </w:r>
           </w:p>
         </w:tc>
@@ -13150,32 +12439,14 @@
               <w:rPr>
                 <w:color w:val="FF0000"/>
               </w:rPr>
-              <w:t>{% if defined('</w:t>
-            </w:r>
-            <w:proofErr w:type="spellStart"/>
-            <w:r>
-              <w:rPr>
-                <w:color w:val="FF0000"/>
-              </w:rPr>
-              <w:t>file_step_heading</w:t>
-            </w:r>
-            <w:proofErr w:type="spellEnd"/>
-            <w:r>
-              <w:rPr>
-                <w:color w:val="FF0000"/>
-              </w:rPr>
-              <w:t>') %}</w:t>
+              <w:t>{% if defined('file_step_heading') %}</w:t>
             </w:r>
             <w:r>
               <w:t xml:space="preserve">{{ </w:t>
             </w:r>
-            <w:proofErr w:type="spellStart"/>
-            <w:r>
-              <w:t>file_step_heading</w:t>
-            </w:r>
-            <w:proofErr w:type="spellEnd"/>
-            <w:r>
-              <w:t xml:space="preserve"> }}</w:t>
+            <w:r>
+              <w:lastRenderedPageBreak/>
+              <w:t>file_step_heading }}</w:t>
             </w:r>
             <w:r>
               <w:rPr>
@@ -13220,49 +12491,14 @@
               <w:pStyle w:val="Body"/>
             </w:pPr>
             <w:r>
-              <w:t xml:space="preserve">{{ </w:t>
-            </w:r>
-            <w:proofErr w:type="spellStart"/>
-            <w:r>
-              <w:t>file_motion_to_enforce</w:t>
-            </w:r>
-            <w:proofErr w:type="spellEnd"/>
-            <w:r>
-              <w:t xml:space="preserve"> }}</w:t>
+              <w:lastRenderedPageBreak/>
+              <w:t>{{ file_motion_to_enforce }}</w:t>
             </w:r>
             <w:r>
               <w:rPr>
                 <w:color w:val="00B0F0"/>
               </w:rPr>
-              <w:t>{% if defined('</w:t>
-            </w:r>
-            <w:proofErr w:type="spellStart"/>
-            <w:r>
-              <w:rPr>
-                <w:color w:val="00B0F0"/>
-              </w:rPr>
-              <w:t>file_step_heading</w:t>
-            </w:r>
-            <w:proofErr w:type="spellEnd"/>
-            <w:r>
-              <w:rPr>
-                <w:color w:val="00B0F0"/>
-              </w:rPr>
-              <w:t xml:space="preserve">') and </w:t>
-            </w:r>
-            <w:proofErr w:type="spellStart"/>
-            <w:r>
-              <w:rPr>
-                <w:color w:val="00B0F0"/>
-              </w:rPr>
-              <w:t>file_step_heading</w:t>
-            </w:r>
-            <w:proofErr w:type="spellEnd"/>
-            <w:r>
-              <w:rPr>
-                <w:color w:val="00B0F0"/>
-              </w:rPr>
-              <w:t xml:space="preserve"> == 'File your Motion to Set Aside' %}</w:t>
+              <w:t>{% if defined('file_step_heading') and file_step_heading == 'File your Motion to Set Aside' %}</w:t>
             </w:r>
             <w:r>
               <w:t xml:space="preserve">If you decide that a </w:t>
@@ -13307,6 +12543,7 @@
               <w:spacing w:before="0"/>
             </w:pPr>
             <w:r>
+              <w:lastRenderedPageBreak/>
               <w:t>Give the original version of your documents to the court. This is called “filing” your documents. You can:</w:t>
             </w:r>
           </w:p>
@@ -13346,15 +12583,7 @@
               <w:spacing w:before="0" w:after="0"/>
             </w:pPr>
             <w:r>
-              <w:t xml:space="preserve">Use the court’s TrueFiling </w:t>
-            </w:r>
-            <w:proofErr w:type="spellStart"/>
-            <w:r>
-              <w:t>eFiling</w:t>
-            </w:r>
-            <w:proofErr w:type="spellEnd"/>
-            <w:r>
-              <w:t xml:space="preserve"> system to send the documents to the court electronically, if your local court uses TrueFiling. </w:t>
+              <w:t xml:space="preserve">Use the court’s TrueFiling eFiling system to send the documents to the court electronically, if your local court uses TrueFiling. </w:t>
             </w:r>
             <w:hyperlink r:id="rId121" w:anchor="current-courts" w:history="1">
               <w:r>
@@ -13483,7 +12712,6 @@
               </w:numPr>
             </w:pPr>
             <w:r>
-              <w:lastRenderedPageBreak/>
               <w:t xml:space="preserve">Use </w:t>
             </w:r>
             <w:r>
@@ -13530,171 +12758,73 @@
               <w:rPr>
                 <w:color w:val="FFC000"/>
               </w:rPr>
-              <w:t>(</w:t>
-            </w:r>
-            <w:proofErr w:type="spellStart"/>
+              <w:t xml:space="preserve">(type_of_final_order.any_true('custody','child support') and why_change in ('review', 'schedule', 'income') and </w:t>
+            </w:r>
+            <w:r>
+              <w:rPr>
+                <w:color w:val="92D050"/>
+              </w:rPr>
+              <w:t>(type_of_final_order.all_false('spousal support', 'property or debt')</w:t>
+            </w:r>
             <w:r>
               <w:rPr>
                 <w:color w:val="FFC000"/>
               </w:rPr>
-              <w:t>type_of_final_order.any_true</w:t>
-            </w:r>
-            <w:proofErr w:type="spellEnd"/>
+              <w:t xml:space="preserve"> </w:t>
+            </w:r>
+            <w:r>
+              <w:rPr>
+                <w:color w:val="92D050"/>
+              </w:rPr>
+              <w:t>or</w:t>
+            </w:r>
             <w:r>
               <w:rPr>
                 <w:color w:val="FFC000"/>
               </w:rPr>
-              <w:t>('</w:t>
-            </w:r>
-            <w:proofErr w:type="spellStart"/>
+              <w:t xml:space="preserve"> </w:t>
+            </w:r>
+            <w:r>
+              <w:rPr>
+                <w:color w:val="00B050"/>
+              </w:rPr>
+              <w:t>(type_of_final_order.any_true('spousal support', 'property or debt') and why_change_divorce_order != 'changed circumstances')</w:t>
+            </w:r>
+            <w:r>
+              <w:rPr>
+                <w:color w:val="92D050"/>
+              </w:rPr>
+              <w:t>)</w:t>
+            </w:r>
             <w:r>
               <w:rPr>
                 <w:color w:val="FFC000"/>
               </w:rPr>
-              <w:t>custody','child</w:t>
-            </w:r>
-            <w:proofErr w:type="spellEnd"/>
+              <w:t xml:space="preserve">) </w:t>
+            </w:r>
+            <w:r>
+              <w:rPr>
+                <w:color w:val="7030A0"/>
+              </w:rPr>
+              <w:t>or</w:t>
+            </w:r>
             <w:r>
               <w:rPr>
                 <w:color w:val="FFC000"/>
               </w:rPr>
-              <w:t xml:space="preserve"> support') and why_change in ('review', 'schedule', 'income') and </w:t>
+              <w:t xml:space="preserve"> (type_of_final_order.any_true('spousal support', 'property or debt ') and why_change_divorce_order == 'changed circumstances' and </w:t>
             </w:r>
             <w:r>
               <w:rPr>
                 <w:color w:val="92D050"/>
               </w:rPr>
-              <w:t>(</w:t>
-            </w:r>
-            <w:proofErr w:type="spellStart"/>
-            <w:r>
-              <w:rPr>
-                <w:color w:val="92D050"/>
-              </w:rPr>
-              <w:t>type_of_final_order.all_false</w:t>
-            </w:r>
-            <w:proofErr w:type="spellEnd"/>
-            <w:r>
-              <w:rPr>
-                <w:color w:val="92D050"/>
-              </w:rPr>
-              <w:t>('spousal support', 'property or debt')</w:t>
-            </w:r>
-            <w:r>
-              <w:rPr>
-                <w:color w:val="FFC000"/>
-              </w:rPr>
-              <w:t xml:space="preserve"> </w:t>
-            </w:r>
-            <w:r>
-              <w:rPr>
-                <w:color w:val="92D050"/>
-              </w:rPr>
-              <w:t>or</w:t>
-            </w:r>
-            <w:r>
-              <w:rPr>
-                <w:color w:val="FFC000"/>
-              </w:rPr>
-              <w:t xml:space="preserve"> </w:t>
+              <w:t xml:space="preserve">(type_of_final_order.all_false('child support', 'custody') or </w:t>
             </w:r>
             <w:r>
               <w:rPr>
                 <w:color w:val="00B050"/>
               </w:rPr>
-              <w:t>(</w:t>
-            </w:r>
-            <w:proofErr w:type="spellStart"/>
-            <w:r>
-              <w:rPr>
-                <w:color w:val="00B050"/>
-              </w:rPr>
-              <w:t>type_of_final_order.any_true</w:t>
-            </w:r>
-            <w:proofErr w:type="spellEnd"/>
-            <w:r>
-              <w:rPr>
-                <w:color w:val="00B050"/>
-              </w:rPr>
-              <w:t>('spousal support', 'property or debt') and why_change_divorce_order != 'changed circumstances')</w:t>
-            </w:r>
-            <w:r>
-              <w:rPr>
-                <w:color w:val="92D050"/>
-              </w:rPr>
-              <w:t>)</w:t>
-            </w:r>
-            <w:r>
-              <w:rPr>
-                <w:color w:val="FFC000"/>
-              </w:rPr>
-              <w:t xml:space="preserve">) </w:t>
-            </w:r>
-            <w:r>
-              <w:rPr>
-                <w:color w:val="7030A0"/>
-              </w:rPr>
-              <w:t>or</w:t>
-            </w:r>
-            <w:r>
-              <w:rPr>
-                <w:color w:val="FFC000"/>
-              </w:rPr>
-              <w:t xml:space="preserve"> (</w:t>
-            </w:r>
-            <w:proofErr w:type="spellStart"/>
-            <w:r>
-              <w:rPr>
-                <w:color w:val="FFC000"/>
-              </w:rPr>
-              <w:t>type_of_final_order.any_true</w:t>
-            </w:r>
-            <w:proofErr w:type="spellEnd"/>
-            <w:r>
-              <w:rPr>
-                <w:color w:val="FFC000"/>
-              </w:rPr>
-              <w:t xml:space="preserve">('spousal support', 'property or debt ') and why_change_divorce_order == 'changed circumstances' and </w:t>
-            </w:r>
-            <w:r>
-              <w:rPr>
-                <w:color w:val="92D050"/>
-              </w:rPr>
-              <w:t>(</w:t>
-            </w:r>
-            <w:proofErr w:type="spellStart"/>
-            <w:r>
-              <w:rPr>
-                <w:color w:val="92D050"/>
-              </w:rPr>
-              <w:t>type_of_final_order.all_false</w:t>
-            </w:r>
-            <w:proofErr w:type="spellEnd"/>
-            <w:r>
-              <w:rPr>
-                <w:color w:val="92D050"/>
-              </w:rPr>
-              <w:t xml:space="preserve">('child support', 'custody') or </w:t>
-            </w:r>
-            <w:r>
-              <w:rPr>
-                <w:color w:val="00B050"/>
-              </w:rPr>
-              <w:t>(</w:t>
-            </w:r>
-            <w:proofErr w:type="spellStart"/>
-            <w:r>
-              <w:rPr>
-                <w:color w:val="00B050"/>
-              </w:rPr>
-              <w:t>type_of_final_order.any_true</w:t>
-            </w:r>
-            <w:proofErr w:type="spellEnd"/>
-            <w:r>
-              <w:rPr>
-                <w:color w:val="00B050"/>
-              </w:rPr>
-              <w:t>('child support', 'custody') and not why_change in ('review', 'schedule', 'income'))</w:t>
+              <w:t>(type_of_final_order.any_true('child support', 'custody') and not why_change in ('review', 'schedule', 'income'))</w:t>
             </w:r>
             <w:r>
               <w:rPr>
@@ -13743,6 +12873,9 @@
             </w:r>
             <w:r>
               <w:br/>
+            </w:r>
+            <w:r>
+              <w:lastRenderedPageBreak/>
               <w:t>If you cannot afford the filing fee, you can ask the court to waive it:</w:t>
             </w:r>
           </w:p>
@@ -14017,9 +13150,6 @@
             </w:r>
             <w:r>
               <w:br/>
-            </w:r>
-            <w:r>
-              <w:lastRenderedPageBreak/>
               <w:t>public.courts.alaska.gov/web/forms/docs/tf-920.pdf</w:t>
             </w:r>
           </w:p>
@@ -14043,21 +13173,8 @@
             </w:hyperlink>
             <w:r>
               <w:br/>
-              <w:t>courts.alaska.gov/</w:t>
-            </w:r>
-            <w:proofErr w:type="spellStart"/>
-            <w:r>
-              <w:t>efile</w:t>
-            </w:r>
-            <w:proofErr w:type="spellEnd"/>
-            <w:r>
-              <w:t>/</w:t>
-            </w:r>
-            <w:proofErr w:type="spellStart"/>
-            <w:r>
-              <w:t>index.htm#current-courts</w:t>
-            </w:r>
-            <w:proofErr w:type="spellEnd"/>
+              <w:t>courts.alaska.gov/efile/index.htm#current-courts</w:t>
+            </w:r>
           </w:p>
           <w:p>
             <w:pPr>
@@ -14073,15 +13190,7 @@
             </w:hyperlink>
             <w:r>
               <w:br/>
-              <w:t>courts.alaska.gov/</w:t>
-            </w:r>
-            <w:proofErr w:type="spellStart"/>
-            <w:r>
-              <w:t>courtdir</w:t>
-            </w:r>
-            <w:proofErr w:type="spellEnd"/>
-            <w:r>
-              <w:t>/efiling.htm</w:t>
+              <w:t>courts.alaska.gov/courtdir/efiling.htm</w:t>
             </w:r>
           </w:p>
         </w:tc>
@@ -14192,19 +13301,11 @@
                 <w:rFonts w:eastAsia="Calibri"/>
               </w:rPr>
             </w:pPr>
-            <w:proofErr w:type="spellStart"/>
             <w:r>
               <w:rPr>
                 <w:rFonts w:eastAsia="Calibri"/>
               </w:rPr>
-              <w:t>file_response_step</w:t>
-            </w:r>
-            <w:proofErr w:type="spellEnd"/>
-            <w:r>
-              <w:rPr>
-                <w:rFonts w:eastAsia="Calibri"/>
-              </w:rPr>
-              <w:t xml:space="preserve"> in aka2j_motion_response_templates.yml</w:t>
+              <w:t>file_response_step in aka2j_motion_response_templates.yml</w:t>
             </w:r>
           </w:p>
         </w:tc>
@@ -14229,6 +13330,7 @@
               <w:outlineLvl w:val="1"/>
             </w:pPr>
             <w:r>
+              <w:lastRenderedPageBreak/>
               <w:t xml:space="preserve">Step </w:t>
             </w:r>
             <w:bookmarkStart w:id="12" w:name="FileResponse"/>
@@ -14455,7 +13557,6 @@
               <w:ind w:left="403"/>
             </w:pPr>
             <w:r>
-              <w:lastRenderedPageBreak/>
               <w:t xml:space="preserve">Read Step </w:t>
             </w:r>
             <w:r>
@@ -14511,34 +13612,13 @@
                 <w:rPr>
                   <w:rStyle w:val="Hyperlink"/>
                 </w:rPr>
-                <w:t xml:space="preserve">See if your court uses </w:t>
+                <w:t>See if your court uses Truefiling</w:t>
               </w:r>
-              <w:proofErr w:type="spellStart"/>
-              <w:r>
-                <w:rPr>
-                  <w:rStyle w:val="Hyperlink"/>
-                </w:rPr>
-                <w:t>Truefiling</w:t>
-              </w:r>
-              <w:proofErr w:type="spellEnd"/>
             </w:hyperlink>
             <w:r>
               <w:br/>
-              <w:t>courts.alaska.gov/</w:t>
-            </w:r>
-            <w:proofErr w:type="spellStart"/>
-            <w:r>
-              <w:t>efile</w:t>
-            </w:r>
-            <w:proofErr w:type="spellEnd"/>
-            <w:r>
-              <w:t>/</w:t>
-            </w:r>
-            <w:proofErr w:type="spellStart"/>
-            <w:r>
-              <w:t>index.htm#current-courts</w:t>
-            </w:r>
-            <w:proofErr w:type="spellEnd"/>
+              <w:t>courts.alaska.gov/efile/index.htm#current-courts</w:t>
+            </w:r>
           </w:p>
           <w:p>
             <w:pPr>
@@ -14554,15 +13634,7 @@
             </w:hyperlink>
             <w:r>
               <w:br/>
-              <w:t>courts.alaska.gov/</w:t>
-            </w:r>
-            <w:proofErr w:type="spellStart"/>
-            <w:r>
-              <w:t>courtdir</w:t>
-            </w:r>
-            <w:proofErr w:type="spellEnd"/>
-            <w:r>
-              <w:t>/efiling.htm</w:t>
+              <w:t>courts.alaska.gov/courtdir/efiling.htm</w:t>
             </w:r>
           </w:p>
         </w:tc>
@@ -14586,7 +13658,6 @@
               <w:pStyle w:val="Body"/>
             </w:pPr>
             <w:r>
-              <w:lastRenderedPageBreak/>
               <w:t>{%tr endif %}</w:t>
             </w:r>
           </w:p>
@@ -14646,16 +13717,15 @@
               <w:rPr>
                 <w:shd w:val="clear" w:color="auto" w:fill="FFFFFF"/>
               </w:rPr>
-              <w:t xml:space="preserve">user_need in('change custody order', 'change divorce order') and not </w:t>
-            </w:r>
-            <w:proofErr w:type="spellStart"/>
-            <w:r>
-              <w:rPr>
-                <w:shd w:val="clear" w:color="auto" w:fill="FFFFFF"/>
-              </w:rPr>
-              <w:t>unknown_final_date.all_true</w:t>
-            </w:r>
-            <w:proofErr w:type="spellEnd"/>
+              <w:t xml:space="preserve">user_need in('change custody order', 'change divorce </w:t>
+            </w:r>
+            <w:r>
+              <w:rPr>
+                <w:shd w:val="clear" w:color="auto" w:fill="FFFFFF"/>
+              </w:rPr>
+              <w:lastRenderedPageBreak/>
+              <w:t>order') and not unknown_final_date.all_true</w:t>
+            </w:r>
             <w:r>
               <w:rPr>
                 <w:color w:val="00B0F0"/>
@@ -14708,13 +13778,9 @@
             <w:pPr>
               <w:pStyle w:val="Body"/>
             </w:pPr>
-            <w:proofErr w:type="spellStart"/>
-            <w:r>
-              <w:t>serve_motion_response_step</w:t>
-            </w:r>
-            <w:proofErr w:type="spellEnd"/>
-            <w:r>
-              <w:t xml:space="preserve"> in aka2j_motion_response_templates.yml</w:t>
+            <w:r>
+              <w:lastRenderedPageBreak/>
+              <w:t>serve_motion_response_step in aka2j_motion_response_templates.yml</w:t>
             </w:r>
           </w:p>
         </w:tc>
@@ -14768,11 +13834,7 @@
               <w:t>{% if type_of_response == 'reconsider' %}</w:t>
             </w:r>
             <w:r>
-              <w:t xml:space="preserve">If the judge asks you to respond to the Motion to Reconsider, serve </w:t>
-            </w:r>
-            <w:r>
-              <w:lastRenderedPageBreak/>
-              <w:t>{{other_party_in_case }}</w:t>
+              <w:t>If the judge asks you to respond to the Motion to Reconsider, serve {{other_party_in_case }}</w:t>
             </w:r>
             <w:r>
               <w:rPr>
@@ -14816,7 +13878,6 @@
               <w:ind w:left="510"/>
             </w:pPr>
             <w:r>
-              <w:lastRenderedPageBreak/>
               <w:t xml:space="preserve">Give a copy of all your documents to {{ other_party_in_case }} the way you wrote on the </w:t>
             </w:r>
             <w:r>
@@ -15006,7 +14067,11 @@
               <w:t>(</w:t>
             </w:r>
             <w:r>
-              <w:t>interim_order_date_within_10_days or final_order_date_within_10_days</w:t>
+              <w:t>interim_order_date_with</w:t>
+            </w:r>
+            <w:r>
+              <w:lastRenderedPageBreak/>
+              <w:t>in_10_days or final_order_date_within_10_days</w:t>
             </w:r>
             <w:r>
               <w:rPr>
@@ -15038,13 +14103,8 @@
               </w:rPr>
               <w:t>(</w:t>
             </w:r>
-            <w:proofErr w:type="spellStart"/>
-            <w:r>
-              <w:t>unknown_final_date.true_values</w:t>
-            </w:r>
-            <w:proofErr w:type="spellEnd"/>
-            <w:r>
-              <w:t>()</w:t>
+            <w:r>
+              <w:t>unknown_final_date.true_values()</w:t>
             </w:r>
             <w:r>
               <w:rPr>
@@ -15053,15 +14113,7 @@
               <w:t>)</w:t>
             </w:r>
             <w:r>
-              <w:t>|</w:t>
-            </w:r>
-            <w:proofErr w:type="spellStart"/>
-            <w:r>
-              <w:t>list|length</w:t>
-            </w:r>
-            <w:proofErr w:type="spellEnd"/>
-            <w:r>
-              <w:t xml:space="preserve"> == 1 </w:t>
+              <w:t xml:space="preserve">|list|length == 1 </w:t>
             </w:r>
             <w:r>
               <w:rPr>
@@ -15105,13 +14157,8 @@
               </w:rPr>
               <w:t>(</w:t>
             </w:r>
-            <w:proofErr w:type="spellStart"/>
-            <w:r>
-              <w:t>unknown_final_date.true_values</w:t>
-            </w:r>
-            <w:proofErr w:type="spellEnd"/>
-            <w:r>
-              <w:t>()</w:t>
+            <w:r>
+              <w:t>unknown_final_date.true_values()</w:t>
             </w:r>
             <w:r>
               <w:rPr>
@@ -15120,15 +14167,7 @@
               <w:t>)</w:t>
             </w:r>
             <w:r>
-              <w:t>|</w:t>
-            </w:r>
-            <w:proofErr w:type="spellStart"/>
-            <w:r>
-              <w:t>list|length</w:t>
-            </w:r>
-            <w:proofErr w:type="spellEnd"/>
-            <w:r>
-              <w:t xml:space="preserve"> &gt;= 2 </w:t>
+              <w:t xml:space="preserve">|list|length &gt;= 2 </w:t>
             </w:r>
             <w:r>
               <w:rPr>
@@ -15174,6 +14213,7 @@
               <w:pStyle w:val="Body"/>
             </w:pPr>
             <w:r>
+              <w:lastRenderedPageBreak/>
               <w:t>expect_after_motion_step in aka2j_mod_cust_div_templates.yml</w:t>
             </w:r>
           </w:p>
@@ -15244,19 +14284,7 @@
               <w:t xml:space="preserve">: </w:t>
             </w:r>
             <w:r>
-              <w:t xml:space="preserve">What to expect after you </w:t>
-            </w:r>
-            <w:r>
-              <w:lastRenderedPageBreak/>
-              <w:t xml:space="preserve">file a {{ </w:t>
-            </w:r>
-            <w:proofErr w:type="spellStart"/>
-            <w:r>
-              <w:t>motion_type</w:t>
-            </w:r>
-            <w:proofErr w:type="spellEnd"/>
-            <w:r>
-              <w:t xml:space="preserve"> }}</w:t>
+              <w:t>What to expect after you file a {{ motion_type }}</w:t>
             </w:r>
           </w:p>
         </w:tc>
@@ -15280,7 +14308,6 @@
               <w:outlineLvl w:val="2"/>
             </w:pPr>
             <w:r>
-              <w:lastRenderedPageBreak/>
               <w:t>{{capitalize( other_party_in_case) }} may file a response or "opposition"</w:t>
             </w:r>
           </w:p>
@@ -15289,7 +14316,6 @@
               <w:pStyle w:val="Body"/>
             </w:pPr>
             <w:r>
-              <w:lastRenderedPageBreak/>
               <w:t>If you serve {{ other_party_in_case }}:</w:t>
             </w:r>
           </w:p>
@@ -15396,49 +14422,7 @@
               <w:rPr>
                 <w:color w:val="FF0000"/>
               </w:rPr>
-              <w:t xml:space="preserve">{% if </w:t>
-            </w:r>
-            <w:proofErr w:type="spellStart"/>
-            <w:r>
-              <w:rPr>
-                <w:color w:val="FF0000"/>
-              </w:rPr>
-              <w:t>existing_case</w:t>
-            </w:r>
-            <w:proofErr w:type="spellEnd"/>
-            <w:r>
-              <w:rPr>
-                <w:color w:val="FF0000"/>
-              </w:rPr>
-              <w:t xml:space="preserve"> == "none" or (</w:t>
-            </w:r>
-            <w:proofErr w:type="spellStart"/>
-            <w:r>
-              <w:rPr>
-                <w:color w:val="FF0000"/>
-              </w:rPr>
-              <w:t>existing_case</w:t>
-            </w:r>
-            <w:proofErr w:type="spellEnd"/>
-            <w:r>
-              <w:rPr>
-                <w:color w:val="FF0000"/>
-              </w:rPr>
-              <w:t xml:space="preserve"> == "unknown" and </w:t>
-            </w:r>
-            <w:proofErr w:type="spellStart"/>
-            <w:r>
-              <w:rPr>
-                <w:color w:val="FF0000"/>
-              </w:rPr>
-              <w:t>after_courtview</w:t>
-            </w:r>
-            <w:proofErr w:type="spellEnd"/>
-            <w:r>
-              <w:rPr>
-                <w:color w:val="FF0000"/>
-              </w:rPr>
-              <w:t xml:space="preserve"> == "none") %}</w:t>
+              <w:t>{% if existing_case == "none" or (existing_case == "unknown" and after_courtview == "none") %}</w:t>
             </w:r>
             <w:r>
               <w:t xml:space="preserve">If you file your </w:t>
@@ -15451,7 +14435,11 @@
               <w:t>Motion for Interim Child Support</w:t>
             </w:r>
             <w:r>
-              <w:t xml:space="preserve"> with your complaint, the other parent does not have to respond until they respond to the complaint. This is usually 20 days after they get the complaint.</w:t>
+              <w:t xml:space="preserve"> with your complaint, the other parent does not have to respond until they respond to the complaint. This is usually 20 days </w:t>
+            </w:r>
+            <w:r>
+              <w:lastRenderedPageBreak/>
+              <w:t>after they get the complaint.</w:t>
             </w:r>
           </w:p>
           <w:p>
@@ -15762,59 +14750,19 @@
               <w:pStyle w:val="Body"/>
             </w:pPr>
             <w:r>
-              <w:t xml:space="preserve">{% for </w:t>
-            </w:r>
-            <w:proofErr w:type="spellStart"/>
-            <w:r>
-              <w:t>image_data</w:t>
-            </w:r>
-            <w:proofErr w:type="spellEnd"/>
-            <w:r>
-              <w:t xml:space="preserve"> in </w:t>
-            </w:r>
-            <w:proofErr w:type="spellStart"/>
-            <w:r>
-              <w:t>reply_certificate_list</w:t>
-            </w:r>
-            <w:proofErr w:type="spellEnd"/>
-            <w:r>
-              <w:t xml:space="preserve"> %}</w:t>
+              <w:t>{% for image_data in reply_certificate_list %}</w:t>
             </w:r>
             <w:r>
               <w:br/>
-              <w:t xml:space="preserve">{{ </w:t>
-            </w:r>
-            <w:proofErr w:type="spellStart"/>
-            <w:r>
-              <w:t>image_data</w:t>
-            </w:r>
-            <w:proofErr w:type="spellEnd"/>
-            <w:r>
-              <w:t>['text'] }}</w:t>
+              <w:t>{{ image_data['text'] }}</w:t>
             </w:r>
             <w:r>
               <w:br/>
-              <w:t xml:space="preserve">{{ </w:t>
-            </w:r>
-            <w:proofErr w:type="spellStart"/>
-            <w:r>
-              <w:t>image_data</w:t>
-            </w:r>
-            <w:proofErr w:type="spellEnd"/>
-            <w:r>
-              <w:t>['image'].show(width='5in%') }}</w:t>
+              <w:t>{{ image_data['image'].show(width='5in%') }}</w:t>
             </w:r>
             <w:r>
               <w:br/>
-              <w:t xml:space="preserve">{% </w:t>
-            </w:r>
-            <w:proofErr w:type="spellStart"/>
-            <w:r>
-              <w:t>endfor</w:t>
-            </w:r>
-            <w:proofErr w:type="spellEnd"/>
-            <w:r>
-              <w:t xml:space="preserve"> %}</w:t>
+              <w:t>{% endfor %}</w:t>
             </w:r>
           </w:p>
           <w:p>
@@ -15862,23 +14810,7 @@
                 <w:b/>
                 <w:bCs/>
               </w:rPr>
-              <w:t xml:space="preserve">{{ </w:t>
-            </w:r>
-            <w:proofErr w:type="spellStart"/>
-            <w:r>
-              <w:rPr>
-                <w:b/>
-                <w:bCs/>
-              </w:rPr>
-              <w:t>motion_type</w:t>
-            </w:r>
-            <w:proofErr w:type="spellEnd"/>
-            <w:r>
-              <w:rPr>
-                <w:b/>
-                <w:bCs/>
-              </w:rPr>
-              <w:t xml:space="preserve"> }}. </w:t>
+              <w:t xml:space="preserve">{{ motion_type }}. </w:t>
             </w:r>
             <w:r>
               <w:t>If they do, you will get a copy of the new order.</w:t>
@@ -15909,23 +14841,7 @@
                 <w:b/>
                 <w:bCs/>
               </w:rPr>
-              <w:t xml:space="preserve">{{ </w:t>
-            </w:r>
-            <w:proofErr w:type="spellStart"/>
-            <w:r>
-              <w:rPr>
-                <w:b/>
-                <w:bCs/>
-              </w:rPr>
-              <w:t>motion_type</w:t>
-            </w:r>
-            <w:proofErr w:type="spellEnd"/>
-            <w:r>
-              <w:rPr>
-                <w:b/>
-                <w:bCs/>
-              </w:rPr>
-              <w:t xml:space="preserve"> }}. </w:t>
+              <w:t xml:space="preserve">{{ motion_type }}. </w:t>
             </w:r>
             <w:r>
               <w:t>If they do, you will get an order denying the motion.</w:t>
@@ -15934,7 +14850,14 @@
               <w:rPr>
                 <w:color w:val="FF0000"/>
               </w:rPr>
-              <w:t>{% if user_need in('change foreign order', 'change foreign custody order') or (user_need in('change AK order', 'change custody order', 'change divorce order') and middle_of_case == 'no') %}</w:t>
+              <w:t xml:space="preserve">{% if user_need in('change </w:t>
+            </w:r>
+            <w:r>
+              <w:rPr>
+                <w:color w:val="FF0000"/>
+              </w:rPr>
+              <w:lastRenderedPageBreak/>
+              <w:t>foreign order', 'change foreign custody order') or (user_need in('change AK order', 'change custody order', 'change divorce order') and middle_of_case == 'no') %}</w:t>
             </w:r>
           </w:p>
           <w:p>
@@ -15963,23 +14886,7 @@
                 <w:b/>
                 <w:bCs/>
               </w:rPr>
-              <w:t xml:space="preserve">{{ </w:t>
-            </w:r>
-            <w:proofErr w:type="spellStart"/>
-            <w:r>
-              <w:rPr>
-                <w:b/>
-                <w:bCs/>
-              </w:rPr>
-              <w:t>motion_type</w:t>
-            </w:r>
-            <w:proofErr w:type="spellEnd"/>
-            <w:r>
-              <w:rPr>
-                <w:b/>
-                <w:bCs/>
-              </w:rPr>
-              <w:t xml:space="preserve"> }}</w:t>
+              <w:t>{{ motion_type }}</w:t>
             </w:r>
             <w:r>
               <w:t xml:space="preserve"> if you believe the judge made a legal mistake. Learn more about </w:t>
@@ -16030,21 +14937,8 @@
               </w:r>
             </w:hyperlink>
             <w:r>
-              <w:t>youtube.com/</w:t>
-            </w:r>
-            <w:proofErr w:type="spellStart"/>
-            <w:r>
-              <w:t>watch?v</w:t>
-            </w:r>
-            <w:proofErr w:type="spellEnd"/>
-            <w:r>
-              <w:t>=</w:t>
-            </w:r>
-            <w:proofErr w:type="spellStart"/>
-            <w:r>
-              <w:t>egoBeRFB_Uw</w:t>
-            </w:r>
-            <w:proofErr w:type="spellEnd"/>
+              <w:t>youtube.com/watch?v=egoBeRFB_Uw</w:t>
+            </w:r>
           </w:p>
           <w:p>
             <w:pPr>
@@ -16077,13 +14971,8 @@
             </w:hyperlink>
             <w:r>
               <w:br/>
-              <w:t>courts.alaska.gov/shc/family/</w:t>
-            </w:r>
-            <w:proofErr w:type="spellStart"/>
-            <w:r>
-              <w:t>motions.htm#reply</w:t>
-            </w:r>
-            <w:proofErr w:type="spellEnd"/>
+              <w:t>courts.alaska.gov/shc/family/motions.htm#reply</w:t>
+            </w:r>
           </w:p>
           <w:p>
             <w:pPr>
@@ -16128,14 +15017,7 @@
               <w:rPr>
                 <w:color w:val="FF0000"/>
               </w:rPr>
-              <w:t xml:space="preserve">{% if user_need =='change foreign custody order' or (user_need in('change custody order', 'change divorce order') and middle_of_case </w:t>
-            </w:r>
-            <w:r>
-              <w:rPr>
-                <w:color w:val="FF0000"/>
-              </w:rPr>
-              <w:lastRenderedPageBreak/>
-              <w:t>== 'no') %}</w:t>
+              <w:t>{% if user_need =='change foreign custody order' or (user_need in('change custody order', 'change divorce order') and middle_of_case == 'no') %}</w:t>
             </w:r>
             <w:hyperlink r:id="rId149">
               <w:r>
@@ -16263,19 +15145,11 @@
                 <w:rFonts w:eastAsia="Calibri"/>
               </w:rPr>
             </w:pPr>
-            <w:proofErr w:type="spellStart"/>
             <w:r>
               <w:rPr>
                 <w:rFonts w:eastAsia="Calibri"/>
               </w:rPr>
-              <w:t>expect_reconsider_step</w:t>
-            </w:r>
-            <w:proofErr w:type="spellEnd"/>
-            <w:r>
-              <w:rPr>
-                <w:rFonts w:eastAsia="Calibri"/>
-              </w:rPr>
-              <w:t xml:space="preserve"> in aka2j_mod_cust_div_templates.yml</w:t>
+              <w:t>expect_reconsider_step in aka2j_mod_cust_div_templates.yml</w:t>
             </w:r>
           </w:p>
         </w:tc>
@@ -16333,7 +15207,11 @@
               <w:fldChar w:fldCharType="end"/>
             </w:r>
             <w:r>
-              <w:t xml:space="preserve">: What to expect after you file a </w:t>
+              <w:t xml:space="preserve">: What to expect after you </w:t>
+            </w:r>
+            <w:r>
+              <w:lastRenderedPageBreak/>
+              <w:t xml:space="preserve">file a </w:t>
             </w:r>
             <w:r>
               <w:rPr>
@@ -16361,6 +15239,7 @@
               <w:pStyle w:val="Body"/>
             </w:pPr>
             <w:r>
+              <w:lastRenderedPageBreak/>
               <w:t xml:space="preserve"> A </w:t>
             </w:r>
             <w:r>
@@ -16378,7 +15257,11 @@
               <w:pStyle w:val="Body"/>
             </w:pPr>
             <w:r>
-              <w:t>{{ capitalize(other_party_in_case) }} does not have to respond unless the judge sends a notice and asks them to respond in writing.</w:t>
+              <w:t xml:space="preserve">{{ capitalize(other_party_in_case) }} does not have to respond unless </w:t>
+            </w:r>
+            <w:r>
+              <w:lastRenderedPageBreak/>
+              <w:t>the judge sends a notice and asks them to respond in writing.</w:t>
             </w:r>
           </w:p>
           <w:p>
@@ -16508,6 +15391,7 @@
               <w:rPr>
                 <w:shd w:val="clear" w:color="auto" w:fill="FFFFFF"/>
               </w:rPr>
+              <w:lastRenderedPageBreak/>
               <w:t>{%tr endif %}</w:t>
             </w:r>
           </w:p>
@@ -16560,7 +15444,6 @@
               <w:rPr>
                 <w:shd w:val="clear" w:color="auto" w:fill="FFFFFF"/>
               </w:rPr>
-              <w:lastRenderedPageBreak/>
               <w:t xml:space="preserve">{%tr if </w:t>
             </w:r>
             <w:r>
@@ -16592,21 +15475,12 @@
                 <w:rFonts w:eastAsia="Calibri"/>
               </w:rPr>
             </w:pPr>
-            <w:proofErr w:type="spellStart"/>
             <w:r>
               <w:rPr>
                 <w:rFonts w:eastAsia="Calibri"/>
                 <w:shd w:val="clear" w:color="auto" w:fill="FFFFFF"/>
               </w:rPr>
-              <w:t>expect_after_response_step</w:t>
-            </w:r>
-            <w:proofErr w:type="spellEnd"/>
-            <w:r>
-              <w:rPr>
-                <w:rFonts w:eastAsia="Calibri"/>
-                <w:shd w:val="clear" w:color="auto" w:fill="FFFFFF"/>
-              </w:rPr>
-              <w:t xml:space="preserve"> in aka2j_motion_response_templates.yml</w:t>
+              <w:t>expect_after_response_step in aka2j_motion_response_templates.yml</w:t>
             </w:r>
           </w:p>
         </w:tc>
@@ -16685,21 +15559,7 @@
               <w:rPr>
                 <w:shd w:val="clear" w:color="auto" w:fill="FFFFFF"/>
               </w:rPr>
-              <w:t xml:space="preserve">What to expect after you respond to the {{ </w:t>
-            </w:r>
-            <w:proofErr w:type="spellStart"/>
-            <w:r>
-              <w:rPr>
-                <w:shd w:val="clear" w:color="auto" w:fill="FFFFFF"/>
-              </w:rPr>
-              <w:t>motion_type</w:t>
-            </w:r>
-            <w:proofErr w:type="spellEnd"/>
-            <w:r>
-              <w:rPr>
-                <w:shd w:val="clear" w:color="auto" w:fill="FFFFFF"/>
-              </w:rPr>
-              <w:t xml:space="preserve"> }}</w:t>
+              <w:t>What to expect after you respond to the {{ motion_type }}</w:t>
             </w:r>
           </w:p>
         </w:tc>
@@ -16813,6 +15673,7 @@
               <w:ind w:left="405"/>
             </w:pPr>
             <w:r>
+              <w:lastRenderedPageBreak/>
               <w:t xml:space="preserve">The judge may grant the </w:t>
             </w:r>
             <w:r>
@@ -16820,23 +15681,7 @@
                 <w:b/>
                 <w:bCs/>
               </w:rPr>
-              <w:t xml:space="preserve">{{ </w:t>
-            </w:r>
-            <w:proofErr w:type="spellStart"/>
-            <w:r>
-              <w:rPr>
-                <w:b/>
-                <w:bCs/>
-              </w:rPr>
-              <w:t>motion_type</w:t>
-            </w:r>
-            <w:proofErr w:type="spellEnd"/>
-            <w:r>
-              <w:rPr>
-                <w:b/>
-                <w:bCs/>
-              </w:rPr>
-              <w:t xml:space="preserve"> }}</w:t>
+              <w:t>{{ motion_type }}</w:t>
             </w:r>
             <w:r>
               <w:t>. If they do, you will get a copy of the new order.</w:t>
@@ -16888,23 +15733,7 @@
                 <w:b/>
                 <w:bCs/>
               </w:rPr>
-              <w:t xml:space="preserve">{{ </w:t>
-            </w:r>
-            <w:proofErr w:type="spellStart"/>
-            <w:r>
-              <w:rPr>
-                <w:b/>
-                <w:bCs/>
-              </w:rPr>
-              <w:t>motion_type</w:t>
-            </w:r>
-            <w:proofErr w:type="spellEnd"/>
-            <w:r>
-              <w:rPr>
-                <w:b/>
-                <w:bCs/>
-              </w:rPr>
-              <w:t xml:space="preserve"> }}</w:t>
+              <w:t>{{ motion_type }}</w:t>
             </w:r>
             <w:r>
               <w:t xml:space="preserve"> if you believe the judge made a legal mistake. Learn more about </w:t>
@@ -16981,6 +15810,7 @@
               <w:rPr>
                 <w:shd w:val="clear" w:color="auto" w:fill="FFFFFF"/>
               </w:rPr>
+              <w:lastRenderedPageBreak/>
               <w:t>{%tr endif %}</w:t>
             </w:r>
           </w:p>
@@ -17030,27 +15860,7 @@
               </w:rPr>
             </w:pPr>
             <w:r>
-              <w:t xml:space="preserve">{%tr if </w:t>
-            </w:r>
-            <w:proofErr w:type="spellStart"/>
-            <w:r>
-              <w:t>respond_to_modify</w:t>
-            </w:r>
-            <w:proofErr w:type="spellEnd"/>
-            <w:r>
-              <w:t xml:space="preserve"> == </w:t>
-            </w:r>
-            <w:r>
-              <w:lastRenderedPageBreak/>
-              <w:t xml:space="preserve">'agree' or </w:t>
-            </w:r>
-            <w:proofErr w:type="spellStart"/>
-            <w:r>
-              <w:t>respond_to_set_aside</w:t>
-            </w:r>
-            <w:proofErr w:type="spellEnd"/>
-            <w:r>
-              <w:t xml:space="preserve"> == 'agree' %}</w:t>
+              <w:t>{%tr if respond_to_modify == 'agree' or respond_to_set_aside == 'agree' %}</w:t>
             </w:r>
           </w:p>
         </w:tc>
@@ -17074,34 +15884,11 @@
                 <w:rFonts w:eastAsia="Calibri"/>
               </w:rPr>
             </w:pPr>
-            <w:proofErr w:type="spellStart"/>
             <w:r>
               <w:rPr>
                 <w:rFonts w:eastAsia="Calibri"/>
               </w:rPr>
-              <w:lastRenderedPageBreak/>
-              <w:t>contact_other_party_stepand</w:t>
-            </w:r>
-            <w:proofErr w:type="spellEnd"/>
-            <w:r>
-              <w:rPr>
-                <w:rFonts w:eastAsia="Calibri"/>
-              </w:rPr>
-              <w:t xml:space="preserve"> </w:t>
-            </w:r>
-            <w:proofErr w:type="spellStart"/>
-            <w:r>
-              <w:rPr>
-                <w:rFonts w:eastAsia="Calibri"/>
-              </w:rPr>
-              <w:t>file_agreement_step</w:t>
-            </w:r>
-            <w:proofErr w:type="spellEnd"/>
-            <w:r>
-              <w:rPr>
-                <w:rFonts w:eastAsia="Calibri"/>
-              </w:rPr>
-              <w:t xml:space="preserve"> in aka2j_motion_response_templates.yml</w:t>
+              <w:t>contact_other_party_stepand file_agreement_step in aka2j_motion_response_templates.yml</w:t>
             </w:r>
           </w:p>
         </w:tc>
@@ -17226,21 +16013,7 @@
               <w:rPr>
                 <w:color w:val="00B050"/>
               </w:rPr>
-              <w:t xml:space="preserve">{% if type_of_response == 'modify' and </w:t>
-            </w:r>
-            <w:proofErr w:type="spellStart"/>
-            <w:r>
-              <w:rPr>
-                <w:color w:val="00B050"/>
-              </w:rPr>
-              <w:t>type_of_modification.any_true</w:t>
-            </w:r>
-            <w:proofErr w:type="spellEnd"/>
-            <w:r>
-              <w:rPr>
-                <w:color w:val="00B050"/>
-              </w:rPr>
-              <w:t>('custody', 'child support')%}</w:t>
+              <w:t>{% if type_of_response == 'modify' and type_of_modification.any_true('custody', 'child support')%}</w:t>
             </w:r>
           </w:p>
           <w:p>
@@ -17365,6 +16138,7 @@
                 <w:b/>
                 <w:color w:val="000000"/>
               </w:rPr>
+              <w:lastRenderedPageBreak/>
               <w:t>Agreement &amp; Order for Custody and Visitation, SHC-1126</w:t>
             </w:r>
             <w:r>
@@ -17514,21 +16288,7 @@
               <w:rPr>
                 <w:color w:val="00B050"/>
               </w:rPr>
-              <w:t xml:space="preserve">{% endif %}{% if  type_of_response == 'modify' and </w:t>
-            </w:r>
-            <w:proofErr w:type="spellStart"/>
-            <w:r>
-              <w:rPr>
-                <w:color w:val="00B050"/>
-              </w:rPr>
-              <w:t>type_of_modification.any_true</w:t>
-            </w:r>
-            <w:proofErr w:type="spellEnd"/>
-            <w:r>
-              <w:rPr>
-                <w:color w:val="00B050"/>
-              </w:rPr>
-              <w:t>('custody', 'child support') %}</w:t>
+              <w:t>{% endif %}{% if  type_of_response == 'modify' and type_of_modification.any_true('custody', 'child support') %}</w:t>
             </w:r>
           </w:p>
           <w:p>
@@ -17766,7 +16526,6 @@
               <w:rPr>
                 <w:iCs/>
               </w:rPr>
-              <w:lastRenderedPageBreak/>
               <w:t>Each parent files their own</w:t>
             </w:r>
           </w:p>
@@ -17901,21 +16660,7 @@
               <w:rPr>
                 <w:color w:val="00B050"/>
               </w:rPr>
-              <w:t xml:space="preserve">{% endif %}{% if </w:t>
-            </w:r>
-            <w:proofErr w:type="spellStart"/>
-            <w:r>
-              <w:rPr>
-                <w:color w:val="00B050"/>
-              </w:rPr>
-              <w:t>type_of_modification.any_true</w:t>
-            </w:r>
-            <w:proofErr w:type="spellEnd"/>
-            <w:r>
-              <w:rPr>
-                <w:color w:val="00B050"/>
-              </w:rPr>
-              <w:t>('spousal support', 'property or debt', 'other') or (middle_of_case == 'no' and  type_of_response =='set aside') %}</w:t>
+              <w:t>{% endif %}{% if type_of_modification.any_true('spousal support', 'property or debt', 'other') or (middle_of_case == 'no' and  type_of_response =='set aside') %}</w:t>
             </w:r>
           </w:p>
           <w:p>
@@ -18004,6 +16749,7 @@
               <w:br/>
             </w:r>
             <w:r>
+              <w:lastRenderedPageBreak/>
               <w:t>courts.alaska.gov/shc/family/docs/shc-1063n.pdf</w:t>
             </w:r>
             <w:r>
@@ -18214,14 +16960,7 @@
               <w:rPr>
                 <w:shd w:val="clear" w:color="auto" w:fill="FFFFFF"/>
               </w:rPr>
-              <w:t xml:space="preserve">: File </w:t>
-            </w:r>
-            <w:r>
-              <w:rPr>
-                <w:shd w:val="clear" w:color="auto" w:fill="FFFFFF"/>
-              </w:rPr>
-              <w:lastRenderedPageBreak/>
-              <w:t>your agreement with the court within 10 or 13 days</w:t>
+              <w:t>: File your agreement with the court within 10 or 13 days</w:t>
             </w:r>
           </w:p>
         </w:tc>
@@ -18244,12 +16983,7 @@
               <w:spacing w:before="240"/>
             </w:pPr>
             <w:r>
-              <w:lastRenderedPageBreak/>
-              <w:t xml:space="preserve">You have 13 days to file your agreement if the motion was mailed to </w:t>
-            </w:r>
-            <w:r>
-              <w:lastRenderedPageBreak/>
-              <w:t>you, 10 days if you were served another way.</w:t>
+              <w:t>You have 13 days to file your agreement if the motion was mailed to you, 10 days if you were served another way.</w:t>
             </w:r>
           </w:p>
           <w:p>
@@ -18328,7 +17062,6 @@
               <w:rPr>
                 <w:shd w:val="clear" w:color="auto" w:fill="FFFFFF"/>
               </w:rPr>
-              <w:lastRenderedPageBreak/>
               <w:t>{%tr endif %}</w:t>
             </w:r>
           </w:p>
@@ -18381,35 +17114,14 @@
               <w:rPr>
                 <w:shd w:val="clear" w:color="auto" w:fill="FFFFFF"/>
               </w:rPr>
-              <w:t xml:space="preserve">{%tr if </w:t>
-            </w:r>
-            <w:proofErr w:type="spellStart"/>
-            <w:r>
-              <w:rPr>
-                <w:shd w:val="clear" w:color="auto" w:fill="FFFFFF"/>
-              </w:rPr>
-              <w:t>respond_to_appeal</w:t>
-            </w:r>
-            <w:proofErr w:type="spellEnd"/>
-            <w:r>
-              <w:rPr>
-                <w:shd w:val="clear" w:color="auto" w:fill="FFFFFF"/>
-              </w:rPr>
-              <w:t xml:space="preserve"> in ('</w:t>
-            </w:r>
-            <w:proofErr w:type="spellStart"/>
-            <w:r>
-              <w:rPr>
-                <w:shd w:val="clear" w:color="auto" w:fill="FFFFFF"/>
-              </w:rPr>
-              <w:t>agree','some</w:t>
-            </w:r>
-            <w:proofErr w:type="spellEnd"/>
-            <w:r>
-              <w:rPr>
-                <w:shd w:val="clear" w:color="auto" w:fill="FFFFFF"/>
-              </w:rPr>
-              <w:t>', 'none') %}</w:t>
+              <w:t xml:space="preserve">{%tr if respond_to_appeal in ('agree','some', 'none') </w:t>
+            </w:r>
+            <w:r>
+              <w:rPr>
+                <w:shd w:val="clear" w:color="auto" w:fill="FFFFFF"/>
+              </w:rPr>
+              <w:lastRenderedPageBreak/>
+              <w:t>%}</w:t>
             </w:r>
           </w:p>
         </w:tc>
@@ -18433,19 +17145,12 @@
                 <w:rFonts w:eastAsia="Calibri"/>
               </w:rPr>
             </w:pPr>
-            <w:proofErr w:type="spellStart"/>
             <w:r>
               <w:rPr>
                 <w:rFonts w:eastAsia="Calibri"/>
               </w:rPr>
-              <w:t>appeal_response_step</w:t>
-            </w:r>
-            <w:proofErr w:type="spellEnd"/>
-            <w:r>
-              <w:rPr>
-                <w:rFonts w:eastAsia="Calibri"/>
-              </w:rPr>
-              <w:t xml:space="preserve"> in aka2j_motion_response_templates.yml</w:t>
+              <w:lastRenderedPageBreak/>
+              <w:t>appeal_response_step in aka2j_motion_response_templates.yml</w:t>
             </w:r>
           </w:p>
         </w:tc>
@@ -18522,49 +17227,26 @@
                 <w:color w:val="00B0F0"/>
                 <w:shd w:val="clear" w:color="auto" w:fill="FFFFFF"/>
               </w:rPr>
-              <w:t xml:space="preserve">{% if </w:t>
-            </w:r>
-            <w:proofErr w:type="spellStart"/>
+              <w:t>{% if respond_to_appeal == 'agree' %}</w:t>
+            </w:r>
+            <w:r>
+              <w:rPr>
+                <w:shd w:val="clear" w:color="auto" w:fill="FFFFFF"/>
+              </w:rPr>
+              <w:t>Let {{ other_party_in_case }} know you agree with the Appeal and decide if you want to respond in writing</w:t>
+            </w:r>
             <w:r>
               <w:rPr>
                 <w:color w:val="00B0F0"/>
                 <w:shd w:val="clear" w:color="auto" w:fill="FFFFFF"/>
               </w:rPr>
-              <w:t>respond_to_appeal</w:t>
-            </w:r>
-            <w:proofErr w:type="spellEnd"/>
-            <w:r>
-              <w:rPr>
-                <w:color w:val="00B0F0"/>
-                <w:shd w:val="clear" w:color="auto" w:fill="FFFFFF"/>
-              </w:rPr>
-              <w:t xml:space="preserve"> == 'agree' %}</w:t>
-            </w:r>
-            <w:r>
-              <w:rPr>
-                <w:shd w:val="clear" w:color="auto" w:fill="FFFFFF"/>
-              </w:rPr>
-              <w:t>Let {{ other_party_in_case }} know you agree with the Appeal and decide if you want to respond in writing</w:t>
-            </w:r>
-            <w:r>
-              <w:rPr>
-                <w:color w:val="00B0F0"/>
-                <w:shd w:val="clear" w:color="auto" w:fill="FFFFFF"/>
-              </w:rPr>
               <w:t>{% else %}</w:t>
             </w:r>
             <w:r>
               <w:rPr>
                 <w:shd w:val="clear" w:color="auto" w:fill="FFFFFF"/>
               </w:rPr>
-              <w:t xml:space="preserve">Respond in writing to the </w:t>
-            </w:r>
-            <w:r>
-              <w:rPr>
-                <w:shd w:val="clear" w:color="auto" w:fill="FFFFFF"/>
-              </w:rPr>
-              <w:lastRenderedPageBreak/>
-              <w:t>Appeal</w:t>
+              <w:t>Respond in writing to the Appeal</w:t>
             </w:r>
             <w:r>
               <w:rPr>
@@ -18594,7 +17276,6 @@
               <w:spacing w:before="240"/>
             </w:pPr>
             <w:r>
-              <w:lastRenderedPageBreak/>
               <w:t xml:space="preserve">An appeal is the way to ask the Alaska Supreme Court to review the trial judge’s decision in your case. It is not a new trial or a chance to give a judge new evidence or information. In an appeal, you argue that the trial judge made a legal mistake. The civil appeals process is complicated, long and expensive. The process can take more than 2 years. </w:t>
             </w:r>
             <w:hyperlink r:id="rId173" w:anchor="1" w:history="1">
@@ -18686,21 +17367,7 @@
               <w:rPr>
                 <w:color w:val="FF0000"/>
               </w:rPr>
-              <w:t xml:space="preserve">{% if </w:t>
-            </w:r>
-            <w:proofErr w:type="spellStart"/>
-            <w:r>
-              <w:rPr>
-                <w:color w:val="FF0000"/>
-              </w:rPr>
-              <w:t>respond_to_appeal</w:t>
-            </w:r>
-            <w:proofErr w:type="spellEnd"/>
-            <w:r>
-              <w:rPr>
-                <w:color w:val="FF0000"/>
-              </w:rPr>
-              <w:t xml:space="preserve"> == 'agree' %}</w:t>
+              <w:t>{% if respond_to_appeal == 'agree' %}</w:t>
             </w:r>
           </w:p>
           <w:p>
@@ -18756,7 +17423,6 @@
               <w:pStyle w:val="Body"/>
             </w:pPr>
             <w:r>
-              <w:lastRenderedPageBreak/>
               <w:t xml:space="preserve">If you agree with what </w:t>
             </w:r>
             <w:r>
@@ -18937,6 +17603,7 @@
               <w:pStyle w:val="Body"/>
             </w:pPr>
             <w:r>
+              <w:lastRenderedPageBreak/>
               <w:t xml:space="preserve">You can review a </w:t>
             </w:r>
             <w:hyperlink r:id="rId179">
@@ -19152,13 +17819,8 @@
             </w:hyperlink>
             <w:r>
               <w:br/>
-              <w:t>courts.alaska.gov/shc/appeals/</w:t>
-            </w:r>
-            <w:proofErr w:type="spellStart"/>
-            <w:r>
-              <w:t>appealsglossary.htm#supremecourt</w:t>
-            </w:r>
-            <w:proofErr w:type="spellEnd"/>
+              <w:t>courts.alaska.gov/shc/appeals/appealsglossary.htm#supremecourt</w:t>
+            </w:r>
           </w:p>
           <w:p>
             <w:pPr>
@@ -19175,13 +17837,8 @@
             </w:hyperlink>
             <w:r>
               <w:br/>
-              <w:t>courts.alaska.gov/shc/appeals/</w:t>
-            </w:r>
-            <w:proofErr w:type="spellStart"/>
-            <w:r>
-              <w:t>appealsglossary.htm#justice</w:t>
-            </w:r>
-            <w:proofErr w:type="spellEnd"/>
+              <w:t>courts.alaska.gov/shc/appeals/appealsglossary.htm#justice</w:t>
+            </w:r>
           </w:p>
           <w:p>
             <w:pPr>
@@ -19293,21 +17950,7 @@
               <w:rPr>
                 <w:shd w:val="clear" w:color="auto" w:fill="FFFFFF"/>
               </w:rPr>
-              <w:t xml:space="preserve">{%tr if </w:t>
-            </w:r>
-            <w:proofErr w:type="spellStart"/>
-            <w:r>
-              <w:rPr>
-                <w:shd w:val="clear" w:color="auto" w:fill="FFFFFF"/>
-              </w:rPr>
-              <w:t>respond_to_appeal</w:t>
-            </w:r>
-            <w:proofErr w:type="spellEnd"/>
-            <w:r>
-              <w:rPr>
-                <w:shd w:val="clear" w:color="auto" w:fill="FFFFFF"/>
-              </w:rPr>
-              <w:t xml:space="preserve"> == 'agree' %}</w:t>
+              <w:t>{%tr if respond_to_appeal == 'agree' %}</w:t>
             </w:r>
           </w:p>
         </w:tc>
@@ -19331,21 +17974,8 @@
                 <w:shd w:val="clear" w:color="auto" w:fill="FFFFFF"/>
               </w:rPr>
             </w:pPr>
-            <w:proofErr w:type="spellStart"/>
-            <w:r>
-              <w:t>appeal_contact_parent_step</w:t>
-            </w:r>
-            <w:proofErr w:type="spellEnd"/>
-            <w:r>
-              <w:t xml:space="preserve"> and </w:t>
-            </w:r>
-            <w:proofErr w:type="spellStart"/>
-            <w:r>
-              <w:t>tell_supreme_court_step</w:t>
-            </w:r>
-            <w:proofErr w:type="spellEnd"/>
-            <w:r>
-              <w:t xml:space="preserve"> in aka2j_motion_response_templates.yml</w:t>
+            <w:r>
+              <w:t>appeal_contact_parent_step and tell_supreme_court_step in aka2j_motion_response_templates.yml</w:t>
             </w:r>
           </w:p>
         </w:tc>
@@ -19376,6 +18006,7 @@
               <w:rPr>
                 <w:shd w:val="clear" w:color="auto" w:fill="FFFFFF"/>
               </w:rPr>
+              <w:lastRenderedPageBreak/>
               <w:t xml:space="preserve">Step </w:t>
             </w:r>
             <w:bookmarkStart w:id="17" w:name="AppealContactParent"/>
@@ -19677,7 +18308,6 @@
               <w:br/>
             </w:r>
             <w:r>
-              <w:lastRenderedPageBreak/>
               <w:t xml:space="preserve">as a </w:t>
             </w:r>
             <w:hyperlink r:id="rId193" w:tgtFrame="_blank">
@@ -19813,7 +18443,6 @@
               <w:rPr>
                 <w:shd w:val="clear" w:color="auto" w:fill="FFFFFF"/>
               </w:rPr>
-              <w:lastRenderedPageBreak/>
               <w:t xml:space="preserve">Step </w:t>
             </w:r>
             <w:bookmarkStart w:id="18" w:name="TellSupremeCourt"/>
@@ -19971,7 +18600,15 @@
                 <w:b/>
                 <w:bCs/>
               </w:rPr>
-              <w:t>Motion to Dismiss</w:t>
+              <w:t xml:space="preserve">Motion </w:t>
+            </w:r>
+            <w:r>
+              <w:rPr>
+                <w:b/>
+                <w:bCs/>
+              </w:rPr>
+              <w:lastRenderedPageBreak/>
+              <w:t>to Dismiss</w:t>
             </w:r>
             <w:r>
               <w:t xml:space="preserve"> to stop the appeal from continuing.</w:t>
@@ -20047,6 +18684,7 @@
               <w:rPr>
                 <w:shd w:val="clear" w:color="auto" w:fill="FFFFFF"/>
               </w:rPr>
+              <w:lastRenderedPageBreak/>
               <w:t>{%tr endif %}</w:t>
             </w:r>
           </w:p>
@@ -20071,19 +18709,11 @@
                 <w:rFonts w:eastAsia="Calibri"/>
               </w:rPr>
             </w:pPr>
-            <w:proofErr w:type="spellStart"/>
             <w:r>
               <w:rPr>
                 <w:rFonts w:eastAsia="Calibri"/>
               </w:rPr>
-              <w:t>get_help</w:t>
-            </w:r>
-            <w:proofErr w:type="spellEnd"/>
-            <w:r>
-              <w:rPr>
-                <w:rFonts w:eastAsia="Calibri"/>
-              </w:rPr>
-              <w:t xml:space="preserve"> in aka2j_templates.yml</w:t>
+              <w:t>get_help in aka2j_templates.yml</w:t>
             </w:r>
           </w:p>
         </w:tc>
@@ -20270,9 +18900,6 @@
             </w:hyperlink>
             <w:r>
               <w:br/>
-            </w:r>
-            <w:r>
-              <w:lastRenderedPageBreak/>
               <w:t>courts.alaska.gov/shc/family/selfhelp.htm</w:t>
             </w:r>
           </w:p>
@@ -20345,7 +18972,6 @@
         <w:spacing w:beforeAutospacing="0" w:afterAutospacing="0"/>
       </w:pPr>
       <w:r>
-        <w:lastRenderedPageBreak/>
         <w:br w:type="textWrapping" w:clear="all"/>
       </w:r>
     </w:p>
@@ -20425,14 +19051,27 @@
     <w:r>
       <w:t xml:space="preserve"> of </w:t>
     </w:r>
-    <w:fldSimple w:instr=" NUMPAGES \* ARABIC ">
-      <w:r>
-        <w:rPr>
-          <w:noProof/>
-        </w:rPr>
-        <w:t>50</w:t>
-      </w:r>
-    </w:fldSimple>
+    <w:r>
+      <w:fldChar w:fldCharType="begin"/>
+    </w:r>
+    <w:r>
+      <w:instrText xml:space="preserve"> NUMPAGES \* ARABIC </w:instrText>
+    </w:r>
+    <w:r>
+      <w:fldChar w:fldCharType="separate"/>
+    </w:r>
+    <w:r>
+      <w:rPr>
+        <w:noProof/>
+      </w:rPr>
+      <w:t>50</w:t>
+    </w:r>
+    <w:r>
+      <w:rPr>
+        <w:noProof/>
+      </w:rPr>
+      <w:fldChar w:fldCharType="end"/>
+    </w:r>
     <w:r>
       <w:t xml:space="preserve"> pages</w:t>
     </w:r>
@@ -20443,10 +19082,16 @@
       <w:spacing w:beforeAutospacing="0" w:afterAutospacing="0"/>
     </w:pPr>
     <w:r>
-      <w:t xml:space="preserve">March </w:t>
+      <w:t>Ma</w:t>
     </w:r>
     <w:r>
-      <w:t>31</w:t>
+      <w:t>y</w:t>
+    </w:r>
+    <w:r>
+      <w:t xml:space="preserve"> </w:t>
+    </w:r>
+    <w:r>
+      <w:t>1</w:t>
     </w:r>
     <w:r>
       <w:t>, 202</w:t>
@@ -20484,11 +19129,21 @@
     <w:r>
       <w:t xml:space="preserve"> of </w:t>
     </w:r>
-    <w:fldSimple w:instr=" NUMPAGES \* ARABIC ">
-      <w:r>
-        <w:t>47</w:t>
-      </w:r>
-    </w:fldSimple>
+    <w:r>
+      <w:fldChar w:fldCharType="begin"/>
+    </w:r>
+    <w:r>
+      <w:instrText xml:space="preserve"> NUMPAGES \* ARABIC </w:instrText>
+    </w:r>
+    <w:r>
+      <w:fldChar w:fldCharType="separate"/>
+    </w:r>
+    <w:r>
+      <w:t>47</w:t>
+    </w:r>
+    <w:r>
+      <w:fldChar w:fldCharType="end"/>
+    </w:r>
     <w:r>
       <w:t xml:space="preserve"> pages</w:t>
     </w:r>
@@ -24310,6 +22965,7 @@
   <w:style w:type="character" w:default="1" w:styleId="DefaultParagraphFont">
     <w:name w:val="Default Paragraph Font"/>
     <w:uiPriority w:val="1"/>
+    <w:semiHidden/>
     <w:unhideWhenUsed/>
   </w:style>
   <w:style w:type="table" w:default="1" w:styleId="TableNormal">

</xml_diff>

<commit_message>
Deleted yards of pilcrows between the 2 tables in the docx - no idea where they came from!!
</commit_message>
<xml_diff>
--- a/docassemble/ChangingChildCustody/data/templates/changing_child_custody_action_plan.docx
+++ b/docassemble/ChangingChildCustody/data/templates/changing_child_custody_action_plan.docx
@@ -560,24 +560,6 @@
         <w:pStyle w:val="Body"/>
       </w:pPr>
     </w:p>
-    <w:p/>
-    <w:p/>
-    <w:p/>
-    <w:p/>
-    <w:p/>
-    <w:p/>
-    <w:p/>
-    <w:p/>
-    <w:p/>
-    <w:p/>
-    <w:p/>
-    <w:p/>
-    <w:p/>
-    <w:p/>
-    <w:p/>
-    <w:p/>
-    <w:p/>
-    <w:p/>
     <w:tbl>
       <w:tblPr>
         <w:tblStyle w:val="TableGrid"/>
@@ -622,7 +604,7 @@
         </w:tc>
         <w:tc>
           <w:tcPr>
-            <w:tcW w:w="7611" w:type="dxa"/>
+            <w:tcW w:w="7612" w:type="dxa"/>
             <w:tcBorders>
               <w:top w:val="nil"/>
               <w:left w:val="nil"/>
@@ -665,21 +647,11 @@
             <w:r>
               <w:t xml:space="preserve">Step </w:t>
             </w:r>
-            <w:r>
-              <w:fldChar w:fldCharType="begin"/>
-            </w:r>
-            <w:r>
-              <w:instrText xml:space="preserve"> SEQ stepList \* ARABIC </w:instrText>
-            </w:r>
-            <w:r>
-              <w:fldChar w:fldCharType="separate"/>
-            </w:r>
-            <w:r>
-              <w:t>1</w:t>
-            </w:r>
-            <w:r>
-              <w:fldChar w:fldCharType="end"/>
-            </w:r>
+            <w:fldSimple w:instr=" SEQ stepList \* ARABIC ">
+              <w:r>
+                <w:t>1</w:t>
+              </w:r>
+            </w:fldSimple>
             <w:r>
               <w:t>: Decide the steps you want to take</w:t>
             </w:r>
@@ -687,7 +659,7 @@
         </w:tc>
         <w:tc>
           <w:tcPr>
-            <w:tcW w:w="7611" w:type="dxa"/>
+            <w:tcW w:w="7612" w:type="dxa"/>
             <w:tcBorders>
               <w:top w:val="nil"/>
               <w:left w:val="nil"/>
@@ -782,7 +754,7 @@
         </w:tc>
         <w:tc>
           <w:tcPr>
-            <w:tcW w:w="7611" w:type="dxa"/>
+            <w:tcW w:w="7612" w:type="dxa"/>
             <w:tcBorders>
               <w:top w:val="nil"/>
               <w:left w:val="nil"/>
@@ -819,14 +791,13 @@
               <w:pStyle w:val="Body"/>
             </w:pPr>
             <w:r>
-              <w:lastRenderedPageBreak/>
               <w:t>{%tr if parents_agree %}</w:t>
             </w:r>
           </w:p>
         </w:tc>
         <w:tc>
           <w:tcPr>
-            <w:tcW w:w="7611" w:type="dxa"/>
+            <w:tcW w:w="7612" w:type="dxa"/>
             <w:tcBorders>
               <w:top w:val="nil"/>
               <w:left w:val="nil"/>
@@ -906,7 +877,7 @@
         </w:tc>
         <w:tc>
           <w:tcPr>
-            <w:tcW w:w="7611" w:type="dxa"/>
+            <w:tcW w:w="7612" w:type="dxa"/>
             <w:tcBorders>
               <w:top w:val="nil"/>
               <w:left w:val="nil"/>
@@ -1082,11 +1053,7 @@
               <w:pStyle w:val="Body"/>
             </w:pPr>
             <w:r>
-              <w:t xml:space="preserve">You can hire your own private mediator to help resolve any issue in your case. If there was abuse or domestic violence in your relationship, be sure to hire someone with training and experience working with domestic violence. Tell your mediator if you want to bring </w:t>
-            </w:r>
-            <w:r>
-              <w:lastRenderedPageBreak/>
-              <w:t>a support person with you.</w:t>
+              <w:t>You can hire your own private mediator to help resolve any issue in your case. If there was abuse or domestic violence in your relationship, be sure to hire someone with training and experience working with domestic violence. Tell your mediator if you want to bring a support person with you.</w:t>
             </w:r>
           </w:p>
           <w:p>
@@ -1296,7 +1263,6 @@
               <w:outlineLvl w:val="2"/>
             </w:pPr>
             <w:r>
-              <w:lastRenderedPageBreak/>
               <w:t>Links in this step</w:t>
             </w:r>
           </w:p>
@@ -1430,7 +1396,6 @@
               <w:outlineLvl w:val="1"/>
             </w:pPr>
             <w:r>
-              <w:lastRenderedPageBreak/>
               <w:t xml:space="preserve">Step </w:t>
             </w:r>
             <w:r>
@@ -1470,7 +1435,7 @@
         </w:tc>
         <w:tc>
           <w:tcPr>
-            <w:tcW w:w="7611" w:type="dxa"/>
+            <w:tcW w:w="7612" w:type="dxa"/>
             <w:tcBorders>
               <w:top w:val="nil"/>
               <w:left w:val="nil"/>
@@ -1747,7 +1712,6 @@
               <w:outlineLvl w:val="2"/>
             </w:pPr>
             <w:r>
-              <w:lastRenderedPageBreak/>
               <w:t>If you are changing child support</w:t>
             </w:r>
           </w:p>
@@ -2020,14 +1984,13 @@
               <w:rPr>
                 <w:shd w:val="clear" w:color="auto" w:fill="FFFFFF"/>
               </w:rPr>
-              <w:lastRenderedPageBreak/>
               <w:t>{%tr endif %}</w:t>
             </w:r>
           </w:p>
         </w:tc>
         <w:tc>
           <w:tcPr>
-            <w:tcW w:w="7611" w:type="dxa"/>
+            <w:tcW w:w="7612" w:type="dxa"/>
             <w:tcBorders>
               <w:top w:val="nil"/>
               <w:left w:val="nil"/>
@@ -2073,7 +2036,7 @@
         </w:tc>
         <w:tc>
           <w:tcPr>
-            <w:tcW w:w="7611" w:type="dxa"/>
+            <w:tcW w:w="7612" w:type="dxa"/>
             <w:tcBorders>
               <w:top w:val="nil"/>
               <w:left w:val="nil"/>
@@ -2163,17 +2126,13 @@
               <w:fldChar w:fldCharType="end"/>
             </w:r>
             <w:r>
-              <w:t xml:space="preserve">: Ask the court to change </w:t>
-            </w:r>
-            <w:r>
-              <w:lastRenderedPageBreak/>
-              <w:t>your custody and Parenting Plan or child support order from another state</w:t>
+              <w:t>: Ask the court to change your custody and Parenting Plan or child support order from another state</w:t>
             </w:r>
           </w:p>
         </w:tc>
         <w:tc>
           <w:tcPr>
-            <w:tcW w:w="7611" w:type="dxa"/>
+            <w:tcW w:w="7612" w:type="dxa"/>
             <w:tcBorders>
               <w:top w:val="nil"/>
               <w:left w:val="nil"/>
@@ -2189,12 +2148,7 @@
               <w:pStyle w:val="Body"/>
             </w:pPr>
             <w:r>
-              <w:lastRenderedPageBreak/>
-              <w:t xml:space="preserve">If do not have to change your parenting plan or custody order and you only need to change your child support order, contact the Alaska Child Support Enforcement Division. They may be able to help you change </w:t>
-            </w:r>
-            <w:r>
-              <w:lastRenderedPageBreak/>
-              <w:t>your order without going to court.</w:t>
+              <w:t>If do not have to change your parenting plan or custody order and you only need to change your child support order, contact the Alaska Child Support Enforcement Division. They may be able to help you change your order without going to court.</w:t>
             </w:r>
           </w:p>
           <w:p>
@@ -2402,7 +2356,6 @@
               <w:rPr>
                 <w:shd w:val="clear" w:color="auto" w:fill="FFFFFF"/>
               </w:rPr>
-              <w:lastRenderedPageBreak/>
               <w:t xml:space="preserve">Step </w:t>
             </w:r>
             <w:bookmarkStart w:id="0" w:name="AKjurisdiction"/>
@@ -2450,7 +2403,7 @@
         </w:tc>
         <w:tc>
           <w:tcPr>
-            <w:tcW w:w="7611" w:type="dxa"/>
+            <w:tcW w:w="7612" w:type="dxa"/>
             <w:tcBorders>
               <w:top w:val="nil"/>
               <w:left w:val="nil"/>
@@ -2606,20 +2559,13 @@
               <w:rPr>
                 <w:shd w:val="clear" w:color="auto" w:fill="FFFFFF"/>
               </w:rPr>
-              <w:t xml:space="preserve">: Register </w:t>
-            </w:r>
-            <w:r>
-              <w:rPr>
-                <w:shd w:val="clear" w:color="auto" w:fill="FFFFFF"/>
-              </w:rPr>
-              <w:lastRenderedPageBreak/>
-              <w:t>the out-of-state order</w:t>
+              <w:t>: Register the out-of-state order</w:t>
             </w:r>
           </w:p>
         </w:tc>
         <w:tc>
           <w:tcPr>
-            <w:tcW w:w="7611" w:type="dxa"/>
+            <w:tcW w:w="7612" w:type="dxa"/>
             <w:tcBorders>
               <w:top w:val="nil"/>
               <w:left w:val="nil"/>
@@ -2637,7 +2583,6 @@
               <w:outlineLvl w:val="2"/>
             </w:pPr>
             <w:r>
-              <w:lastRenderedPageBreak/>
               <w:t>Submit the following packet to the Alaska court</w:t>
             </w:r>
           </w:p>
@@ -2652,7 +2597,6 @@
               <w:ind w:left="516"/>
             </w:pPr>
             <w:r>
-              <w:lastRenderedPageBreak/>
               <w:t xml:space="preserve">1 </w:t>
             </w:r>
             <w:r>
@@ -3134,7 +3078,6 @@
               <w:br/>
             </w:r>
             <w:r>
-              <w:lastRenderedPageBreak/>
               <w:t>public.courts.alaska.gov/web/forms/docs/dr-343.pdf</w:t>
             </w:r>
           </w:p>
@@ -3521,11 +3464,7 @@
               <w:ind w:left="1320"/>
             </w:pPr>
             <w:r>
-              <w:t xml:space="preserve">the filled-out mailing forms for certified mail, restricted delivery, return receipt requested from the Post Office for each of the people listed in the certificate of distribution </w:t>
-            </w:r>
-            <w:r>
-              <w:lastRenderedPageBreak/>
-              <w:t>on the Notice of Registration Order.</w:t>
+              <w:t>the filled-out mailing forms for certified mail, restricted delivery, return receipt requested from the Post Office for each of the people listed in the certificate of distribution on the Notice of Registration Order.</w:t>
             </w:r>
             <w:r>
               <w:br/>
@@ -3716,14 +3655,13 @@
               <w:rPr>
                 <w:shd w:val="clear" w:color="auto" w:fill="FFFFFF"/>
               </w:rPr>
-              <w:lastRenderedPageBreak/>
               <w:t>{%tr endif %}</w:t>
             </w:r>
           </w:p>
         </w:tc>
         <w:tc>
           <w:tcPr>
-            <w:tcW w:w="7611" w:type="dxa"/>
+            <w:tcW w:w="7612" w:type="dxa"/>
             <w:tcBorders>
               <w:top w:val="nil"/>
               <w:left w:val="nil"/>
@@ -3860,15 +3798,7 @@
                 <w:color w:val="FFC000"/>
                 <w:shd w:val="clear" w:color="auto" w:fill="FFFFFF"/>
               </w:rPr>
-              <w:t>type_of_final_order['cust</w:t>
-            </w:r>
-            <w:r>
-              <w:rPr>
-                <w:color w:val="FFC000"/>
-                <w:shd w:val="clear" w:color="auto" w:fill="FFFFFF"/>
-              </w:rPr>
-              <w:lastRenderedPageBreak/>
-              <w:t>ody order'] and</w:t>
+              <w:t>type_of_final_order['custody order'] and</w:t>
             </w:r>
             <w:r>
               <w:rPr>
@@ -3913,7 +3843,7 @@
         </w:tc>
         <w:tc>
           <w:tcPr>
-            <w:tcW w:w="7611" w:type="dxa"/>
+            <w:tcW w:w="7612" w:type="dxa"/>
             <w:tcBorders>
               <w:top w:val="nil"/>
               <w:left w:val="nil"/>
@@ -3929,7 +3859,6 @@
               <w:pStyle w:val="Body"/>
             </w:pPr>
             <w:r>
-              <w:lastRenderedPageBreak/>
               <w:t>modify_step in aka2j_mod_cust_div_templates.yml</w:t>
             </w:r>
           </w:p>
@@ -4052,14 +3981,7 @@
               <w:rPr>
                 <w:color w:val="C00000"/>
               </w:rPr>
-              <w:t xml:space="preserve">% elif user_need in('respond to </w:t>
-            </w:r>
-            <w:r>
-              <w:rPr>
-                <w:color w:val="C00000"/>
-              </w:rPr>
-              <w:lastRenderedPageBreak/>
-              <w:t>motion in custody', 'respond to motion in divorce') %}</w:t>
+              <w:t>% elif user_need in('respond to motion in custody', 'respond to motion in divorce') %}</w:t>
             </w:r>
             <w:r>
               <w:rPr>
@@ -4115,7 +4037,7 @@
         </w:tc>
         <w:tc>
           <w:tcPr>
-            <w:tcW w:w="7611" w:type="dxa"/>
+            <w:tcW w:w="7612" w:type="dxa"/>
             <w:tcBorders>
               <w:top w:val="nil"/>
               <w:left w:val="nil"/>
@@ -4137,7 +4059,6 @@
               <w:rPr>
                 <w:color w:val="C00000"/>
               </w:rPr>
-              <w:lastRenderedPageBreak/>
               <w:t>{% if not user_need in('respond to motion in custody', 'respond to motion in divorce') %}</w:t>
             </w:r>
             <w:r>
@@ -4205,11 +4126,7 @@
               <w:suppressOverlap w:val="0"/>
             </w:pPr>
             <w:r>
-              <w:t xml:space="preserve">Under the current parenting plan order, your children spend </w:t>
-            </w:r>
-            <w:r>
-              <w:lastRenderedPageBreak/>
-              <w:t>one week with you and the next week with the other parent. You are going to move out of state so the current schedule is impossible.</w:t>
+              <w:t>Under the current parenting plan order, your children spend one week with you and the next week with the other parent. You are going to move out of state so the current schedule is impossible.</w:t>
             </w:r>
           </w:p>
           <w:p>
@@ -4364,14 +4281,7 @@
               <w:rPr>
                 <w:color w:val="92D050"/>
               </w:rPr>
-              <w:t xml:space="preserve">{% if user_need == 'change foreign custody order' or (user_need in('change AK order', 'change custody order',' change divorce order') and </w:t>
-            </w:r>
-            <w:r>
-              <w:rPr>
-                <w:color w:val="92D050"/>
-              </w:rPr>
-              <w:lastRenderedPageBreak/>
-              <w:t>middle_of_case == 'no') %}</w:t>
+              <w:t>{% if user_need == 'change foreign custody order' or (user_need in('change AK order', 'change custody order',' change divorce order') and middle_of_case == 'no') %}</w:t>
             </w:r>
           </w:p>
           <w:p>
@@ -4520,14 +4430,13 @@
               <w:rPr>
                 <w:shd w:val="clear" w:color="auto" w:fill="FFFFFF"/>
               </w:rPr>
-              <w:lastRenderedPageBreak/>
               <w:t>{%tr endif %}</w:t>
             </w:r>
           </w:p>
         </w:tc>
         <w:tc>
           <w:tcPr>
-            <w:tcW w:w="7611" w:type="dxa"/>
+            <w:tcW w:w="7612" w:type="dxa"/>
             <w:tcBorders>
               <w:top w:val="nil"/>
               <w:left w:val="nil"/>
@@ -4660,7 +4569,7 @@
         </w:tc>
         <w:tc>
           <w:tcPr>
-            <w:tcW w:w="7611" w:type="dxa"/>
+            <w:tcW w:w="7612" w:type="dxa"/>
             <w:tcBorders>
               <w:top w:val="nil"/>
               <w:left w:val="nil"/>
@@ -4772,15 +4681,7 @@
                 <w:color w:val="FFC000"/>
                 <w:shd w:val="clear" w:color="auto" w:fill="FFFFFF"/>
               </w:rPr>
-              <w:t xml:space="preserve">% if user_need in('change child </w:t>
-            </w:r>
-            <w:r>
-              <w:rPr>
-                <w:color w:val="FFC000"/>
-                <w:shd w:val="clear" w:color="auto" w:fill="FFFFFF"/>
-              </w:rPr>
-              <w:lastRenderedPageBreak/>
-              <w:t>support','change custody order') %}</w:t>
+              <w:t>% if user_need in('change child support','change custody order') %}</w:t>
             </w:r>
             <w:r>
               <w:rPr>
@@ -4854,7 +4755,7 @@
         </w:tc>
         <w:tc>
           <w:tcPr>
-            <w:tcW w:w="7611" w:type="dxa"/>
+            <w:tcW w:w="7612" w:type="dxa"/>
             <w:tcBorders>
               <w:top w:val="nil"/>
               <w:left w:val="nil"/>
@@ -4872,7 +4773,6 @@
               <w:outlineLvl w:val="2"/>
             </w:pPr>
             <w:r>
-              <w:lastRenderedPageBreak/>
               <w:t>Use</w:t>
             </w:r>
           </w:p>
@@ -4909,9 +4809,6 @@
             </w:hyperlink>
             <w:r>
               <w:br/>
-            </w:r>
-            <w:r>
-              <w:lastRenderedPageBreak/>
               <w:t>3 of the forms in this packet are affidavits:</w:t>
             </w:r>
           </w:p>
@@ -5164,7 +5061,6 @@
               <w:rPr>
                 <w:shd w:val="clear" w:color="auto" w:fill="FFFFFF"/>
               </w:rPr>
-              <w:lastRenderedPageBreak/>
               <w:t xml:space="preserve">Step </w:t>
             </w:r>
             <w:r>
@@ -5210,7 +5106,7 @@
         </w:tc>
         <w:tc>
           <w:tcPr>
-            <w:tcW w:w="7611" w:type="dxa"/>
+            <w:tcW w:w="7612" w:type="dxa"/>
             <w:tcBorders>
               <w:top w:val="nil"/>
               <w:left w:val="nil"/>
@@ -5278,11 +5174,7 @@
               <w:suppressOverlap w:val="0"/>
             </w:pPr>
             <w:r>
-              <w:t xml:space="preserve">156 divided by 365 nights in a year is .43, or 43% of </w:t>
-            </w:r>
-            <w:r>
-              <w:lastRenderedPageBreak/>
-              <w:t>overnights with the other parent.</w:t>
+              <w:t>156 divided by 365 nights in a year is .43, or 43% of overnights with the other parent.</w:t>
             </w:r>
           </w:p>
           <w:p>
@@ -5661,24 +5553,13 @@
               <w:outlineLvl w:val="1"/>
             </w:pPr>
             <w:r>
-              <w:lastRenderedPageBreak/>
               <w:t xml:space="preserve">Step </w:t>
             </w:r>
-            <w:r>
-              <w:fldChar w:fldCharType="begin"/>
-            </w:r>
-            <w:r>
-              <w:instrText xml:space="preserve"> SEQ stepList \* ARABIC </w:instrText>
-            </w:r>
-            <w:r>
-              <w:fldChar w:fldCharType="separate"/>
-            </w:r>
-            <w:r>
-              <w:t>10</w:t>
-            </w:r>
-            <w:r>
-              <w:fldChar w:fldCharType="end"/>
-            </w:r>
+            <w:fldSimple w:instr=" SEQ stepList \* ARABIC ">
+              <w:r>
+                <w:t>10</w:t>
+              </w:r>
+            </w:fldSimple>
             <w:r>
               <w:t xml:space="preserve">: </w:t>
             </w:r>
@@ -5686,20 +5567,13 @@
               <w:rPr>
                 <w:shd w:val="clear" w:color="auto" w:fill="FFFFFF"/>
               </w:rPr>
-              <w:t xml:space="preserve">Do not wait to file your </w:t>
-            </w:r>
-            <w:r>
-              <w:rPr>
-                <w:shd w:val="clear" w:color="auto" w:fill="FFFFFF"/>
-              </w:rPr>
-              <w:lastRenderedPageBreak/>
-              <w:t>Motion to Modify</w:t>
+              <w:t>Do not wait to file your Motion to Modify</w:t>
             </w:r>
           </w:p>
         </w:tc>
         <w:tc>
           <w:tcPr>
-            <w:tcW w:w="7611" w:type="dxa"/>
+            <w:tcW w:w="7612" w:type="dxa"/>
             <w:tcBorders>
               <w:top w:val="nil"/>
               <w:left w:val="nil"/>
@@ -5715,7 +5589,6 @@
               <w:pStyle w:val="Body"/>
             </w:pPr>
             <w:r>
-              <w:lastRenderedPageBreak/>
               <w:t xml:space="preserve">If you and the other parent agree to change the schedule, or have already permanently changed your schedule, file your </w:t>
             </w:r>
             <w:r>
@@ -5734,7 +5607,6 @@
               <w:pStyle w:val="Body"/>
             </w:pPr>
             <w:r>
-              <w:lastRenderedPageBreak/>
               <w:t>Until you file your motion with the court, the parent who owes child support still owes the amount in your current order.</w:t>
             </w:r>
           </w:p>
@@ -5896,14 +5768,13 @@
               <w:rPr>
                 <w:shd w:val="clear" w:color="auto" w:fill="FFFFFF"/>
               </w:rPr>
-              <w:lastRenderedPageBreak/>
               <w:t>{%tr endif %}</w:t>
             </w:r>
           </w:p>
         </w:tc>
         <w:tc>
           <w:tcPr>
-            <w:tcW w:w="7611" w:type="dxa"/>
+            <w:tcW w:w="7612" w:type="dxa"/>
             <w:tcBorders>
               <w:top w:val="nil"/>
               <w:left w:val="nil"/>
@@ -5940,17 +5811,13 @@
               <w:pStyle w:val="Body"/>
             </w:pPr>
             <w:r>
-              <w:t>{%tr if interim_order_date_within_10_days or final_order_date_within_10_days or unknown_final_date['rec</w:t>
-            </w:r>
-            <w:r>
-              <w:lastRenderedPageBreak/>
-              <w:t>onsider'] %}</w:t>
+              <w:t>{%tr if interim_order_date_within_10_days or final_order_date_within_10_days or unknown_final_date['reconsider'] %}</w:t>
             </w:r>
           </w:p>
         </w:tc>
         <w:tc>
           <w:tcPr>
-            <w:tcW w:w="7611" w:type="dxa"/>
+            <w:tcW w:w="7612" w:type="dxa"/>
             <w:tcBorders>
               <w:top w:val="nil"/>
               <w:left w:val="nil"/>
@@ -5966,7 +5833,6 @@
               <w:pStyle w:val="Body"/>
             </w:pPr>
             <w:r>
-              <w:lastRenderedPageBreak/>
               <w:t>learn_reconsider_step and fill_reconsider_step in aka2j_mod_cust_div_templates.yml</w:t>
             </w:r>
           </w:p>
@@ -5994,21 +5860,11 @@
             <w:r>
               <w:t xml:space="preserve">Step </w:t>
             </w:r>
-            <w:r>
-              <w:fldChar w:fldCharType="begin"/>
-            </w:r>
-            <w:r>
-              <w:instrText xml:space="preserve"> SEQ stepList \* ARABIC </w:instrText>
-            </w:r>
-            <w:r>
-              <w:fldChar w:fldCharType="separate"/>
-            </w:r>
-            <w:r>
-              <w:t>11</w:t>
-            </w:r>
-            <w:r>
-              <w:fldChar w:fldCharType="end"/>
-            </w:r>
+            <w:fldSimple w:instr=" SEQ stepList \* ARABIC ">
+              <w:r>
+                <w:t>11</w:t>
+              </w:r>
+            </w:fldSimple>
             <w:r>
               <w:t>: Learn about Motions to Reconsider</w:t>
             </w:r>
@@ -6016,7 +5872,7 @@
         </w:tc>
         <w:tc>
           <w:tcPr>
-            <w:tcW w:w="7611" w:type="dxa"/>
+            <w:tcW w:w="7612" w:type="dxa"/>
             <w:tcBorders>
               <w:top w:val="nil"/>
               <w:left w:val="nil"/>
@@ -6210,14 +6066,7 @@
               <w:rPr>
                 <w:shd w:val="clear" w:color="auto" w:fill="FFFFFF"/>
               </w:rPr>
-              <w:t xml:space="preserve">he parents agree that mom makes $25,000 every year. They file the forms to tell the judge they agree. The judge calculated </w:t>
-            </w:r>
-            <w:r>
-              <w:rPr>
-                <w:shd w:val="clear" w:color="auto" w:fill="FFFFFF"/>
-              </w:rPr>
-              <w:lastRenderedPageBreak/>
-              <w:t xml:space="preserve">child support using $35,000 for mom’s income. </w:t>
+              <w:t xml:space="preserve">he parents agree that mom makes $25,000 every year. They file the forms to tell the judge they agree. The judge calculated child support using $35,000 for mom’s income. </w:t>
             </w:r>
           </w:p>
           <w:p>
@@ -6424,7 +6273,6 @@
               <w:outlineLvl w:val="1"/>
             </w:pPr>
             <w:r>
-              <w:lastRenderedPageBreak/>
               <w:t xml:space="preserve">Step </w:t>
             </w:r>
             <w:r>
@@ -6458,17 +6306,13 @@
               <w:fldChar w:fldCharType="end"/>
             </w:r>
             <w:r>
-              <w:t xml:space="preserve">: Fill out </w:t>
-            </w:r>
-            <w:r>
-              <w:lastRenderedPageBreak/>
-              <w:t>the Motion to Reconsider forms</w:t>
+              <w:t>: Fill out the Motion to Reconsider forms</w:t>
             </w:r>
           </w:p>
         </w:tc>
         <w:tc>
           <w:tcPr>
-            <w:tcW w:w="7611" w:type="dxa"/>
+            <w:tcW w:w="7612" w:type="dxa"/>
             <w:tcBorders>
               <w:top w:val="nil"/>
               <w:left w:val="nil"/>
@@ -6486,7 +6330,6 @@
               <w:outlineLvl w:val="2"/>
             </w:pPr>
             <w:r>
-              <w:lastRenderedPageBreak/>
               <w:t>Use</w:t>
             </w:r>
           </w:p>
@@ -6508,7 +6351,6 @@
               <w:rPr>
                 <w:b/>
               </w:rPr>
-              <w:lastRenderedPageBreak/>
               <w:t>Motion and Affidavit to Reconsider, SHC-1545</w:t>
             </w:r>
             <w:r>
@@ -6940,14 +6782,13 @@
               <w:rPr>
                 <w:shd w:val="clear" w:color="auto" w:fill="FFFFFF"/>
               </w:rPr>
-              <w:lastRenderedPageBreak/>
               <w:t>{%tr endif %}</w:t>
             </w:r>
           </w:p>
         </w:tc>
         <w:tc>
           <w:tcPr>
-            <w:tcW w:w="7611" w:type="dxa"/>
+            <w:tcW w:w="7612" w:type="dxa"/>
             <w:tcBorders>
               <w:top w:val="nil"/>
               <w:left w:val="nil"/>
@@ -6993,7 +6834,7 @@
         </w:tc>
         <w:tc>
           <w:tcPr>
-            <w:tcW w:w="7611" w:type="dxa"/>
+            <w:tcW w:w="7612" w:type="dxa"/>
             <w:tcBorders>
               <w:top w:val="nil"/>
               <w:left w:val="nil"/>
@@ -7043,7 +6884,6 @@
               <w:rPr>
                 <w:shd w:val="clear" w:color="auto" w:fill="FFFFFF"/>
               </w:rPr>
-              <w:lastRenderedPageBreak/>
               <w:t xml:space="preserve">Step </w:t>
             </w:r>
             <w:r>
@@ -7086,7 +6926,7 @@
         </w:tc>
         <w:tc>
           <w:tcPr>
-            <w:tcW w:w="7611" w:type="dxa"/>
+            <w:tcW w:w="7612" w:type="dxa"/>
             <w:tcBorders>
               <w:top w:val="nil"/>
               <w:left w:val="nil"/>
@@ -7377,7 +7217,7 @@
         </w:tc>
         <w:tc>
           <w:tcPr>
-            <w:tcW w:w="7611" w:type="dxa"/>
+            <w:tcW w:w="7612" w:type="dxa"/>
             <w:tcBorders>
               <w:top w:val="nil"/>
               <w:left w:val="nil"/>
@@ -7593,13 +7433,6 @@
                 <w:color w:val="000000"/>
               </w:rPr>
               <w:br/>
-            </w:r>
-            <w:r>
-              <w:rPr>
-                <w:rFonts w:eastAsia="Calibri"/>
-                <w:color w:val="000000"/>
-              </w:rPr>
-              <w:lastRenderedPageBreak/>
               <w:t>courts.alaska.gov/shc/family/docs/shc-1301n.pdf</w:t>
             </w:r>
           </w:p>
@@ -7693,14 +7526,13 @@
               <w:rPr>
                 <w:shd w:val="clear" w:color="auto" w:fill="FFFFFF"/>
               </w:rPr>
-              <w:lastRenderedPageBreak/>
               <w:t>{%tr endif %}</w:t>
             </w:r>
           </w:p>
         </w:tc>
         <w:tc>
           <w:tcPr>
-            <w:tcW w:w="7611" w:type="dxa"/>
+            <w:tcW w:w="7612" w:type="dxa"/>
             <w:tcBorders>
               <w:top w:val="nil"/>
               <w:left w:val="nil"/>
@@ -7755,7 +7587,7 @@
         </w:tc>
         <w:tc>
           <w:tcPr>
-            <w:tcW w:w="7611" w:type="dxa"/>
+            <w:tcW w:w="7612" w:type="dxa"/>
             <w:tcBorders>
               <w:top w:val="nil"/>
               <w:left w:val="nil"/>
@@ -7850,7 +7682,7 @@
         </w:tc>
         <w:tc>
           <w:tcPr>
-            <w:tcW w:w="7611" w:type="dxa"/>
+            <w:tcW w:w="7612" w:type="dxa"/>
             <w:tcBorders>
               <w:top w:val="nil"/>
               <w:left w:val="nil"/>
@@ -7984,7 +7816,6 @@
               <w:ind w:left="405"/>
             </w:pPr>
             <w:r>
-              <w:lastRenderedPageBreak/>
               <w:t xml:space="preserve">appeal briefs filed in the appeal to the Supreme Court. </w:t>
             </w:r>
           </w:p>
@@ -8250,14 +8081,13 @@
               <w:rPr>
                 <w:shd w:val="clear" w:color="auto" w:fill="FFFFFF"/>
               </w:rPr>
-              <w:lastRenderedPageBreak/>
               <w:t>{%tr endif %}</w:t>
             </w:r>
           </w:p>
         </w:tc>
         <w:tc>
           <w:tcPr>
-            <w:tcW w:w="7611" w:type="dxa"/>
+            <w:tcW w:w="7612" w:type="dxa"/>
             <w:tcBorders>
               <w:top w:val="nil"/>
               <w:left w:val="nil"/>
@@ -8300,7 +8130,7 @@
         </w:tc>
         <w:tc>
           <w:tcPr>
-            <w:tcW w:w="7611" w:type="dxa"/>
+            <w:tcW w:w="7612" w:type="dxa"/>
             <w:tcBorders>
               <w:top w:val="nil"/>
               <w:left w:val="nil"/>
@@ -8383,17 +8213,13 @@
               <w:t>:</w:t>
             </w:r>
             <w:r>
-              <w:t xml:space="preserve"> Learn </w:t>
-            </w:r>
-            <w:r>
-              <w:lastRenderedPageBreak/>
-              <w:t>about the Motion to Set Aside Judgment or Order</w:t>
+              <w:t xml:space="preserve"> Learn about the Motion to Set Aside Judgment or Order</w:t>
             </w:r>
           </w:p>
         </w:tc>
         <w:tc>
           <w:tcPr>
-            <w:tcW w:w="7611" w:type="dxa"/>
+            <w:tcW w:w="7612" w:type="dxa"/>
             <w:tcBorders>
               <w:top w:val="nil"/>
               <w:left w:val="nil"/>
@@ -8411,7 +8237,6 @@
             <w:bookmarkStart w:id="3" w:name="_Hlk136616288"/>
             <w:bookmarkStart w:id="4" w:name="_Hlk136615055"/>
             <w:r>
-              <w:lastRenderedPageBreak/>
               <w:t xml:space="preserve">A </w:t>
             </w:r>
             <w:r>
@@ -8435,7 +8260,6 @@
               <w:ind w:left="403"/>
             </w:pPr>
             <w:r>
-              <w:lastRenderedPageBreak/>
               <w:t>f</w:t>
             </w:r>
             <w:r>
@@ -8714,7 +8538,6 @@
               <w:pStyle w:val="Body"/>
             </w:pPr>
             <w:r>
-              <w:lastRenderedPageBreak/>
               <w:t>{{ image_data['image'].show(width='5in%') }}</w:t>
             </w:r>
           </w:p>
@@ -9098,11 +8921,7 @@
               <w:t xml:space="preserve">The judge </w:t>
             </w:r>
             <w:r>
-              <w:t xml:space="preserve">decides if you filed your motion </w:t>
-            </w:r>
-            <w:r>
-              <w:lastRenderedPageBreak/>
-              <w:t xml:space="preserve">within </w:t>
+              <w:t xml:space="preserve">decides if you filed your motion within </w:t>
             </w:r>
             <w:r>
               <w:t xml:space="preserve">a reasonable time. The judge may </w:t>
@@ -9408,7 +9227,6 @@
               <w:rPr>
                 <w:shd w:val="clear" w:color="auto" w:fill="FFFFFF"/>
               </w:rPr>
-              <w:lastRenderedPageBreak/>
               <w:t xml:space="preserve">Step </w:t>
             </w:r>
             <w:r>
@@ -9448,17 +9266,13 @@
               <w:t>:</w:t>
             </w:r>
             <w:r>
-              <w:t xml:space="preserve"> Fill out forms if you want to file a </w:t>
-            </w:r>
-            <w:r>
-              <w:lastRenderedPageBreak/>
-              <w:t>Motion to Set Aside</w:t>
+              <w:t xml:space="preserve"> Fill out forms if you want to file a Motion to Set Aside</w:t>
             </w:r>
           </w:p>
         </w:tc>
         <w:tc>
           <w:tcPr>
-            <w:tcW w:w="7611" w:type="dxa"/>
+            <w:tcW w:w="7612" w:type="dxa"/>
             <w:tcBorders>
               <w:top w:val="nil"/>
               <w:left w:val="nil"/>
@@ -9474,7 +9288,6 @@
               <w:pStyle w:val="Body"/>
             </w:pPr>
             <w:r>
-              <w:lastRenderedPageBreak/>
               <w:t xml:space="preserve">If you decide </w:t>
             </w:r>
             <w:r>
@@ -9520,14 +9333,7 @@
               <w:rPr>
                 <w:b/>
               </w:rPr>
-              <w:t xml:space="preserve">Motion and Affidavit to Set Aside the Judgment or Order, </w:t>
-            </w:r>
-            <w:r>
-              <w:rPr>
-                <w:b/>
-              </w:rPr>
-              <w:lastRenderedPageBreak/>
-              <w:t>SHC-1548</w:t>
+              <w:t>Motion and Affidavit to Set Aside the Judgment or Order, SHC-1548</w:t>
             </w:r>
             <w:r>
               <w:t xml:space="preserve"> </w:t>
@@ -10028,9 +9834,6 @@
             </w:hyperlink>
             <w:r>
               <w:br/>
-            </w:r>
-            <w:r>
-              <w:lastRenderedPageBreak/>
               <w:t>youtube.com/watch?v=2irmxT0_0EA</w:t>
             </w:r>
           </w:p>
@@ -10058,14 +9861,13 @@
               <w:rPr>
                 <w:shd w:val="clear" w:color="auto" w:fill="FFFFFF"/>
               </w:rPr>
-              <w:lastRenderedPageBreak/>
               <w:t>{%tr endif %}</w:t>
             </w:r>
           </w:p>
         </w:tc>
         <w:tc>
           <w:tcPr>
-            <w:tcW w:w="7611" w:type="dxa"/>
+            <w:tcW w:w="7612" w:type="dxa"/>
             <w:tcBorders>
               <w:top w:val="nil"/>
               <w:left w:val="nil"/>
@@ -10114,7 +9916,7 @@
         </w:tc>
         <w:tc>
           <w:tcPr>
-            <w:tcW w:w="7611" w:type="dxa"/>
+            <w:tcW w:w="7612" w:type="dxa"/>
             <w:tcBorders>
               <w:top w:val="nil"/>
               <w:left w:val="nil"/>
@@ -10203,7 +10005,7 @@
         </w:tc>
         <w:tc>
           <w:tcPr>
-            <w:tcW w:w="7611" w:type="dxa"/>
+            <w:tcW w:w="7612" w:type="dxa"/>
             <w:tcBorders>
               <w:top w:val="nil"/>
               <w:left w:val="nil"/>
@@ -10425,7 +10227,7 @@
         </w:tc>
         <w:tc>
           <w:tcPr>
-            <w:tcW w:w="7611" w:type="dxa"/>
+            <w:tcW w:w="7612" w:type="dxa"/>
             <w:tcBorders>
               <w:top w:val="nil"/>
               <w:left w:val="nil"/>
@@ -10468,14 +10270,13 @@
               <w:rPr>
                 <w:shd w:val="clear" w:color="auto" w:fill="FFFFFF"/>
               </w:rPr>
-              <w:lastRenderedPageBreak/>
               <w:t>{%tr if respond_to_modify == 'agree' or respond_to_set_aside == 'agree'%}</w:t>
             </w:r>
           </w:p>
         </w:tc>
         <w:tc>
           <w:tcPr>
-            <w:tcW w:w="7611" w:type="dxa"/>
+            <w:tcW w:w="7612" w:type="dxa"/>
             <w:tcBorders>
               <w:top w:val="nil"/>
               <w:left w:val="nil"/>
@@ -10597,7 +10398,7 @@
         </w:tc>
         <w:tc>
           <w:tcPr>
-            <w:tcW w:w="7611" w:type="dxa"/>
+            <w:tcW w:w="7612" w:type="dxa"/>
             <w:tcBorders>
               <w:top w:val="nil"/>
               <w:left w:val="nil"/>
@@ -10900,11 +10701,7 @@
               <w:pStyle w:val="Body"/>
             </w:pPr>
             <w:r>
-              <w:t xml:space="preserve">For both options, you must file all documents with the court within 10 </w:t>
-            </w:r>
-            <w:r>
-              <w:lastRenderedPageBreak/>
-              <w:t>days from the day the motion was hand delivered to you, or 13 days from the day it was mailed to you. You can see this date on the postmark of the envelope.</w:t>
+              <w:t>For both options, you must file all documents with the court within 10 days from the day the motion was hand delivered to you, or 13 days from the day it was mailed to you. You can see this date on the postmark of the envelope.</w:t>
             </w:r>
           </w:p>
         </w:tc>
@@ -10934,14 +10731,13 @@
               <w:rPr>
                 <w:shd w:val="clear" w:color="auto" w:fill="FFFFFF"/>
               </w:rPr>
-              <w:lastRenderedPageBreak/>
               <w:t>{%tr endif %}</w:t>
             </w:r>
           </w:p>
         </w:tc>
         <w:tc>
           <w:tcPr>
-            <w:tcW w:w="7611" w:type="dxa"/>
+            <w:tcW w:w="7612" w:type="dxa"/>
             <w:tcBorders>
               <w:top w:val="nil"/>
               <w:left w:val="nil"/>
@@ -10990,7 +10786,7 @@
         </w:tc>
         <w:tc>
           <w:tcPr>
-            <w:tcW w:w="7611" w:type="dxa"/>
+            <w:tcW w:w="7612" w:type="dxa"/>
             <w:tcBorders>
               <w:top w:val="nil"/>
               <w:left w:val="nil"/>
@@ -11093,14 +10889,7 @@
               <w:rPr>
                 <w:color w:val="C00000"/>
               </w:rPr>
-              <w:t>{% elif type_of_respons</w:t>
-            </w:r>
-            <w:r>
-              <w:rPr>
-                <w:color w:val="C00000"/>
-              </w:rPr>
-              <w:lastRenderedPageBreak/>
-              <w:t>e == 'modify' and respond_to_modify in('some', 'none') %}</w:t>
+              <w:t>{% elif type_of_response == 'modify' and respond_to_modify in('some', 'none') %}</w:t>
             </w:r>
             <w:r>
               <w:t>do not agree with the proposed changes</w:t>
@@ -11124,7 +10913,7 @@
         </w:tc>
         <w:tc>
           <w:tcPr>
-            <w:tcW w:w="7611" w:type="dxa"/>
+            <w:tcW w:w="7612" w:type="dxa"/>
             <w:tcBorders>
               <w:top w:val="nil"/>
               <w:left w:val="nil"/>
@@ -11143,7 +10932,6 @@
               <w:rPr>
                 <w:color w:val="C00000"/>
               </w:rPr>
-              <w:lastRenderedPageBreak/>
               <w:t>{% if (type_of_response == 'modify' and respond_to_modify == 'agree') or (middle_of_case == 'no' and type_of_response == 'set aside' and respond_to_set_aside == 'agree') %}</w:t>
             </w:r>
             <w:r>
@@ -11252,11 +11040,7 @@
               <w:pStyle w:val="Body"/>
             </w:pPr>
             <w:r>
-              <w:t xml:space="preserve">If the due date is a weekend or holiday your response  is due the next </w:t>
-            </w:r>
-            <w:r>
-              <w:lastRenderedPageBreak/>
-              <w:t xml:space="preserve">day the court is open.  For example, if it is due on a Saturday, and the court is open Monday, your response is due Monday.  </w:t>
+              <w:t xml:space="preserve">If the due date is a weekend or holiday your response  is due the next day the court is open.  For example, if it is due on a Saturday, and the court is open Monday, your response is due Monday.  </w:t>
             </w:r>
           </w:p>
           <w:p>
@@ -11731,14 +11515,13 @@
               <w:rPr>
                 <w:shd w:val="clear" w:color="auto" w:fill="FFFFFF"/>
               </w:rPr>
-              <w:lastRenderedPageBreak/>
               <w:t>{%tr endif %}</w:t>
             </w:r>
           </w:p>
         </w:tc>
         <w:tc>
           <w:tcPr>
-            <w:tcW w:w="7611" w:type="dxa"/>
+            <w:tcW w:w="7612" w:type="dxa"/>
             <w:tcBorders>
               <w:top w:val="nil"/>
               <w:left w:val="nil"/>
@@ -11781,14 +11564,7 @@
               <w:rPr>
                 <w:shd w:val="clear" w:color="auto" w:fill="FFFFFF"/>
               </w:rPr>
-              <w:t xml:space="preserve">{%tr if user_need == 'change foreign custody </w:t>
-            </w:r>
-            <w:r>
-              <w:rPr>
-                <w:shd w:val="clear" w:color="auto" w:fill="FFFFFF"/>
-              </w:rPr>
-              <w:lastRenderedPageBreak/>
-              <w:t xml:space="preserve">order' </w:t>
+              <w:t xml:space="preserve">{%tr if user_need == 'change foreign custody order' </w:t>
             </w:r>
             <w:r>
               <w:rPr>
@@ -11887,7 +11663,7 @@
         </w:tc>
         <w:tc>
           <w:tcPr>
-            <w:tcW w:w="7611" w:type="dxa"/>
+            <w:tcW w:w="7612" w:type="dxa"/>
             <w:tcBorders>
               <w:top w:val="nil"/>
               <w:left w:val="nil"/>
@@ -11903,7 +11679,6 @@
               <w:pStyle w:val="Body"/>
             </w:pPr>
             <w:r>
-              <w:lastRenderedPageBreak/>
               <w:t>respond_to_reconsider_step in aka2j_motion_response_templates.yml</w:t>
             </w:r>
           </w:p>
@@ -11958,7 +11733,7 @@
         </w:tc>
         <w:tc>
           <w:tcPr>
-            <w:tcW w:w="7611" w:type="dxa"/>
+            <w:tcW w:w="7612" w:type="dxa"/>
             <w:tcBorders>
               <w:top w:val="nil"/>
               <w:left w:val="nil"/>
@@ -12146,7 +11921,6 @@
               </w:numPr>
             </w:pPr>
             <w:r>
-              <w:lastRenderedPageBreak/>
               <w:t>If you do not fill out the Certificate of Service:</w:t>
             </w:r>
             <w:r>
@@ -12292,14 +12066,13 @@
               <w:rPr>
                 <w:shd w:val="clear" w:color="auto" w:fill="FFFFFF"/>
               </w:rPr>
-              <w:lastRenderedPageBreak/>
               <w:t>{%tr endif %}</w:t>
             </w:r>
           </w:p>
         </w:tc>
         <w:tc>
           <w:tcPr>
-            <w:tcW w:w="7611" w:type="dxa"/>
+            <w:tcW w:w="7612" w:type="dxa"/>
             <w:tcBorders>
               <w:top w:val="nil"/>
               <w:left w:val="nil"/>
@@ -12348,7 +12121,7 @@
         </w:tc>
         <w:tc>
           <w:tcPr>
-            <w:tcW w:w="7611" w:type="dxa"/>
+            <w:tcW w:w="7612" w:type="dxa"/>
             <w:tcBorders>
               <w:top w:val="nil"/>
               <w:left w:val="nil"/>
@@ -12442,11 +12215,7 @@
               <w:t>{% if defined('file_step_heading') %}</w:t>
             </w:r>
             <w:r>
-              <w:t xml:space="preserve">{{ </w:t>
-            </w:r>
-            <w:r>
-              <w:lastRenderedPageBreak/>
-              <w:t>file_step_heading }}</w:t>
+              <w:t>{{ file_step_heading }}</w:t>
             </w:r>
             <w:r>
               <w:rPr>
@@ -12475,7 +12244,7 @@
         </w:tc>
         <w:tc>
           <w:tcPr>
-            <w:tcW w:w="7611" w:type="dxa"/>
+            <w:tcW w:w="7612" w:type="dxa"/>
             <w:tcBorders>
               <w:top w:val="nil"/>
               <w:left w:val="nil"/>
@@ -12491,7 +12260,6 @@
               <w:pStyle w:val="Body"/>
             </w:pPr>
             <w:r>
-              <w:lastRenderedPageBreak/>
               <w:t>{{ file_motion_to_enforce }}</w:t>
             </w:r>
             <w:r>
@@ -12543,7 +12311,6 @@
               <w:spacing w:before="0"/>
             </w:pPr>
             <w:r>
-              <w:lastRenderedPageBreak/>
               <w:t>Give the original version of your documents to the court. This is called “filing” your documents. You can:</w:t>
             </w:r>
           </w:p>
@@ -12873,9 +12640,6 @@
             </w:r>
             <w:r>
               <w:br/>
-            </w:r>
-            <w:r>
-              <w:lastRenderedPageBreak/>
               <w:t>If you cannot afford the filing fee, you can ask the court to waive it:</w:t>
             </w:r>
           </w:p>
@@ -13220,14 +12984,13 @@
               <w:rPr>
                 <w:shd w:val="clear" w:color="auto" w:fill="FFFFFF"/>
               </w:rPr>
-              <w:lastRenderedPageBreak/>
               <w:t>{%tr endif %}</w:t>
             </w:r>
           </w:p>
         </w:tc>
         <w:tc>
           <w:tcPr>
-            <w:tcW w:w="7611" w:type="dxa"/>
+            <w:tcW w:w="7612" w:type="dxa"/>
             <w:tcBorders>
               <w:top w:val="nil"/>
               <w:left w:val="nil"/>
@@ -13283,7 +13046,7 @@
         </w:tc>
         <w:tc>
           <w:tcPr>
-            <w:tcW w:w="7611" w:type="dxa"/>
+            <w:tcW w:w="7612" w:type="dxa"/>
             <w:tcBorders>
               <w:top w:val="nil"/>
               <w:left w:val="nil"/>
@@ -13330,7 +13093,6 @@
               <w:outlineLvl w:val="1"/>
             </w:pPr>
             <w:r>
-              <w:lastRenderedPageBreak/>
               <w:t xml:space="preserve">Step </w:t>
             </w:r>
             <w:bookmarkStart w:id="12" w:name="FileResponse"/>
@@ -13378,7 +13140,7 @@
         </w:tc>
         <w:tc>
           <w:tcPr>
-            <w:tcW w:w="7611" w:type="dxa"/>
+            <w:tcW w:w="7612" w:type="dxa"/>
             <w:tcBorders>
               <w:top w:val="nil"/>
               <w:left w:val="nil"/>
@@ -13664,7 +13426,7 @@
         </w:tc>
         <w:tc>
           <w:tcPr>
-            <w:tcW w:w="7611" w:type="dxa"/>
+            <w:tcW w:w="7612" w:type="dxa"/>
             <w:tcBorders>
               <w:top w:val="nil"/>
               <w:left w:val="nil"/>
@@ -13717,14 +13479,7 @@
               <w:rPr>
                 <w:shd w:val="clear" w:color="auto" w:fill="FFFFFF"/>
               </w:rPr>
-              <w:t xml:space="preserve">user_need in('change custody order', 'change divorce </w:t>
-            </w:r>
-            <w:r>
-              <w:rPr>
-                <w:shd w:val="clear" w:color="auto" w:fill="FFFFFF"/>
-              </w:rPr>
-              <w:lastRenderedPageBreak/>
-              <w:t>order') and not unknown_final_date.all_true</w:t>
+              <w:t>user_need in('change custody order', 'change divorce order') and not unknown_final_date.all_true</w:t>
             </w:r>
             <w:r>
               <w:rPr>
@@ -13763,7 +13518,7 @@
         </w:tc>
         <w:tc>
           <w:tcPr>
-            <w:tcW w:w="7611" w:type="dxa"/>
+            <w:tcW w:w="7612" w:type="dxa"/>
             <w:tcBorders>
               <w:top w:val="nil"/>
               <w:left w:val="nil"/>
@@ -13779,7 +13534,6 @@
               <w:pStyle w:val="Body"/>
             </w:pPr>
             <w:r>
-              <w:lastRenderedPageBreak/>
               <w:t>serve_motion_response_step in aka2j_motion_response_templates.yml</w:t>
             </w:r>
           </w:p>
@@ -13855,7 +13609,7 @@
         </w:tc>
         <w:tc>
           <w:tcPr>
-            <w:tcW w:w="7611" w:type="dxa"/>
+            <w:tcW w:w="7612" w:type="dxa"/>
             <w:tcBorders>
               <w:top w:val="nil"/>
               <w:left w:val="nil"/>
@@ -14015,7 +13769,7 @@
         </w:tc>
         <w:tc>
           <w:tcPr>
-            <w:tcW w:w="7611" w:type="dxa"/>
+            <w:tcW w:w="7612" w:type="dxa"/>
             <w:tcBorders>
               <w:top w:val="nil"/>
               <w:left w:val="nil"/>
@@ -14067,11 +13821,7 @@
               <w:t>(</w:t>
             </w:r>
             <w:r>
-              <w:t>interim_order_date_with</w:t>
-            </w:r>
-            <w:r>
-              <w:lastRenderedPageBreak/>
-              <w:t>in_10_days or final_order_date_within_10_days</w:t>
+              <w:t>interim_order_date_within_10_days or final_order_date_within_10_days</w:t>
             </w:r>
             <w:r>
               <w:rPr>
@@ -14197,7 +13947,7 @@
         </w:tc>
         <w:tc>
           <w:tcPr>
-            <w:tcW w:w="7611" w:type="dxa"/>
+            <w:tcW w:w="7612" w:type="dxa"/>
             <w:tcBorders>
               <w:top w:val="nil"/>
               <w:left w:val="nil"/>
@@ -14213,7 +13963,6 @@
               <w:pStyle w:val="Body"/>
             </w:pPr>
             <w:r>
-              <w:lastRenderedPageBreak/>
               <w:t>expect_after_motion_step in aka2j_mod_cust_div_templates.yml</w:t>
             </w:r>
           </w:p>
@@ -14290,7 +14039,7 @@
         </w:tc>
         <w:tc>
           <w:tcPr>
-            <w:tcW w:w="7611" w:type="dxa"/>
+            <w:tcW w:w="7612" w:type="dxa"/>
             <w:tcBorders>
               <w:top w:val="nil"/>
               <w:left w:val="nil"/>
@@ -14435,11 +14184,7 @@
               <w:t>Motion for Interim Child Support</w:t>
             </w:r>
             <w:r>
-              <w:t xml:space="preserve"> with your complaint, the other parent does not have to respond until they respond to the complaint. This is usually 20 days </w:t>
-            </w:r>
-            <w:r>
-              <w:lastRenderedPageBreak/>
-              <w:t>after they get the complaint.</w:t>
+              <w:t xml:space="preserve"> with your complaint, the other parent does not have to respond until they respond to the complaint. This is usually 20 days after they get the complaint.</w:t>
             </w:r>
           </w:p>
           <w:p>
@@ -14850,14 +14595,7 @@
               <w:rPr>
                 <w:color w:val="FF0000"/>
               </w:rPr>
-              <w:t xml:space="preserve">{% if user_need in('change </w:t>
-            </w:r>
-            <w:r>
-              <w:rPr>
-                <w:color w:val="FF0000"/>
-              </w:rPr>
-              <w:lastRenderedPageBreak/>
-              <w:t>foreign order', 'change foreign custody order') or (user_need in('change AK order', 'change custody order', 'change divorce order') and middle_of_case == 'no') %}</w:t>
+              <w:t>{% if user_need in('change foreign order', 'change foreign custody order') or (user_need in('change AK order', 'change custody order', 'change divorce order') and middle_of_case == 'no') %}</w:t>
             </w:r>
           </w:p>
           <w:p>
@@ -15071,14 +14809,13 @@
               <w:rPr>
                 <w:shd w:val="clear" w:color="auto" w:fill="FFFFFF"/>
               </w:rPr>
-              <w:lastRenderedPageBreak/>
               <w:t>{%tr endif %}</w:t>
             </w:r>
           </w:p>
         </w:tc>
         <w:tc>
           <w:tcPr>
-            <w:tcW w:w="7611" w:type="dxa"/>
+            <w:tcW w:w="7612" w:type="dxa"/>
             <w:tcBorders>
               <w:top w:val="nil"/>
               <w:left w:val="nil"/>
@@ -15127,7 +14864,7 @@
         </w:tc>
         <w:tc>
           <w:tcPr>
-            <w:tcW w:w="7611" w:type="dxa"/>
+            <w:tcW w:w="7612" w:type="dxa"/>
             <w:tcBorders>
               <w:top w:val="nil"/>
               <w:left w:val="nil"/>
@@ -15207,11 +14944,7 @@
               <w:fldChar w:fldCharType="end"/>
             </w:r>
             <w:r>
-              <w:t xml:space="preserve">: What to expect after you </w:t>
-            </w:r>
-            <w:r>
-              <w:lastRenderedPageBreak/>
-              <w:t xml:space="preserve">file a </w:t>
+              <w:t xml:space="preserve">: What to expect after you file a </w:t>
             </w:r>
             <w:r>
               <w:rPr>
@@ -15223,7 +14956,7 @@
         </w:tc>
         <w:tc>
           <w:tcPr>
-            <w:tcW w:w="7611" w:type="dxa"/>
+            <w:tcW w:w="7612" w:type="dxa"/>
             <w:tcBorders>
               <w:top w:val="nil"/>
               <w:left w:val="nil"/>
@@ -15239,7 +14972,6 @@
               <w:pStyle w:val="Body"/>
             </w:pPr>
             <w:r>
-              <w:lastRenderedPageBreak/>
               <w:t xml:space="preserve"> A </w:t>
             </w:r>
             <w:r>
@@ -15257,11 +14989,7 @@
               <w:pStyle w:val="Body"/>
             </w:pPr>
             <w:r>
-              <w:t xml:space="preserve">{{ capitalize(other_party_in_case) }} does not have to respond unless </w:t>
-            </w:r>
-            <w:r>
-              <w:lastRenderedPageBreak/>
-              <w:t>the judge sends a notice and asks them to respond in writing.</w:t>
+              <w:t>{{ capitalize(other_party_in_case) }} does not have to respond unless the judge sends a notice and asks them to respond in writing.</w:t>
             </w:r>
           </w:p>
           <w:p>
@@ -15391,14 +15119,13 @@
               <w:rPr>
                 <w:shd w:val="clear" w:color="auto" w:fill="FFFFFF"/>
               </w:rPr>
-              <w:lastRenderedPageBreak/>
               <w:t>{%tr endif %}</w:t>
             </w:r>
           </w:p>
         </w:tc>
         <w:tc>
           <w:tcPr>
-            <w:tcW w:w="7611" w:type="dxa"/>
+            <w:tcW w:w="7612" w:type="dxa"/>
             <w:tcBorders>
               <w:top w:val="nil"/>
               <w:left w:val="nil"/>
@@ -15457,7 +15184,7 @@
         </w:tc>
         <w:tc>
           <w:tcPr>
-            <w:tcW w:w="7611" w:type="dxa"/>
+            <w:tcW w:w="7612" w:type="dxa"/>
             <w:tcBorders>
               <w:top w:val="nil"/>
               <w:left w:val="nil"/>
@@ -15565,7 +15292,7 @@
         </w:tc>
         <w:tc>
           <w:tcPr>
-            <w:tcW w:w="7611" w:type="dxa"/>
+            <w:tcW w:w="7612" w:type="dxa"/>
             <w:tcBorders>
               <w:top w:val="nil"/>
               <w:left w:val="nil"/>
@@ -15673,7 +15400,6 @@
               <w:ind w:left="405"/>
             </w:pPr>
             <w:r>
-              <w:lastRenderedPageBreak/>
               <w:t xml:space="preserve">The judge may grant the </w:t>
             </w:r>
             <w:r>
@@ -15810,14 +15536,13 @@
               <w:rPr>
                 <w:shd w:val="clear" w:color="auto" w:fill="FFFFFF"/>
               </w:rPr>
-              <w:lastRenderedPageBreak/>
               <w:t>{%tr endif %}</w:t>
             </w:r>
           </w:p>
         </w:tc>
         <w:tc>
           <w:tcPr>
-            <w:tcW w:w="7611" w:type="dxa"/>
+            <w:tcW w:w="7612" w:type="dxa"/>
             <w:tcBorders>
               <w:top w:val="nil"/>
               <w:left w:val="nil"/>
@@ -15866,7 +15591,7 @@
         </w:tc>
         <w:tc>
           <w:tcPr>
-            <w:tcW w:w="7611" w:type="dxa"/>
+            <w:tcW w:w="7612" w:type="dxa"/>
             <w:tcBorders>
               <w:top w:val="nil"/>
               <w:left w:val="nil"/>
@@ -15981,7 +15706,7 @@
         </w:tc>
         <w:tc>
           <w:tcPr>
-            <w:tcW w:w="7611" w:type="dxa"/>
+            <w:tcW w:w="7612" w:type="dxa"/>
             <w:tcBorders>
               <w:top w:val="nil"/>
               <w:left w:val="nil"/>
@@ -16138,7 +15863,6 @@
                 <w:b/>
                 <w:color w:val="000000"/>
               </w:rPr>
-              <w:lastRenderedPageBreak/>
               <w:t>Agreement &amp; Order for Custody and Visitation, SHC-1126</w:t>
             </w:r>
             <w:r>
@@ -16749,7 +16473,6 @@
               <w:br/>
             </w:r>
             <w:r>
-              <w:lastRenderedPageBreak/>
               <w:t>courts.alaska.gov/shc/family/docs/shc-1063n.pdf</w:t>
             </w:r>
             <w:r>
@@ -16921,7 +16644,6 @@
               <w:rPr>
                 <w:shd w:val="clear" w:color="auto" w:fill="FFFFFF"/>
               </w:rPr>
-              <w:lastRenderedPageBreak/>
               <w:t xml:space="preserve">Step </w:t>
             </w:r>
             <w:bookmarkStart w:id="16" w:name="FileAgreement"/>
@@ -16966,7 +16688,7 @@
         </w:tc>
         <w:tc>
           <w:tcPr>
-            <w:tcW w:w="7611" w:type="dxa"/>
+            <w:tcW w:w="7612" w:type="dxa"/>
             <w:tcBorders>
               <w:top w:val="nil"/>
               <w:left w:val="nil"/>
@@ -17068,7 +16790,7 @@
         </w:tc>
         <w:tc>
           <w:tcPr>
-            <w:tcW w:w="7611" w:type="dxa"/>
+            <w:tcW w:w="7612" w:type="dxa"/>
             <w:tcBorders>
               <w:top w:val="nil"/>
               <w:left w:val="nil"/>
@@ -17114,20 +16836,13 @@
               <w:rPr>
                 <w:shd w:val="clear" w:color="auto" w:fill="FFFFFF"/>
               </w:rPr>
-              <w:t xml:space="preserve">{%tr if respond_to_appeal in ('agree','some', 'none') </w:t>
-            </w:r>
-            <w:r>
-              <w:rPr>
-                <w:shd w:val="clear" w:color="auto" w:fill="FFFFFF"/>
-              </w:rPr>
-              <w:lastRenderedPageBreak/>
-              <w:t>%}</w:t>
+              <w:t>{%tr if respond_to_appeal in ('agree','some', 'none') %}</w:t>
             </w:r>
           </w:p>
         </w:tc>
         <w:tc>
           <w:tcPr>
-            <w:tcW w:w="7611" w:type="dxa"/>
+            <w:tcW w:w="7612" w:type="dxa"/>
             <w:tcBorders>
               <w:top w:val="nil"/>
               <w:left w:val="nil"/>
@@ -17149,7 +16864,6 @@
               <w:rPr>
                 <w:rFonts w:eastAsia="Calibri"/>
               </w:rPr>
-              <w:lastRenderedPageBreak/>
               <w:t>appeal_response_step in aka2j_motion_response_templates.yml</w:t>
             </w:r>
           </w:p>
@@ -17259,7 +16973,7 @@
         </w:tc>
         <w:tc>
           <w:tcPr>
-            <w:tcW w:w="7611" w:type="dxa"/>
+            <w:tcW w:w="7612" w:type="dxa"/>
             <w:tcBorders>
               <w:top w:val="nil"/>
               <w:left w:val="nil"/>
@@ -17603,7 +17317,6 @@
               <w:pStyle w:val="Body"/>
             </w:pPr>
             <w:r>
-              <w:lastRenderedPageBreak/>
               <w:t xml:space="preserve">You can review a </w:t>
             </w:r>
             <w:hyperlink r:id="rId179">
@@ -17897,14 +17610,13 @@
               <w:rPr>
                 <w:shd w:val="clear" w:color="auto" w:fill="FFFFFF"/>
               </w:rPr>
-              <w:lastRenderedPageBreak/>
               <w:t>{%tr endif %}</w:t>
             </w:r>
           </w:p>
         </w:tc>
         <w:tc>
           <w:tcPr>
-            <w:tcW w:w="7611" w:type="dxa"/>
+            <w:tcW w:w="7612" w:type="dxa"/>
             <w:tcBorders>
               <w:top w:val="nil"/>
               <w:left w:val="nil"/>
@@ -17956,7 +17668,7 @@
         </w:tc>
         <w:tc>
           <w:tcPr>
-            <w:tcW w:w="7611" w:type="dxa"/>
+            <w:tcW w:w="7612" w:type="dxa"/>
             <w:tcBorders>
               <w:top w:val="nil"/>
               <w:left w:val="nil"/>
@@ -18006,7 +17718,6 @@
               <w:rPr>
                 <w:shd w:val="clear" w:color="auto" w:fill="FFFFFF"/>
               </w:rPr>
-              <w:lastRenderedPageBreak/>
               <w:t xml:space="preserve">Step </w:t>
             </w:r>
             <w:bookmarkStart w:id="17" w:name="AppealContactParent"/>
@@ -18051,7 +17762,7 @@
         </w:tc>
         <w:tc>
           <w:tcPr>
-            <w:tcW w:w="7611" w:type="dxa"/>
+            <w:tcW w:w="7612" w:type="dxa"/>
             <w:tcBorders>
               <w:top w:val="nil"/>
               <w:left w:val="nil"/>
@@ -18487,7 +18198,7 @@
         </w:tc>
         <w:tc>
           <w:tcPr>
-            <w:tcW w:w="7611" w:type="dxa"/>
+            <w:tcW w:w="7612" w:type="dxa"/>
             <w:tcBorders>
               <w:top w:val="nil"/>
               <w:left w:val="nil"/>
@@ -18600,15 +18311,7 @@
                 <w:b/>
                 <w:bCs/>
               </w:rPr>
-              <w:t xml:space="preserve">Motion </w:t>
-            </w:r>
-            <w:r>
-              <w:rPr>
-                <w:b/>
-                <w:bCs/>
-              </w:rPr>
-              <w:lastRenderedPageBreak/>
-              <w:t>to Dismiss</w:t>
+              <w:t>Motion to Dismiss</w:t>
             </w:r>
             <w:r>
               <w:t xml:space="preserve"> to stop the appeal from continuing.</w:t>
@@ -18684,14 +18387,13 @@
               <w:rPr>
                 <w:shd w:val="clear" w:color="auto" w:fill="FFFFFF"/>
               </w:rPr>
-              <w:lastRenderedPageBreak/>
               <w:t>{%tr endif %}</w:t>
             </w:r>
           </w:p>
         </w:tc>
         <w:tc>
           <w:tcPr>
-            <w:tcW w:w="7611" w:type="dxa"/>
+            <w:tcW w:w="7612" w:type="dxa"/>
             <w:tcBorders>
               <w:top w:val="nil"/>
               <w:left w:val="nil"/>
@@ -18779,7 +18481,7 @@
         </w:tc>
         <w:tc>
           <w:tcPr>
-            <w:tcW w:w="7611" w:type="dxa"/>
+            <w:tcW w:w="7612" w:type="dxa"/>
             <w:tcBorders>
               <w:top w:val="nil"/>
               <w:left w:val="nil"/>
@@ -19051,27 +18753,14 @@
     <w:r>
       <w:t xml:space="preserve"> of </w:t>
     </w:r>
-    <w:r>
-      <w:fldChar w:fldCharType="begin"/>
-    </w:r>
-    <w:r>
-      <w:instrText xml:space="preserve"> NUMPAGES \* ARABIC </w:instrText>
-    </w:r>
-    <w:r>
-      <w:fldChar w:fldCharType="separate"/>
-    </w:r>
-    <w:r>
-      <w:rPr>
-        <w:noProof/>
-      </w:rPr>
-      <w:t>50</w:t>
-    </w:r>
-    <w:r>
-      <w:rPr>
-        <w:noProof/>
-      </w:rPr>
-      <w:fldChar w:fldCharType="end"/>
-    </w:r>
+    <w:fldSimple w:instr=" NUMPAGES \* ARABIC ">
+      <w:r>
+        <w:rPr>
+          <w:noProof/>
+        </w:rPr>
+        <w:t>50</w:t>
+      </w:r>
+    </w:fldSimple>
     <w:r>
       <w:t xml:space="preserve"> pages</w:t>
     </w:r>
@@ -19129,21 +18818,11 @@
     <w:r>
       <w:t xml:space="preserve"> of </w:t>
     </w:r>
-    <w:r>
-      <w:fldChar w:fldCharType="begin"/>
-    </w:r>
-    <w:r>
-      <w:instrText xml:space="preserve"> NUMPAGES \* ARABIC </w:instrText>
-    </w:r>
-    <w:r>
-      <w:fldChar w:fldCharType="separate"/>
-    </w:r>
-    <w:r>
-      <w:t>47</w:t>
-    </w:r>
-    <w:r>
-      <w:fldChar w:fldCharType="end"/>
-    </w:r>
+    <w:fldSimple w:instr=" NUMPAGES \* ARABIC ">
+      <w:r>
+        <w:t>47</w:t>
+      </w:r>
+    </w:fldSimple>
     <w:r>
       <w:t xml:space="preserve"> pages</w:t>
     </w:r>

</xml_diff>